<commit_message>
Update docs to mention Hyvä Theme
</commit_message>
<xml_diff>
--- a/docs/Manual - Payment Module for Adobe Commerce (Magento) - Svea Payments Finland.docx
+++ b/docs/Manual - Payment Module for Adobe Commerce (Magento) - Svea Payments Finland.docx
@@ -313,7 +313,7 @@
           <w:iCs/>
           <w:szCs w:val="22"/>
         </w:rPr>
-        <w:t>3</w:t>
+        <w:t>4</w:t>
       </w:r>
       <w:r>
         <w:rPr>
@@ -329,7 +329,7 @@
           <w:iCs/>
           <w:szCs w:val="22"/>
         </w:rPr>
-        <w:t>1</w:t>
+        <w:t>3</w:t>
       </w:r>
       <w:r>
         <w:br w:type="page"/>
@@ -378,7 +378,7 @@
               <w:rFonts w:asciiTheme="minorHAnsi" w:eastAsiaTheme="minorEastAsia" w:hAnsiTheme="minorHAnsi" w:cstheme="minorBidi"/>
               <w:noProof/>
               <w:szCs w:val="24"/>
-              <w:lang w:eastAsia="en-US" w:bidi="ar-SA"/>
+              <w:lang w:val="en-FI" w:eastAsia="en-FI" w:bidi="ar-SA"/>
               <w14:ligatures w14:val="standardContextual"/>
             </w:rPr>
           </w:pPr>
@@ -399,7 +399,7 @@
             </w:rPr>
             <w:fldChar w:fldCharType="separate"/>
           </w:r>
-          <w:hyperlink w:anchor="_Toc192620795" w:history="1">
+          <w:hyperlink w:anchor="_Toc216856835" w:history="1">
             <w:r>
               <w:rPr>
                 <w:rStyle w:val="Hyperlink"/>
@@ -412,7 +412,7 @@
                 <w:rFonts w:asciiTheme="minorHAnsi" w:eastAsiaTheme="minorEastAsia" w:hAnsiTheme="minorHAnsi" w:cstheme="minorBidi"/>
                 <w:noProof/>
                 <w:szCs w:val="24"/>
-                <w:lang w:eastAsia="en-US" w:bidi="ar-SA"/>
+                <w:lang w:val="en-FI" w:eastAsia="en-FI" w:bidi="ar-SA"/>
                 <w14:ligatures w14:val="standardContextual"/>
               </w:rPr>
               <w:tab/>
@@ -440,7 +440,7 @@
               <w:rPr>
                 <w:noProof/>
               </w:rPr>
-              <w:instrText xml:space="preserve"> PAGEREF _Toc192620795 \h </w:instrText>
+              <w:instrText xml:space="preserve"> PAGEREF _Toc216856835 \h </w:instrText>
             </w:r>
             <w:r>
               <w:rPr>
@@ -478,11 +478,11 @@
               <w:rFonts w:asciiTheme="minorHAnsi" w:eastAsiaTheme="minorEastAsia" w:hAnsiTheme="minorHAnsi" w:cstheme="minorBidi"/>
               <w:noProof/>
               <w:szCs w:val="24"/>
-              <w:lang w:eastAsia="en-US" w:bidi="ar-SA"/>
+              <w:lang w:val="en-FI" w:eastAsia="en-FI" w:bidi="ar-SA"/>
               <w14:ligatures w14:val="standardContextual"/>
             </w:rPr>
           </w:pPr>
-          <w:hyperlink w:anchor="_Toc192620796" w:history="1">
+          <w:hyperlink w:anchor="_Toc216856836" w:history="1">
             <w:r>
               <w:rPr>
                 <w:rStyle w:val="Hyperlink"/>
@@ -495,7 +495,7 @@
                 <w:rFonts w:asciiTheme="minorHAnsi" w:eastAsiaTheme="minorEastAsia" w:hAnsiTheme="minorHAnsi" w:cstheme="minorBidi"/>
                 <w:noProof/>
                 <w:szCs w:val="24"/>
-                <w:lang w:eastAsia="en-US" w:bidi="ar-SA"/>
+                <w:lang w:val="en-FI" w:eastAsia="en-FI" w:bidi="ar-SA"/>
                 <w14:ligatures w14:val="standardContextual"/>
               </w:rPr>
               <w:tab/>
@@ -523,7 +523,7 @@
               <w:rPr>
                 <w:noProof/>
               </w:rPr>
-              <w:instrText xml:space="preserve"> PAGEREF _Toc192620796 \h </w:instrText>
+              <w:instrText xml:space="preserve"> PAGEREF _Toc216856836 \h </w:instrText>
             </w:r>
             <w:r>
               <w:rPr>
@@ -561,11 +561,11 @@
               <w:rFonts w:asciiTheme="minorHAnsi" w:eastAsiaTheme="minorEastAsia" w:hAnsiTheme="minorHAnsi" w:cstheme="minorBidi"/>
               <w:noProof/>
               <w:szCs w:val="24"/>
-              <w:lang w:eastAsia="en-US" w:bidi="ar-SA"/>
+              <w:lang w:val="en-FI" w:eastAsia="en-FI" w:bidi="ar-SA"/>
               <w14:ligatures w14:val="standardContextual"/>
             </w:rPr>
           </w:pPr>
-          <w:hyperlink w:anchor="_Toc192620797" w:history="1">
+          <w:hyperlink w:anchor="_Toc216856837" w:history="1">
             <w:r>
               <w:rPr>
                 <w:rStyle w:val="Hyperlink"/>
@@ -578,7 +578,7 @@
                 <w:rFonts w:asciiTheme="minorHAnsi" w:eastAsiaTheme="minorEastAsia" w:hAnsiTheme="minorHAnsi" w:cstheme="minorBidi"/>
                 <w:noProof/>
                 <w:szCs w:val="24"/>
-                <w:lang w:eastAsia="en-US" w:bidi="ar-SA"/>
+                <w:lang w:val="en-FI" w:eastAsia="en-FI" w:bidi="ar-SA"/>
                 <w14:ligatures w14:val="standardContextual"/>
               </w:rPr>
               <w:tab/>
@@ -606,7 +606,7 @@
               <w:rPr>
                 <w:noProof/>
               </w:rPr>
-              <w:instrText xml:space="preserve"> PAGEREF _Toc192620797 \h </w:instrText>
+              <w:instrText xml:space="preserve"> PAGEREF _Toc216856837 \h </w:instrText>
             </w:r>
             <w:r>
               <w:rPr>
@@ -644,11 +644,11 @@
               <w:rFonts w:asciiTheme="minorHAnsi" w:eastAsiaTheme="minorEastAsia" w:hAnsiTheme="minorHAnsi" w:cstheme="minorBidi"/>
               <w:noProof/>
               <w:szCs w:val="24"/>
-              <w:lang w:eastAsia="en-US" w:bidi="ar-SA"/>
+              <w:lang w:val="en-FI" w:eastAsia="en-FI" w:bidi="ar-SA"/>
               <w14:ligatures w14:val="standardContextual"/>
             </w:rPr>
           </w:pPr>
-          <w:hyperlink w:anchor="_Toc192620798" w:history="1">
+          <w:hyperlink w:anchor="_Toc216856838" w:history="1">
             <w:r>
               <w:rPr>
                 <w:rStyle w:val="Hyperlink"/>
@@ -661,7 +661,7 @@
                 <w:rFonts w:asciiTheme="minorHAnsi" w:eastAsiaTheme="minorEastAsia" w:hAnsiTheme="minorHAnsi" w:cstheme="minorBidi"/>
                 <w:noProof/>
                 <w:szCs w:val="24"/>
-                <w:lang w:eastAsia="en-US" w:bidi="ar-SA"/>
+                <w:lang w:val="en-FI" w:eastAsia="en-FI" w:bidi="ar-SA"/>
                 <w14:ligatures w14:val="standardContextual"/>
               </w:rPr>
               <w:tab/>
@@ -689,7 +689,7 @@
               <w:rPr>
                 <w:noProof/>
               </w:rPr>
-              <w:instrText xml:space="preserve"> PAGEREF _Toc192620798 \h </w:instrText>
+              <w:instrText xml:space="preserve"> PAGEREF _Toc216856838 \h </w:instrText>
             </w:r>
             <w:r>
               <w:rPr>
@@ -727,11 +727,11 @@
               <w:rFonts w:asciiTheme="minorHAnsi" w:eastAsiaTheme="minorEastAsia" w:hAnsiTheme="minorHAnsi" w:cstheme="minorBidi"/>
               <w:noProof/>
               <w:szCs w:val="24"/>
-              <w:lang w:eastAsia="en-US" w:bidi="ar-SA"/>
+              <w:lang w:val="en-FI" w:eastAsia="en-FI" w:bidi="ar-SA"/>
               <w14:ligatures w14:val="standardContextual"/>
             </w:rPr>
           </w:pPr>
-          <w:hyperlink w:anchor="_Toc192620799" w:history="1">
+          <w:hyperlink w:anchor="_Toc216856839" w:history="1">
             <w:r>
               <w:rPr>
                 <w:rStyle w:val="Hyperlink"/>
@@ -744,7 +744,7 @@
                 <w:rFonts w:asciiTheme="minorHAnsi" w:eastAsiaTheme="minorEastAsia" w:hAnsiTheme="minorHAnsi" w:cstheme="minorBidi"/>
                 <w:noProof/>
                 <w:szCs w:val="24"/>
-                <w:lang w:eastAsia="en-US" w:bidi="ar-SA"/>
+                <w:lang w:val="en-FI" w:eastAsia="en-FI" w:bidi="ar-SA"/>
                 <w14:ligatures w14:val="standardContextual"/>
               </w:rPr>
               <w:tab/>
@@ -772,7 +772,7 @@
               <w:rPr>
                 <w:noProof/>
               </w:rPr>
-              <w:instrText xml:space="preserve"> PAGEREF _Toc192620799 \h </w:instrText>
+              <w:instrText xml:space="preserve"> PAGEREF _Toc216856839 \h </w:instrText>
             </w:r>
             <w:r>
               <w:rPr>
@@ -810,11 +810,11 @@
               <w:rFonts w:asciiTheme="minorHAnsi" w:eastAsiaTheme="minorEastAsia" w:hAnsiTheme="minorHAnsi" w:cstheme="minorBidi"/>
               <w:noProof/>
               <w:szCs w:val="24"/>
-              <w:lang w:eastAsia="en-US" w:bidi="ar-SA"/>
+              <w:lang w:val="en-FI" w:eastAsia="en-FI" w:bidi="ar-SA"/>
               <w14:ligatures w14:val="standardContextual"/>
             </w:rPr>
           </w:pPr>
-          <w:hyperlink w:anchor="_Toc192620800" w:history="1">
+          <w:hyperlink w:anchor="_Toc216856840" w:history="1">
             <w:r>
               <w:rPr>
                 <w:rStyle w:val="Hyperlink"/>
@@ -827,7 +827,7 @@
                 <w:rFonts w:asciiTheme="minorHAnsi" w:eastAsiaTheme="minorEastAsia" w:hAnsiTheme="minorHAnsi" w:cstheme="minorBidi"/>
                 <w:noProof/>
                 <w:szCs w:val="24"/>
-                <w:lang w:eastAsia="en-US" w:bidi="ar-SA"/>
+                <w:lang w:val="en-FI" w:eastAsia="en-FI" w:bidi="ar-SA"/>
                 <w14:ligatures w14:val="standardContextual"/>
               </w:rPr>
               <w:tab/>
@@ -855,7 +855,7 @@
               <w:rPr>
                 <w:noProof/>
               </w:rPr>
-              <w:instrText xml:space="preserve"> PAGEREF _Toc192620800 \h </w:instrText>
+              <w:instrText xml:space="preserve"> PAGEREF _Toc216856840 \h </w:instrText>
             </w:r>
             <w:r>
               <w:rPr>
@@ -893,11 +893,11 @@
               <w:rFonts w:asciiTheme="minorHAnsi" w:eastAsiaTheme="minorEastAsia" w:hAnsiTheme="minorHAnsi" w:cstheme="minorBidi"/>
               <w:noProof/>
               <w:szCs w:val="24"/>
-              <w:lang w:eastAsia="en-US" w:bidi="ar-SA"/>
+              <w:lang w:val="en-FI" w:eastAsia="en-FI" w:bidi="ar-SA"/>
               <w14:ligatures w14:val="standardContextual"/>
             </w:rPr>
           </w:pPr>
-          <w:hyperlink w:anchor="_Toc192620801" w:history="1">
+          <w:hyperlink w:anchor="_Toc216856841" w:history="1">
             <w:r>
               <w:rPr>
                 <w:rStyle w:val="Hyperlink"/>
@@ -910,7 +910,7 @@
                 <w:rFonts w:asciiTheme="minorHAnsi" w:eastAsiaTheme="minorEastAsia" w:hAnsiTheme="minorHAnsi" w:cstheme="minorBidi"/>
                 <w:noProof/>
                 <w:szCs w:val="24"/>
-                <w:lang w:eastAsia="en-US" w:bidi="ar-SA"/>
+                <w:lang w:val="en-FI" w:eastAsia="en-FI" w:bidi="ar-SA"/>
                 <w14:ligatures w14:val="standardContextual"/>
               </w:rPr>
               <w:tab/>
@@ -938,7 +938,7 @@
               <w:rPr>
                 <w:noProof/>
               </w:rPr>
-              <w:instrText xml:space="preserve"> PAGEREF _Toc192620801 \h </w:instrText>
+              <w:instrText xml:space="preserve"> PAGEREF _Toc216856841 \h </w:instrText>
             </w:r>
             <w:r>
               <w:rPr>
@@ -976,11 +976,11 @@
               <w:rFonts w:asciiTheme="minorHAnsi" w:eastAsiaTheme="minorEastAsia" w:hAnsiTheme="minorHAnsi" w:cstheme="minorBidi"/>
               <w:noProof/>
               <w:szCs w:val="24"/>
-              <w:lang w:eastAsia="en-US" w:bidi="ar-SA"/>
+              <w:lang w:val="en-FI" w:eastAsia="en-FI" w:bidi="ar-SA"/>
               <w14:ligatures w14:val="standardContextual"/>
             </w:rPr>
           </w:pPr>
-          <w:hyperlink w:anchor="_Toc192620802" w:history="1">
+          <w:hyperlink w:anchor="_Toc216856842" w:history="1">
             <w:r>
               <w:rPr>
                 <w:rStyle w:val="Hyperlink"/>
@@ -993,7 +993,7 @@
                 <w:rFonts w:asciiTheme="minorHAnsi" w:eastAsiaTheme="minorEastAsia" w:hAnsiTheme="minorHAnsi" w:cstheme="minorBidi"/>
                 <w:noProof/>
                 <w:szCs w:val="24"/>
-                <w:lang w:eastAsia="en-US" w:bidi="ar-SA"/>
+                <w:lang w:val="en-FI" w:eastAsia="en-FI" w:bidi="ar-SA"/>
                 <w14:ligatures w14:val="standardContextual"/>
               </w:rPr>
               <w:tab/>
@@ -1021,7 +1021,7 @@
               <w:rPr>
                 <w:noProof/>
               </w:rPr>
-              <w:instrText xml:space="preserve"> PAGEREF _Toc192620802 \h </w:instrText>
+              <w:instrText xml:space="preserve"> PAGEREF _Toc216856842 \h </w:instrText>
             </w:r>
             <w:r>
               <w:rPr>
@@ -1059,11 +1059,11 @@
               <w:rFonts w:asciiTheme="minorHAnsi" w:eastAsiaTheme="minorEastAsia" w:hAnsiTheme="minorHAnsi" w:cstheme="minorBidi"/>
               <w:noProof/>
               <w:szCs w:val="24"/>
-              <w:lang w:eastAsia="en-US" w:bidi="ar-SA"/>
+              <w:lang w:val="en-FI" w:eastAsia="en-FI" w:bidi="ar-SA"/>
               <w14:ligatures w14:val="standardContextual"/>
             </w:rPr>
           </w:pPr>
-          <w:hyperlink w:anchor="_Toc192620803" w:history="1">
+          <w:hyperlink w:anchor="_Toc216856843" w:history="1">
             <w:r>
               <w:rPr>
                 <w:rStyle w:val="Hyperlink"/>
@@ -1076,7 +1076,7 @@
                 <w:rFonts w:asciiTheme="minorHAnsi" w:eastAsiaTheme="minorEastAsia" w:hAnsiTheme="minorHAnsi" w:cstheme="minorBidi"/>
                 <w:noProof/>
                 <w:szCs w:val="24"/>
-                <w:lang w:eastAsia="en-US" w:bidi="ar-SA"/>
+                <w:lang w:val="en-FI" w:eastAsia="en-FI" w:bidi="ar-SA"/>
                 <w14:ligatures w14:val="standardContextual"/>
               </w:rPr>
               <w:tab/>
@@ -1104,7 +1104,7 @@
               <w:rPr>
                 <w:noProof/>
               </w:rPr>
-              <w:instrText xml:space="preserve"> PAGEREF _Toc192620803 \h </w:instrText>
+              <w:instrText xml:space="preserve"> PAGEREF _Toc216856843 \h </w:instrText>
             </w:r>
             <w:r>
               <w:rPr>
@@ -1142,11 +1142,11 @@
               <w:rFonts w:asciiTheme="minorHAnsi" w:eastAsiaTheme="minorEastAsia" w:hAnsiTheme="minorHAnsi" w:cstheme="minorBidi"/>
               <w:noProof/>
               <w:szCs w:val="24"/>
-              <w:lang w:eastAsia="en-US" w:bidi="ar-SA"/>
+              <w:lang w:val="en-FI" w:eastAsia="en-FI" w:bidi="ar-SA"/>
               <w14:ligatures w14:val="standardContextual"/>
             </w:rPr>
           </w:pPr>
-          <w:hyperlink w:anchor="_Toc192620804" w:history="1">
+          <w:hyperlink w:anchor="_Toc216856844" w:history="1">
             <w:r>
               <w:rPr>
                 <w:rStyle w:val="Hyperlink"/>
@@ -1159,7 +1159,7 @@
                 <w:rFonts w:asciiTheme="minorHAnsi" w:eastAsiaTheme="minorEastAsia" w:hAnsiTheme="minorHAnsi" w:cstheme="minorBidi"/>
                 <w:noProof/>
                 <w:szCs w:val="24"/>
-                <w:lang w:eastAsia="en-US" w:bidi="ar-SA"/>
+                <w:lang w:val="en-FI" w:eastAsia="en-FI" w:bidi="ar-SA"/>
                 <w14:ligatures w14:val="standardContextual"/>
               </w:rPr>
               <w:tab/>
@@ -1187,7 +1187,92 @@
               <w:rPr>
                 <w:noProof/>
               </w:rPr>
-              <w:instrText xml:space="preserve"> PAGEREF _Toc192620804 \h </w:instrText>
+              <w:instrText xml:space="preserve"> PAGEREF _Toc216856844 \h </w:instrText>
+            </w:r>
+            <w:r>
+              <w:rPr>
+                <w:noProof/>
+              </w:rPr>
+            </w:r>
+            <w:r>
+              <w:rPr>
+                <w:noProof/>
+              </w:rPr>
+              <w:fldChar w:fldCharType="separate"/>
+            </w:r>
+            <w:r>
+              <w:rPr>
+                <w:noProof/>
+              </w:rPr>
+              <w:t>6</w:t>
+            </w:r>
+            <w:r>
+              <w:rPr>
+                <w:noProof/>
+              </w:rPr>
+              <w:fldChar w:fldCharType="end"/>
+            </w:r>
+          </w:hyperlink>
+        </w:p>
+        <w:p>
+          <w:pPr>
+            <w:pStyle w:val="TOC2"/>
+            <w:tabs>
+              <w:tab w:val="left" w:pos="780"/>
+              <w:tab w:val="right" w:leader="dot" w:pos="9736"/>
+            </w:tabs>
+            <w:rPr>
+              <w:rFonts w:asciiTheme="minorHAnsi" w:eastAsiaTheme="minorEastAsia" w:hAnsiTheme="minorHAnsi" w:cstheme="minorBidi"/>
+              <w:noProof/>
+              <w:szCs w:val="24"/>
+              <w:lang w:val="en-FI" w:eastAsia="en-FI" w:bidi="ar-SA"/>
+              <w14:ligatures w14:val="standardContextual"/>
+            </w:rPr>
+          </w:pPr>
+          <w:hyperlink w:anchor="_Toc216856845" w:history="1">
+            <w:r>
+              <w:rPr>
+                <w:rStyle w:val="Hyperlink"/>
+                <w:rFonts w:cs="Arial"/>
+                <w:noProof/>
+              </w:rPr>
+              <w:t>4.7</w:t>
+            </w:r>
+            <w:r>
+              <w:rPr>
+                <w:rFonts w:asciiTheme="minorHAnsi" w:eastAsiaTheme="minorEastAsia" w:hAnsiTheme="minorHAnsi" w:cstheme="minorBidi"/>
+                <w:noProof/>
+                <w:szCs w:val="24"/>
+                <w:lang w:val="en-FI" w:eastAsia="en-FI" w:bidi="ar-SA"/>
+                <w14:ligatures w14:val="standardContextual"/>
+              </w:rPr>
+              <w:tab/>
+            </w:r>
+            <w:r>
+              <w:rPr>
+                <w:rStyle w:val="Hyperlink"/>
+                <w:rFonts w:cs="Arial"/>
+                <w:noProof/>
+              </w:rPr>
+              <w:t>Compatibility with Hyvä Theme</w:t>
+            </w:r>
+            <w:r>
+              <w:rPr>
+                <w:noProof/>
+              </w:rPr>
+              <w:tab/>
+            </w:r>
+            <w:r>
+              <w:rPr>
+                <w:noProof/>
+              </w:rPr>
+              <w:fldChar w:fldCharType="begin"/>
+            </w:r>
+            <w:r>
+              <w:rPr>
+                <w:noProof/>
+              </w:rPr>
+              <w:instrText xml:space="preserve"> PAGEREF _Toc216856845 \h </w:instrText>
             </w:r>
             <w:r>
               <w:rPr>
@@ -1225,11 +1310,11 @@
               <w:rFonts w:asciiTheme="minorHAnsi" w:eastAsiaTheme="minorEastAsia" w:hAnsiTheme="minorHAnsi" w:cstheme="minorBidi"/>
               <w:noProof/>
               <w:szCs w:val="24"/>
-              <w:lang w:eastAsia="en-US" w:bidi="ar-SA"/>
+              <w:lang w:val="en-FI" w:eastAsia="en-FI" w:bidi="ar-SA"/>
               <w14:ligatures w14:val="standardContextual"/>
             </w:rPr>
           </w:pPr>
-          <w:hyperlink w:anchor="_Toc192620805" w:history="1">
+          <w:hyperlink w:anchor="_Toc216856846" w:history="1">
             <w:r>
               <w:rPr>
                 <w:rStyle w:val="Hyperlink"/>
@@ -1242,7 +1327,7 @@
                 <w:rFonts w:asciiTheme="minorHAnsi" w:eastAsiaTheme="minorEastAsia" w:hAnsiTheme="minorHAnsi" w:cstheme="minorBidi"/>
                 <w:noProof/>
                 <w:szCs w:val="24"/>
-                <w:lang w:eastAsia="en-US" w:bidi="ar-SA"/>
+                <w:lang w:val="en-FI" w:eastAsia="en-FI" w:bidi="ar-SA"/>
                 <w14:ligatures w14:val="standardContextual"/>
               </w:rPr>
               <w:tab/>
@@ -1270,7 +1355,7 @@
               <w:rPr>
                 <w:noProof/>
               </w:rPr>
-              <w:instrText xml:space="preserve"> PAGEREF _Toc192620805 \h </w:instrText>
+              <w:instrText xml:space="preserve"> PAGEREF _Toc216856846 \h </w:instrText>
             </w:r>
             <w:r>
               <w:rPr>
@@ -1308,11 +1393,11 @@
               <w:rFonts w:asciiTheme="minorHAnsi" w:eastAsiaTheme="minorEastAsia" w:hAnsiTheme="minorHAnsi" w:cstheme="minorBidi"/>
               <w:noProof/>
               <w:szCs w:val="24"/>
-              <w:lang w:eastAsia="en-US" w:bidi="ar-SA"/>
+              <w:lang w:val="en-FI" w:eastAsia="en-FI" w:bidi="ar-SA"/>
               <w14:ligatures w14:val="standardContextual"/>
             </w:rPr>
           </w:pPr>
-          <w:hyperlink w:anchor="_Toc192620806" w:history="1">
+          <w:hyperlink w:anchor="_Toc216856847" w:history="1">
             <w:r>
               <w:rPr>
                 <w:rStyle w:val="Hyperlink"/>
@@ -1325,7 +1410,7 @@
                 <w:rFonts w:asciiTheme="minorHAnsi" w:eastAsiaTheme="minorEastAsia" w:hAnsiTheme="minorHAnsi" w:cstheme="minorBidi"/>
                 <w:noProof/>
                 <w:szCs w:val="24"/>
-                <w:lang w:eastAsia="en-US" w:bidi="ar-SA"/>
+                <w:lang w:val="en-FI" w:eastAsia="en-FI" w:bidi="ar-SA"/>
                 <w14:ligatures w14:val="standardContextual"/>
               </w:rPr>
               <w:tab/>
@@ -1353,7 +1438,7 @@
               <w:rPr>
                 <w:noProof/>
               </w:rPr>
-              <w:instrText xml:space="preserve"> PAGEREF _Toc192620806 \h </w:instrText>
+              <w:instrText xml:space="preserve"> PAGEREF _Toc216856847 \h </w:instrText>
             </w:r>
             <w:r>
               <w:rPr>
@@ -1391,11 +1476,11 @@
               <w:rFonts w:asciiTheme="minorHAnsi" w:eastAsiaTheme="minorEastAsia" w:hAnsiTheme="minorHAnsi" w:cstheme="minorBidi"/>
               <w:noProof/>
               <w:szCs w:val="24"/>
-              <w:lang w:eastAsia="en-US" w:bidi="ar-SA"/>
+              <w:lang w:val="en-FI" w:eastAsia="en-FI" w:bidi="ar-SA"/>
               <w14:ligatures w14:val="standardContextual"/>
             </w:rPr>
           </w:pPr>
-          <w:hyperlink w:anchor="_Toc192620807" w:history="1">
+          <w:hyperlink w:anchor="_Toc216856848" w:history="1">
             <w:r>
               <w:rPr>
                 <w:rStyle w:val="Hyperlink"/>
@@ -1408,7 +1493,7 @@
                 <w:rFonts w:asciiTheme="minorHAnsi" w:eastAsiaTheme="minorEastAsia" w:hAnsiTheme="minorHAnsi" w:cstheme="minorBidi"/>
                 <w:noProof/>
                 <w:szCs w:val="24"/>
-                <w:lang w:eastAsia="en-US" w:bidi="ar-SA"/>
+                <w:lang w:val="en-FI" w:eastAsia="en-FI" w:bidi="ar-SA"/>
                 <w14:ligatures w14:val="standardContextual"/>
               </w:rPr>
               <w:tab/>
@@ -1436,7 +1521,7 @@
               <w:rPr>
                 <w:noProof/>
               </w:rPr>
-              <w:instrText xml:space="preserve"> PAGEREF _Toc192620807 \h </w:instrText>
+              <w:instrText xml:space="preserve"> PAGEREF _Toc216856848 \h </w:instrText>
             </w:r>
             <w:r>
               <w:rPr>
@@ -1474,11 +1559,11 @@
               <w:rFonts w:asciiTheme="minorHAnsi" w:eastAsiaTheme="minorEastAsia" w:hAnsiTheme="minorHAnsi" w:cstheme="minorBidi"/>
               <w:noProof/>
               <w:szCs w:val="24"/>
-              <w:lang w:eastAsia="en-US" w:bidi="ar-SA"/>
+              <w:lang w:val="en-FI" w:eastAsia="en-FI" w:bidi="ar-SA"/>
               <w14:ligatures w14:val="standardContextual"/>
             </w:rPr>
           </w:pPr>
-          <w:hyperlink w:anchor="_Toc192620808" w:history="1">
+          <w:hyperlink w:anchor="_Toc216856849" w:history="1">
             <w:r>
               <w:rPr>
                 <w:rStyle w:val="Hyperlink"/>
@@ -1491,7 +1576,7 @@
                 <w:rFonts w:asciiTheme="minorHAnsi" w:eastAsiaTheme="minorEastAsia" w:hAnsiTheme="minorHAnsi" w:cstheme="minorBidi"/>
                 <w:noProof/>
                 <w:szCs w:val="24"/>
-                <w:lang w:eastAsia="en-US" w:bidi="ar-SA"/>
+                <w:lang w:val="en-FI" w:eastAsia="en-FI" w:bidi="ar-SA"/>
                 <w14:ligatures w14:val="standardContextual"/>
               </w:rPr>
               <w:tab/>
@@ -1519,7 +1604,7 @@
               <w:rPr>
                 <w:noProof/>
               </w:rPr>
-              <w:instrText xml:space="preserve"> PAGEREF _Toc192620808 \h </w:instrText>
+              <w:instrText xml:space="preserve"> PAGEREF _Toc216856849 \h </w:instrText>
             </w:r>
             <w:r>
               <w:rPr>
@@ -1557,11 +1642,11 @@
               <w:rFonts w:asciiTheme="minorHAnsi" w:eastAsiaTheme="minorEastAsia" w:hAnsiTheme="minorHAnsi" w:cstheme="minorBidi"/>
               <w:noProof/>
               <w:szCs w:val="24"/>
-              <w:lang w:eastAsia="en-US" w:bidi="ar-SA"/>
+              <w:lang w:val="en-FI" w:eastAsia="en-FI" w:bidi="ar-SA"/>
               <w14:ligatures w14:val="standardContextual"/>
             </w:rPr>
           </w:pPr>
-          <w:hyperlink w:anchor="_Toc192620809" w:history="1">
+          <w:hyperlink w:anchor="_Toc216856850" w:history="1">
             <w:r>
               <w:rPr>
                 <w:rStyle w:val="Hyperlink"/>
@@ -1574,7 +1659,7 @@
                 <w:rFonts w:asciiTheme="minorHAnsi" w:eastAsiaTheme="minorEastAsia" w:hAnsiTheme="minorHAnsi" w:cstheme="minorBidi"/>
                 <w:noProof/>
                 <w:szCs w:val="24"/>
-                <w:lang w:eastAsia="en-US" w:bidi="ar-SA"/>
+                <w:lang w:val="en-FI" w:eastAsia="en-FI" w:bidi="ar-SA"/>
                 <w14:ligatures w14:val="standardContextual"/>
               </w:rPr>
               <w:tab/>
@@ -1602,7 +1687,7 @@
               <w:rPr>
                 <w:noProof/>
               </w:rPr>
-              <w:instrText xml:space="preserve"> PAGEREF _Toc192620809 \h </w:instrText>
+              <w:instrText xml:space="preserve"> PAGEREF _Toc216856850 \h </w:instrText>
             </w:r>
             <w:r>
               <w:rPr>
@@ -1640,11 +1725,11 @@
               <w:rFonts w:asciiTheme="minorHAnsi" w:eastAsiaTheme="minorEastAsia" w:hAnsiTheme="minorHAnsi" w:cstheme="minorBidi"/>
               <w:noProof/>
               <w:szCs w:val="24"/>
-              <w:lang w:eastAsia="en-US" w:bidi="ar-SA"/>
+              <w:lang w:val="en-FI" w:eastAsia="en-FI" w:bidi="ar-SA"/>
               <w14:ligatures w14:val="standardContextual"/>
             </w:rPr>
           </w:pPr>
-          <w:hyperlink w:anchor="_Toc192620810" w:history="1">
+          <w:hyperlink w:anchor="_Toc216856851" w:history="1">
             <w:r>
               <w:rPr>
                 <w:rStyle w:val="Hyperlink"/>
@@ -1657,7 +1742,7 @@
                 <w:rFonts w:asciiTheme="minorHAnsi" w:eastAsiaTheme="minorEastAsia" w:hAnsiTheme="minorHAnsi" w:cstheme="minorBidi"/>
                 <w:noProof/>
                 <w:szCs w:val="24"/>
-                <w:lang w:eastAsia="en-US" w:bidi="ar-SA"/>
+                <w:lang w:val="en-FI" w:eastAsia="en-FI" w:bidi="ar-SA"/>
                 <w14:ligatures w14:val="standardContextual"/>
               </w:rPr>
               <w:tab/>
@@ -1685,7 +1770,7 @@
               <w:rPr>
                 <w:noProof/>
               </w:rPr>
-              <w:instrText xml:space="preserve"> PAGEREF _Toc192620810 \h </w:instrText>
+              <w:instrText xml:space="preserve"> PAGEREF _Toc216856851 \h </w:instrText>
             </w:r>
             <w:r>
               <w:rPr>
@@ -1723,11 +1808,11 @@
               <w:rFonts w:asciiTheme="minorHAnsi" w:eastAsiaTheme="minorEastAsia" w:hAnsiTheme="minorHAnsi" w:cstheme="minorBidi"/>
               <w:noProof/>
               <w:szCs w:val="24"/>
-              <w:lang w:eastAsia="en-US" w:bidi="ar-SA"/>
+              <w:lang w:val="en-FI" w:eastAsia="en-FI" w:bidi="ar-SA"/>
               <w14:ligatures w14:val="standardContextual"/>
             </w:rPr>
           </w:pPr>
-          <w:hyperlink w:anchor="_Toc192620811" w:history="1">
+          <w:hyperlink w:anchor="_Toc216856852" w:history="1">
             <w:r>
               <w:rPr>
                 <w:rStyle w:val="Hyperlink"/>
@@ -1740,7 +1825,7 @@
                 <w:rFonts w:asciiTheme="minorHAnsi" w:eastAsiaTheme="minorEastAsia" w:hAnsiTheme="minorHAnsi" w:cstheme="minorBidi"/>
                 <w:noProof/>
                 <w:szCs w:val="24"/>
-                <w:lang w:eastAsia="en-US" w:bidi="ar-SA"/>
+                <w:lang w:val="en-FI" w:eastAsia="en-FI" w:bidi="ar-SA"/>
                 <w14:ligatures w14:val="standardContextual"/>
               </w:rPr>
               <w:tab/>
@@ -1768,7 +1853,7 @@
               <w:rPr>
                 <w:noProof/>
               </w:rPr>
-              <w:instrText xml:space="preserve"> PAGEREF _Toc192620811 \h </w:instrText>
+              <w:instrText xml:space="preserve"> PAGEREF _Toc216856852 \h </w:instrText>
             </w:r>
             <w:r>
               <w:rPr>
@@ -1806,11 +1891,11 @@
               <w:rFonts w:asciiTheme="minorHAnsi" w:eastAsiaTheme="minorEastAsia" w:hAnsiTheme="minorHAnsi" w:cstheme="minorBidi"/>
               <w:noProof/>
               <w:szCs w:val="24"/>
-              <w:lang w:eastAsia="en-US" w:bidi="ar-SA"/>
+              <w:lang w:val="en-FI" w:eastAsia="en-FI" w:bidi="ar-SA"/>
               <w14:ligatures w14:val="standardContextual"/>
             </w:rPr>
           </w:pPr>
-          <w:hyperlink w:anchor="_Toc192620812" w:history="1">
+          <w:hyperlink w:anchor="_Toc216856853" w:history="1">
             <w:r>
               <w:rPr>
                 <w:rStyle w:val="Hyperlink"/>
@@ -1823,7 +1908,7 @@
                 <w:rFonts w:asciiTheme="minorHAnsi" w:eastAsiaTheme="minorEastAsia" w:hAnsiTheme="minorHAnsi" w:cstheme="minorBidi"/>
                 <w:noProof/>
                 <w:szCs w:val="24"/>
-                <w:lang w:eastAsia="en-US" w:bidi="ar-SA"/>
+                <w:lang w:val="en-FI" w:eastAsia="en-FI" w:bidi="ar-SA"/>
                 <w14:ligatures w14:val="standardContextual"/>
               </w:rPr>
               <w:tab/>
@@ -1851,7 +1936,7 @@
               <w:rPr>
                 <w:noProof/>
               </w:rPr>
-              <w:instrText xml:space="preserve"> PAGEREF _Toc192620812 \h </w:instrText>
+              <w:instrText xml:space="preserve"> PAGEREF _Toc216856853 \h </w:instrText>
             </w:r>
             <w:r>
               <w:rPr>
@@ -1889,11 +1974,11 @@
               <w:rFonts w:asciiTheme="minorHAnsi" w:eastAsiaTheme="minorEastAsia" w:hAnsiTheme="minorHAnsi" w:cstheme="minorBidi"/>
               <w:noProof/>
               <w:szCs w:val="24"/>
-              <w:lang w:eastAsia="en-US" w:bidi="ar-SA"/>
+              <w:lang w:val="en-FI" w:eastAsia="en-FI" w:bidi="ar-SA"/>
               <w14:ligatures w14:val="standardContextual"/>
             </w:rPr>
           </w:pPr>
-          <w:hyperlink w:anchor="_Toc192620813" w:history="1">
+          <w:hyperlink w:anchor="_Toc216856854" w:history="1">
             <w:r>
               <w:rPr>
                 <w:rStyle w:val="Hyperlink"/>
@@ -1906,7 +1991,7 @@
                 <w:rFonts w:asciiTheme="minorHAnsi" w:eastAsiaTheme="minorEastAsia" w:hAnsiTheme="minorHAnsi" w:cstheme="minorBidi"/>
                 <w:noProof/>
                 <w:szCs w:val="24"/>
-                <w:lang w:eastAsia="en-US" w:bidi="ar-SA"/>
+                <w:lang w:val="en-FI" w:eastAsia="en-FI" w:bidi="ar-SA"/>
                 <w14:ligatures w14:val="standardContextual"/>
               </w:rPr>
               <w:tab/>
@@ -1934,7 +2019,7 @@
               <w:rPr>
                 <w:noProof/>
               </w:rPr>
-              <w:instrText xml:space="preserve"> PAGEREF _Toc192620813 \h </w:instrText>
+              <w:instrText xml:space="preserve"> PAGEREF _Toc216856854 \h </w:instrText>
             </w:r>
             <w:r>
               <w:rPr>
@@ -1972,11 +2057,11 @@
               <w:rFonts w:asciiTheme="minorHAnsi" w:eastAsiaTheme="minorEastAsia" w:hAnsiTheme="minorHAnsi" w:cstheme="minorBidi"/>
               <w:noProof/>
               <w:szCs w:val="24"/>
-              <w:lang w:eastAsia="en-US" w:bidi="ar-SA"/>
+              <w:lang w:val="en-FI" w:eastAsia="en-FI" w:bidi="ar-SA"/>
               <w14:ligatures w14:val="standardContextual"/>
             </w:rPr>
           </w:pPr>
-          <w:hyperlink w:anchor="_Toc192620814" w:history="1">
+          <w:hyperlink w:anchor="_Toc216856855" w:history="1">
             <w:r>
               <w:rPr>
                 <w:rStyle w:val="Hyperlink"/>
@@ -1989,7 +2074,7 @@
                 <w:rFonts w:asciiTheme="minorHAnsi" w:eastAsiaTheme="minorEastAsia" w:hAnsiTheme="minorHAnsi" w:cstheme="minorBidi"/>
                 <w:noProof/>
                 <w:szCs w:val="24"/>
-                <w:lang w:eastAsia="en-US" w:bidi="ar-SA"/>
+                <w:lang w:val="en-FI" w:eastAsia="en-FI" w:bidi="ar-SA"/>
                 <w14:ligatures w14:val="standardContextual"/>
               </w:rPr>
               <w:tab/>
@@ -2017,7 +2102,7 @@
               <w:rPr>
                 <w:noProof/>
               </w:rPr>
-              <w:instrText xml:space="preserve"> PAGEREF _Toc192620814 \h </w:instrText>
+              <w:instrText xml:space="preserve"> PAGEREF _Toc216856855 \h </w:instrText>
             </w:r>
             <w:r>
               <w:rPr>
@@ -2055,11 +2140,11 @@
               <w:rFonts w:asciiTheme="minorHAnsi" w:eastAsiaTheme="minorEastAsia" w:hAnsiTheme="minorHAnsi" w:cstheme="minorBidi"/>
               <w:noProof/>
               <w:szCs w:val="24"/>
-              <w:lang w:eastAsia="en-US" w:bidi="ar-SA"/>
+              <w:lang w:val="en-FI" w:eastAsia="en-FI" w:bidi="ar-SA"/>
               <w14:ligatures w14:val="standardContextual"/>
             </w:rPr>
           </w:pPr>
-          <w:hyperlink w:anchor="_Toc192620815" w:history="1">
+          <w:hyperlink w:anchor="_Toc216856856" w:history="1">
             <w:r>
               <w:rPr>
                 <w:rStyle w:val="Hyperlink"/>
@@ -2072,7 +2157,7 @@
                 <w:rFonts w:asciiTheme="minorHAnsi" w:eastAsiaTheme="minorEastAsia" w:hAnsiTheme="minorHAnsi" w:cstheme="minorBidi"/>
                 <w:noProof/>
                 <w:szCs w:val="24"/>
-                <w:lang w:eastAsia="en-US" w:bidi="ar-SA"/>
+                <w:lang w:val="en-FI" w:eastAsia="en-FI" w:bidi="ar-SA"/>
                 <w14:ligatures w14:val="standardContextual"/>
               </w:rPr>
               <w:tab/>
@@ -2100,7 +2185,7 @@
               <w:rPr>
                 <w:noProof/>
               </w:rPr>
-              <w:instrText xml:space="preserve"> PAGEREF _Toc192620815 \h </w:instrText>
+              <w:instrText xml:space="preserve"> PAGEREF _Toc216856856 \h </w:instrText>
             </w:r>
             <w:r>
               <w:rPr>
@@ -2138,11 +2223,11 @@
               <w:rFonts w:asciiTheme="minorHAnsi" w:eastAsiaTheme="minorEastAsia" w:hAnsiTheme="minorHAnsi" w:cstheme="minorBidi"/>
               <w:noProof/>
               <w:szCs w:val="24"/>
-              <w:lang w:eastAsia="en-US" w:bidi="ar-SA"/>
+              <w:lang w:val="en-FI" w:eastAsia="en-FI" w:bidi="ar-SA"/>
               <w14:ligatures w14:val="standardContextual"/>
             </w:rPr>
           </w:pPr>
-          <w:hyperlink w:anchor="_Toc192620816" w:history="1">
+          <w:hyperlink w:anchor="_Toc216856857" w:history="1">
             <w:r>
               <w:rPr>
                 <w:rStyle w:val="Hyperlink"/>
@@ -2155,7 +2240,7 @@
                 <w:rFonts w:asciiTheme="minorHAnsi" w:eastAsiaTheme="minorEastAsia" w:hAnsiTheme="minorHAnsi" w:cstheme="minorBidi"/>
                 <w:noProof/>
                 <w:szCs w:val="24"/>
-                <w:lang w:eastAsia="en-US" w:bidi="ar-SA"/>
+                <w:lang w:val="en-FI" w:eastAsia="en-FI" w:bidi="ar-SA"/>
                 <w14:ligatures w14:val="standardContextual"/>
               </w:rPr>
               <w:tab/>
@@ -2183,7 +2268,7 @@
               <w:rPr>
                 <w:noProof/>
               </w:rPr>
-              <w:instrText xml:space="preserve"> PAGEREF _Toc192620816 \h </w:instrText>
+              <w:instrText xml:space="preserve"> PAGEREF _Toc216856857 \h </w:instrText>
             </w:r>
             <w:r>
               <w:rPr>
@@ -2200,7 +2285,7 @@
               <w:rPr>
                 <w:noProof/>
               </w:rPr>
-              <w:t>15</w:t>
+              <w:t>14</w:t>
             </w:r>
             <w:r>
               <w:rPr>
@@ -2221,11 +2306,11 @@
               <w:rFonts w:asciiTheme="minorHAnsi" w:eastAsiaTheme="minorEastAsia" w:hAnsiTheme="minorHAnsi" w:cstheme="minorBidi"/>
               <w:noProof/>
               <w:szCs w:val="24"/>
-              <w:lang w:eastAsia="en-US" w:bidi="ar-SA"/>
+              <w:lang w:val="en-FI" w:eastAsia="en-FI" w:bidi="ar-SA"/>
               <w14:ligatures w14:val="standardContextual"/>
             </w:rPr>
           </w:pPr>
-          <w:hyperlink w:anchor="_Toc192620817" w:history="1">
+          <w:hyperlink w:anchor="_Toc216856858" w:history="1">
             <w:r>
               <w:rPr>
                 <w:rStyle w:val="Hyperlink"/>
@@ -2238,7 +2323,7 @@
                 <w:rFonts w:asciiTheme="minorHAnsi" w:eastAsiaTheme="minorEastAsia" w:hAnsiTheme="minorHAnsi" w:cstheme="minorBidi"/>
                 <w:noProof/>
                 <w:szCs w:val="24"/>
-                <w:lang w:eastAsia="en-US" w:bidi="ar-SA"/>
+                <w:lang w:val="en-FI" w:eastAsia="en-FI" w:bidi="ar-SA"/>
                 <w14:ligatures w14:val="standardContextual"/>
               </w:rPr>
               <w:tab/>
@@ -2266,7 +2351,7 @@
               <w:rPr>
                 <w:noProof/>
               </w:rPr>
-              <w:instrText xml:space="preserve"> PAGEREF _Toc192620817 \h </w:instrText>
+              <w:instrText xml:space="preserve"> PAGEREF _Toc216856858 \h </w:instrText>
             </w:r>
             <w:r>
               <w:rPr>
@@ -2283,7 +2368,7 @@
               <w:rPr>
                 <w:noProof/>
               </w:rPr>
-              <w:t>16</w:t>
+              <w:t>15</w:t>
             </w:r>
             <w:r>
               <w:rPr>
@@ -2304,11 +2389,11 @@
               <w:rFonts w:asciiTheme="minorHAnsi" w:eastAsiaTheme="minorEastAsia" w:hAnsiTheme="minorHAnsi" w:cstheme="minorBidi"/>
               <w:noProof/>
               <w:szCs w:val="24"/>
-              <w:lang w:eastAsia="en-US" w:bidi="ar-SA"/>
+              <w:lang w:val="en-FI" w:eastAsia="en-FI" w:bidi="ar-SA"/>
               <w14:ligatures w14:val="standardContextual"/>
             </w:rPr>
           </w:pPr>
-          <w:hyperlink w:anchor="_Toc192620818" w:history="1">
+          <w:hyperlink w:anchor="_Toc216856859" w:history="1">
             <w:r>
               <w:rPr>
                 <w:rStyle w:val="Hyperlink"/>
@@ -2321,7 +2406,7 @@
                 <w:rFonts w:asciiTheme="minorHAnsi" w:eastAsiaTheme="minorEastAsia" w:hAnsiTheme="minorHAnsi" w:cstheme="minorBidi"/>
                 <w:noProof/>
                 <w:szCs w:val="24"/>
-                <w:lang w:eastAsia="en-US" w:bidi="ar-SA"/>
+                <w:lang w:val="en-FI" w:eastAsia="en-FI" w:bidi="ar-SA"/>
                 <w14:ligatures w14:val="standardContextual"/>
               </w:rPr>
               <w:tab/>
@@ -2349,7 +2434,7 @@
               <w:rPr>
                 <w:noProof/>
               </w:rPr>
-              <w:instrText xml:space="preserve"> PAGEREF _Toc192620818 \h </w:instrText>
+              <w:instrText xml:space="preserve"> PAGEREF _Toc216856859 \h </w:instrText>
             </w:r>
             <w:r>
               <w:rPr>
@@ -2366,7 +2451,7 @@
               <w:rPr>
                 <w:noProof/>
               </w:rPr>
-              <w:t>17</w:t>
+              <w:t>16</w:t>
             </w:r>
             <w:r>
               <w:rPr>
@@ -2387,11 +2472,11 @@
               <w:rFonts w:asciiTheme="minorHAnsi" w:eastAsiaTheme="minorEastAsia" w:hAnsiTheme="minorHAnsi" w:cstheme="minorBidi"/>
               <w:noProof/>
               <w:szCs w:val="24"/>
-              <w:lang w:eastAsia="en-US" w:bidi="ar-SA"/>
+              <w:lang w:val="en-FI" w:eastAsia="en-FI" w:bidi="ar-SA"/>
               <w14:ligatures w14:val="standardContextual"/>
             </w:rPr>
           </w:pPr>
-          <w:hyperlink w:anchor="_Toc192620819" w:history="1">
+          <w:hyperlink w:anchor="_Toc216856860" w:history="1">
             <w:r>
               <w:rPr>
                 <w:rStyle w:val="Hyperlink"/>
@@ -2404,7 +2489,7 @@
                 <w:rFonts w:asciiTheme="minorHAnsi" w:eastAsiaTheme="minorEastAsia" w:hAnsiTheme="minorHAnsi" w:cstheme="minorBidi"/>
                 <w:noProof/>
                 <w:szCs w:val="24"/>
-                <w:lang w:eastAsia="en-US" w:bidi="ar-SA"/>
+                <w:lang w:val="en-FI" w:eastAsia="en-FI" w:bidi="ar-SA"/>
                 <w14:ligatures w14:val="standardContextual"/>
               </w:rPr>
               <w:tab/>
@@ -2432,7 +2517,7 @@
               <w:rPr>
                 <w:noProof/>
               </w:rPr>
-              <w:instrText xml:space="preserve"> PAGEREF _Toc192620819 \h </w:instrText>
+              <w:instrText xml:space="preserve"> PAGEREF _Toc216856860 \h </w:instrText>
             </w:r>
             <w:r>
               <w:rPr>
@@ -2449,7 +2534,7 @@
               <w:rPr>
                 <w:noProof/>
               </w:rPr>
-              <w:t>18</w:t>
+              <w:t>17</w:t>
             </w:r>
             <w:r>
               <w:rPr>
@@ -2470,11 +2555,11 @@
               <w:rFonts w:asciiTheme="minorHAnsi" w:eastAsiaTheme="minorEastAsia" w:hAnsiTheme="minorHAnsi" w:cstheme="minorBidi"/>
               <w:noProof/>
               <w:szCs w:val="24"/>
-              <w:lang w:eastAsia="en-US" w:bidi="ar-SA"/>
+              <w:lang w:val="en-FI" w:eastAsia="en-FI" w:bidi="ar-SA"/>
               <w14:ligatures w14:val="standardContextual"/>
             </w:rPr>
           </w:pPr>
-          <w:hyperlink w:anchor="_Toc192620820" w:history="1">
+          <w:hyperlink w:anchor="_Toc216856861" w:history="1">
             <w:r>
               <w:rPr>
                 <w:rStyle w:val="Hyperlink"/>
@@ -2487,7 +2572,7 @@
                 <w:rFonts w:asciiTheme="minorHAnsi" w:eastAsiaTheme="minorEastAsia" w:hAnsiTheme="minorHAnsi" w:cstheme="minorBidi"/>
                 <w:noProof/>
                 <w:szCs w:val="24"/>
-                <w:lang w:eastAsia="en-US" w:bidi="ar-SA"/>
+                <w:lang w:val="en-FI" w:eastAsia="en-FI" w:bidi="ar-SA"/>
                 <w14:ligatures w14:val="standardContextual"/>
               </w:rPr>
               <w:tab/>
@@ -2515,7 +2600,7 @@
               <w:rPr>
                 <w:noProof/>
               </w:rPr>
-              <w:instrText xml:space="preserve"> PAGEREF _Toc192620820 \h </w:instrText>
+              <w:instrText xml:space="preserve"> PAGEREF _Toc216856861 \h </w:instrText>
             </w:r>
             <w:r>
               <w:rPr>
@@ -2532,7 +2617,7 @@
               <w:rPr>
                 <w:noProof/>
               </w:rPr>
-              <w:t>18</w:t>
+              <w:t>17</w:t>
             </w:r>
             <w:r>
               <w:rPr>
@@ -2553,11 +2638,11 @@
               <w:rFonts w:asciiTheme="minorHAnsi" w:eastAsiaTheme="minorEastAsia" w:hAnsiTheme="minorHAnsi" w:cstheme="minorBidi"/>
               <w:noProof/>
               <w:szCs w:val="24"/>
-              <w:lang w:eastAsia="en-US" w:bidi="ar-SA"/>
+              <w:lang w:val="en-FI" w:eastAsia="en-FI" w:bidi="ar-SA"/>
               <w14:ligatures w14:val="standardContextual"/>
             </w:rPr>
           </w:pPr>
-          <w:hyperlink w:anchor="_Toc192620821" w:history="1">
+          <w:hyperlink w:anchor="_Toc216856862" w:history="1">
             <w:r>
               <w:rPr>
                 <w:rStyle w:val="Hyperlink"/>
@@ -2570,7 +2655,7 @@
                 <w:rFonts w:asciiTheme="minorHAnsi" w:eastAsiaTheme="minorEastAsia" w:hAnsiTheme="minorHAnsi" w:cstheme="minorBidi"/>
                 <w:noProof/>
                 <w:szCs w:val="24"/>
-                <w:lang w:eastAsia="en-US" w:bidi="ar-SA"/>
+                <w:lang w:val="en-FI" w:eastAsia="en-FI" w:bidi="ar-SA"/>
                 <w14:ligatures w14:val="standardContextual"/>
               </w:rPr>
               <w:tab/>
@@ -2598,7 +2683,7 @@
               <w:rPr>
                 <w:noProof/>
               </w:rPr>
-              <w:instrText xml:space="preserve"> PAGEREF _Toc192620821 \h </w:instrText>
+              <w:instrText xml:space="preserve"> PAGEREF _Toc216856862 \h </w:instrText>
             </w:r>
             <w:r>
               <w:rPr>
@@ -2615,7 +2700,7 @@
               <w:rPr>
                 <w:noProof/>
               </w:rPr>
-              <w:t>18</w:t>
+              <w:t>17</w:t>
             </w:r>
             <w:r>
               <w:rPr>
@@ -2699,7 +2784,7 @@
         <w:pStyle w:val="Heading1"/>
         <w:spacing w:before="0"/>
       </w:pPr>
-      <w:bookmarkStart w:id="9" w:name="_Toc192620795"/>
+      <w:bookmarkStart w:id="9" w:name="_Toc216856835"/>
       <w:r>
         <w:lastRenderedPageBreak/>
         <w:t>General information</w:t>
@@ -2770,7 +2855,7 @@
       <w:bookmarkStart w:id="15" w:name="_Toc11253821_Copy_1"/>
       <w:bookmarkStart w:id="16" w:name="_Toc11353120_Copy_1"/>
       <w:bookmarkStart w:id="17" w:name="_Toc11353194_Copy_1"/>
-      <w:bookmarkStart w:id="18" w:name="_Toc192620796"/>
+      <w:bookmarkStart w:id="18" w:name="_Toc216856836"/>
       <w:bookmarkEnd w:id="10"/>
       <w:bookmarkEnd w:id="11"/>
       <w:bookmarkEnd w:id="12"/>
@@ -2845,7 +2930,7 @@
       <w:bookmarkStart w:id="31" w:name="_Toc11253823"/>
       <w:bookmarkStart w:id="32" w:name="_Toc11353122"/>
       <w:bookmarkStart w:id="33" w:name="_Toc11353196"/>
-      <w:bookmarkStart w:id="34" w:name="_Toc192620797"/>
+      <w:bookmarkStart w:id="34" w:name="_Toc216856837"/>
       <w:bookmarkEnd w:id="19"/>
       <w:bookmarkEnd w:id="20"/>
       <w:bookmarkEnd w:id="21"/>
@@ -3126,7 +3211,7 @@
       <w:bookmarkStart w:id="39" w:name="_Toc11253825"/>
       <w:bookmarkStart w:id="40" w:name="_Toc11353124"/>
       <w:bookmarkStart w:id="41" w:name="_Toc11353198"/>
-      <w:bookmarkStart w:id="42" w:name="_Toc192620798"/>
+      <w:bookmarkStart w:id="42" w:name="_Toc216856838"/>
       <w:r>
         <w:lastRenderedPageBreak/>
         <w:t>Installation</w:t>
@@ -3271,7 +3356,7 @@
       <w:bookmarkStart w:id="49" w:name="_Toc10743691"/>
       <w:bookmarkStart w:id="50" w:name="_Toc10741271"/>
       <w:bookmarkStart w:id="51" w:name="_Toc10646645"/>
-      <w:bookmarkStart w:id="52" w:name="_Toc192620799"/>
+      <w:bookmarkStart w:id="52" w:name="_Toc216856839"/>
       <w:bookmarkEnd w:id="44"/>
       <w:r>
         <w:t>Install</w:t>
@@ -3528,7 +3613,7 @@
       <w:pPr>
         <w:pStyle w:val="Heading2"/>
       </w:pPr>
-      <w:bookmarkStart w:id="53" w:name="_Toc192620800"/>
+      <w:bookmarkStart w:id="53" w:name="_Toc216856840"/>
       <w:r>
         <w:t>Check the current version information</w:t>
       </w:r>
@@ -3579,7 +3664,7 @@
       <w:bookmarkStart w:id="59" w:name="_Toc11253826"/>
       <w:bookmarkStart w:id="60" w:name="_Toc11353125"/>
       <w:bookmarkStart w:id="61" w:name="_Toc11353199"/>
-      <w:bookmarkStart w:id="62" w:name="_Toc192620801"/>
+      <w:bookmarkStart w:id="62" w:name="_Toc216856841"/>
       <w:bookmarkEnd w:id="54"/>
       <w:r>
         <w:t xml:space="preserve">Upgrade the existing </w:t>
@@ -3767,7 +3852,7 @@
       <w:pPr>
         <w:pStyle w:val="Heading2"/>
       </w:pPr>
-      <w:bookmarkStart w:id="63" w:name="_Toc192620802"/>
+      <w:bookmarkStart w:id="63" w:name="_Toc216856842"/>
       <w:r>
         <w:t>Remove the payment module</w:t>
       </w:r>
@@ -3830,7 +3915,7 @@
       </w:pPr>
       <w:bookmarkStart w:id="64" w:name="_Migrate_from_previous"/>
       <w:bookmarkStart w:id="65" w:name="_Migrating_from_previous"/>
-      <w:bookmarkStart w:id="66" w:name="_Toc192620803"/>
+      <w:bookmarkStart w:id="66" w:name="_Toc216856843"/>
       <w:bookmarkEnd w:id="64"/>
       <w:bookmarkEnd w:id="65"/>
       <w:r>
@@ -4337,7 +4422,7 @@
       <w:pPr>
         <w:pStyle w:val="Heading2"/>
       </w:pPr>
-      <w:bookmarkStart w:id="67" w:name="_Toc192620804"/>
+      <w:bookmarkStart w:id="67" w:name="_Toc216856844"/>
       <w:r>
         <w:t xml:space="preserve">Possible conflicts with </w:t>
       </w:r>
@@ -4473,14 +4558,128 @@
     </w:p>
     <w:p>
       <w:pPr>
-        <w:widowControl/>
-        <w:textAlignment w:val="auto"/>
+        <w:pStyle w:val="Heading2"/>
         <w:rPr>
-          <w:rFonts w:ascii="Arial" w:eastAsia="Droid Sans Fallback" w:hAnsi="Arial" w:cs="Lohit Hindi"/>
-          <w:b/>
-          <w:bCs/>
-          <w:sz w:val="28"/>
-          <w:szCs w:val="28"/>
+          <w:rFonts w:eastAsia="Arial Unicode MS" w:cs="Arial"/>
+        </w:rPr>
+      </w:pPr>
+      <w:bookmarkStart w:id="68" w:name="_Toc216856845"/>
+      <w:r>
+        <w:rPr>
+          <w:rFonts w:eastAsia="Arial Unicode MS" w:cs="Arial"/>
+        </w:rPr>
+        <w:t xml:space="preserve">Compatibility with </w:t>
+      </w:r>
+      <w:proofErr w:type="spellStart"/>
+      <w:r>
+        <w:rPr>
+          <w:rFonts w:eastAsia="Arial Unicode MS" w:cs="Arial"/>
+        </w:rPr>
+        <w:t>Hyvä</w:t>
+      </w:r>
+      <w:proofErr w:type="spellEnd"/>
+      <w:r>
+        <w:rPr>
+          <w:rFonts w:eastAsia="Arial Unicode MS" w:cs="Arial"/>
+        </w:rPr>
+        <w:t xml:space="preserve"> Theme</w:t>
+      </w:r>
+      <w:bookmarkEnd w:id="68"/>
+    </w:p>
+    <w:p>
+      <w:pPr>
+        <w:pStyle w:val="Textbody"/>
+        <w:rPr>
+          <w:i/>
+          <w:iCs/>
+        </w:rPr>
+      </w:pPr>
+      <w:r>
+        <w:rPr>
+          <w:i/>
+          <w:iCs/>
+        </w:rPr>
+        <w:t>New since December 2025</w:t>
+      </w:r>
+    </w:p>
+    <w:p>
+      <w:pPr>
+        <w:pStyle w:val="Textbody"/>
+      </w:pPr>
+      <w:r>
+        <w:t xml:space="preserve">If you intend to use Svea Payments module with </w:t>
+      </w:r>
+      <w:proofErr w:type="spellStart"/>
+      <w:r>
+        <w:t>Hyvä</w:t>
+      </w:r>
+      <w:proofErr w:type="spellEnd"/>
+      <w:r>
+        <w:t xml:space="preserve"> Theme you need to also install the Compatibility module we provide via </w:t>
+      </w:r>
+      <w:proofErr w:type="spellStart"/>
+      <w:r>
+        <w:t>Hyvä</w:t>
+      </w:r>
+      <w:proofErr w:type="spellEnd"/>
+      <w:r>
+        <w:t xml:space="preserve"> Theme repository.</w:t>
+      </w:r>
+      <w:r>
+        <w:t xml:space="preserve"> </w:t>
+      </w:r>
+    </w:p>
+    <w:p>
+      <w:pPr>
+        <w:pStyle w:val="Textbody"/>
+        <w:rPr>
+          <w:rFonts w:ascii="Courier New" w:hAnsi="Courier New" w:cs="Courier New"/>
+        </w:rPr>
+      </w:pPr>
+      <w:proofErr w:type="gramStart"/>
+      <w:r>
+        <w:rPr>
+          <w:rFonts w:ascii="Courier New" w:hAnsi="Courier New" w:cs="Courier New"/>
+        </w:rPr>
+        <w:t>composer</w:t>
+      </w:r>
+      <w:proofErr w:type="gramEnd"/>
+      <w:r>
+        <w:rPr>
+          <w:rFonts w:ascii="Courier New" w:hAnsi="Courier New" w:cs="Courier New"/>
+        </w:rPr>
+        <w:t xml:space="preserve"> require </w:t>
+      </w:r>
+      <w:proofErr w:type="spellStart"/>
+      <w:r>
+        <w:rPr>
+          <w:rFonts w:ascii="Courier New" w:hAnsi="Courier New" w:cs="Courier New"/>
+        </w:rPr>
+        <w:t>hyva</w:t>
+      </w:r>
+      <w:proofErr w:type="spellEnd"/>
+      <w:r>
+        <w:rPr>
+          <w:rFonts w:ascii="Courier New" w:hAnsi="Courier New" w:cs="Courier New"/>
+        </w:rPr>
+        <w:t>-themes/magento2-hyva-checkout-svea-payment</w:t>
+      </w:r>
+    </w:p>
+    <w:p>
+      <w:pPr>
+        <w:pStyle w:val="Textbody"/>
+      </w:pPr>
+      <w:r>
+        <w:t>Once installed our module will render correctly on Store and Checkout pages including the part payment calculator.</w:t>
+      </w:r>
+    </w:p>
+    <w:p>
+      <w:pPr>
+        <w:pStyle w:val="Heading2"/>
+        <w:rPr>
+          <w:rFonts w:ascii="Times New Roman" w:eastAsia="Arial Unicode MS" w:hAnsi="Times New Roman" w:cs="Arial Unicode MS"/>
+          <w:sz w:val="24"/>
+          <w:szCs w:val="24"/>
         </w:rPr>
       </w:pPr>
       <w:r>
@@ -4492,21 +4691,20 @@
         <w:pStyle w:val="Heading1"/>
         <w:spacing w:before="0"/>
       </w:pPr>
-      <w:bookmarkStart w:id="68" w:name="__RefHeading__3443_1681451042"/>
-      <w:bookmarkStart w:id="69" w:name="_Toc11353201"/>
-      <w:bookmarkStart w:id="70" w:name="_Toc11353127"/>
-      <w:bookmarkStart w:id="71" w:name="_Toc11253828"/>
-      <w:bookmarkStart w:id="72" w:name="_Toc11144781"/>
-      <w:bookmarkStart w:id="73" w:name="_Toc10743692"/>
-      <w:bookmarkStart w:id="74" w:name="_Toc10741272"/>
-      <w:bookmarkStart w:id="75" w:name="_Toc10646646"/>
-      <w:bookmarkStart w:id="76" w:name="_Toc192620805"/>
-      <w:bookmarkEnd w:id="68"/>
+      <w:bookmarkStart w:id="69" w:name="__RefHeading__3443_1681451042"/>
+      <w:bookmarkStart w:id="70" w:name="_Toc11353201"/>
+      <w:bookmarkStart w:id="71" w:name="_Toc11353127"/>
+      <w:bookmarkStart w:id="72" w:name="_Toc11253828"/>
+      <w:bookmarkStart w:id="73" w:name="_Toc11144781"/>
+      <w:bookmarkStart w:id="74" w:name="_Toc10743692"/>
+      <w:bookmarkStart w:id="75" w:name="_Toc10741272"/>
+      <w:bookmarkStart w:id="76" w:name="_Toc10646646"/>
+      <w:bookmarkStart w:id="77" w:name="_Toc216856846"/>
+      <w:bookmarkEnd w:id="69"/>
       <w:r>
         <w:lastRenderedPageBreak/>
         <w:t>Configuration</w:t>
       </w:r>
-      <w:bookmarkEnd w:id="69"/>
       <w:bookmarkEnd w:id="70"/>
       <w:bookmarkEnd w:id="71"/>
       <w:bookmarkEnd w:id="72"/>
@@ -4514,6 +4712,7 @@
       <w:bookmarkEnd w:id="74"/>
       <w:bookmarkEnd w:id="75"/>
       <w:bookmarkEnd w:id="76"/>
+      <w:bookmarkEnd w:id="77"/>
     </w:p>
     <w:p>
       <w:pPr>
@@ -4601,11 +4800,11 @@
       <w:pPr>
         <w:pStyle w:val="Heading2"/>
       </w:pPr>
-      <w:bookmarkStart w:id="77" w:name="_Toc192620806"/>
+      <w:bookmarkStart w:id="78" w:name="_Toc216856847"/>
       <w:r>
         <w:t>Preferred Magento settings</w:t>
       </w:r>
-      <w:bookmarkEnd w:id="77"/>
+      <w:bookmarkEnd w:id="78"/>
     </w:p>
     <w:p>
       <w:pPr>
@@ -4614,7 +4813,7 @@
       <w:r>
         <w:t xml:space="preserve">Make sure the store currency is set to EURO </w:t>
       </w:r>
-      <w:bookmarkStart w:id="78" w:name="__DdeLink__2047_910805161"/>
+      <w:bookmarkStart w:id="79" w:name="__DdeLink__2047_910805161"/>
       <w:r>
         <w:rPr>
           <w:i/>
@@ -4622,7 +4821,7 @@
         </w:rPr>
         <w:t>Stores &gt;&gt; Configuration &gt;&gt; General</w:t>
       </w:r>
-      <w:bookmarkEnd w:id="78"/>
+      <w:bookmarkEnd w:id="79"/>
       <w:r>
         <w:rPr>
           <w:i/>
@@ -4766,13 +4965,13 @@
       <w:pPr>
         <w:pStyle w:val="Heading2"/>
       </w:pPr>
-      <w:bookmarkStart w:id="79" w:name="_Payment_methods_page"/>
-      <w:bookmarkStart w:id="80" w:name="_Toc192620807"/>
-      <w:bookmarkEnd w:id="79"/>
+      <w:bookmarkStart w:id="80" w:name="_Payment_methods_page"/>
+      <w:bookmarkStart w:id="81" w:name="_Toc216856848"/>
+      <w:bookmarkEnd w:id="80"/>
       <w:r>
         <w:t>Payment methods page</w:t>
       </w:r>
-      <w:bookmarkEnd w:id="80"/>
+      <w:bookmarkEnd w:id="81"/>
     </w:p>
     <w:p>
       <w:pPr>
@@ -4899,11 +5098,11 @@
       <w:pPr>
         <w:pStyle w:val="Heading3"/>
       </w:pPr>
-      <w:bookmarkStart w:id="81" w:name="_Toc192620808"/>
+      <w:bookmarkStart w:id="82" w:name="_Toc216856849"/>
       <w:r>
         <w:t>Collated payment methods</w:t>
       </w:r>
-      <w:bookmarkEnd w:id="81"/>
+      <w:bookmarkEnd w:id="82"/>
     </w:p>
     <w:p>
       <w:pPr>
@@ -5043,11 +5242,11 @@
       <w:pPr>
         <w:pStyle w:val="Heading3"/>
       </w:pPr>
-      <w:bookmarkStart w:id="82" w:name="_Toc192620809"/>
+      <w:bookmarkStart w:id="83" w:name="_Toc216856850"/>
       <w:r>
         <w:t>Separate payment methods</w:t>
       </w:r>
-      <w:bookmarkEnd w:id="82"/>
+      <w:bookmarkEnd w:id="83"/>
     </w:p>
     <w:p>
       <w:pPr>
@@ -5129,11 +5328,11 @@
       <w:pPr>
         <w:pStyle w:val="Heading3"/>
       </w:pPr>
-      <w:bookmarkStart w:id="83" w:name="_Toc192620810"/>
+      <w:bookmarkStart w:id="84" w:name="_Toc216856851"/>
       <w:r>
         <w:t>Redirect to Svea’s Payment Method Selection Page</w:t>
       </w:r>
-      <w:bookmarkEnd w:id="83"/>
+      <w:bookmarkEnd w:id="84"/>
     </w:p>
     <w:p>
       <w:pPr>
@@ -5265,11 +5464,11 @@
       <w:pPr>
         <w:pStyle w:val="Heading2"/>
       </w:pPr>
-      <w:bookmarkStart w:id="84" w:name="_Toc192620811"/>
+      <w:bookmarkStart w:id="85" w:name="_Toc216856852"/>
       <w:r>
         <w:t>Svea Payments Configuration</w:t>
       </w:r>
-      <w:bookmarkEnd w:id="84"/>
+      <w:bookmarkEnd w:id="85"/>
     </w:p>
     <w:p>
       <w:pPr>
@@ -6053,11 +6252,11 @@
       <w:pPr>
         <w:pStyle w:val="Heading2"/>
       </w:pPr>
-      <w:bookmarkStart w:id="85" w:name="_Toc192620812"/>
+      <w:bookmarkStart w:id="86" w:name="_Toc216856853"/>
       <w:r>
         <w:t>Svea Part Payment Calculator</w:t>
       </w:r>
-      <w:bookmarkEnd w:id="85"/>
+      <w:bookmarkEnd w:id="86"/>
     </w:p>
     <w:p>
       <w:pPr>
@@ -6337,22 +6536,22 @@
       <w:pPr>
         <w:pStyle w:val="Heading2"/>
       </w:pPr>
-      <w:bookmarkStart w:id="86" w:name="_Toc192620813"/>
+      <w:bookmarkStart w:id="87" w:name="_Toc216856854"/>
       <w:r>
         <w:lastRenderedPageBreak/>
         <w:t>Additional features</w:t>
       </w:r>
-      <w:bookmarkEnd w:id="86"/>
+      <w:bookmarkEnd w:id="87"/>
     </w:p>
     <w:p>
       <w:pPr>
         <w:pStyle w:val="Heading3"/>
       </w:pPr>
-      <w:bookmarkStart w:id="87" w:name="_Toc192620814"/>
+      <w:bookmarkStart w:id="88" w:name="_Toc216856855"/>
       <w:r>
         <w:t>Payment Fees</w:t>
       </w:r>
-      <w:bookmarkEnd w:id="87"/>
+      <w:bookmarkEnd w:id="88"/>
     </w:p>
     <w:p>
       <w:pPr>
@@ -6406,11 +6605,11 @@
       <w:pPr>
         <w:pStyle w:val="Heading3"/>
       </w:pPr>
-      <w:bookmarkStart w:id="88" w:name="_Toc192620815"/>
+      <w:bookmarkStart w:id="89" w:name="_Toc216856856"/>
       <w:r>
         <w:t>Delayed capture</w:t>
       </w:r>
-      <w:bookmarkEnd w:id="88"/>
+      <w:bookmarkEnd w:id="89"/>
     </w:p>
     <w:p>
       <w:pPr>
@@ -6440,11 +6639,11 @@
       <w:pPr>
         <w:pStyle w:val="Heading3"/>
       </w:pPr>
-      <w:bookmarkStart w:id="89" w:name="_Toc192620816"/>
+      <w:bookmarkStart w:id="90" w:name="_Toc216856857"/>
       <w:r>
         <w:t>Automatic status query</w:t>
       </w:r>
-      <w:bookmarkEnd w:id="89"/>
+      <w:bookmarkEnd w:id="90"/>
     </w:p>
     <w:p>
       <w:pPr>
@@ -6501,12 +6700,12 @@
         <w:pStyle w:val="Heading1"/>
         <w:spacing w:before="0"/>
       </w:pPr>
-      <w:bookmarkStart w:id="90" w:name="_Toc192620817"/>
+      <w:bookmarkStart w:id="91" w:name="_Toc216856858"/>
       <w:r>
         <w:lastRenderedPageBreak/>
         <w:t>Order administration</w:t>
       </w:r>
-      <w:bookmarkEnd w:id="90"/>
+      <w:bookmarkEnd w:id="91"/>
     </w:p>
     <w:p>
       <w:pPr>
@@ -6651,12 +6850,12 @@
         <w:pStyle w:val="Heading2"/>
         <w:spacing w:before="0"/>
       </w:pPr>
-      <w:bookmarkStart w:id="91" w:name="_Toc192620818"/>
+      <w:bookmarkStart w:id="92" w:name="_Toc216856859"/>
       <w:r>
         <w:lastRenderedPageBreak/>
         <w:t>Refunding order</w:t>
       </w:r>
-      <w:bookmarkEnd w:id="91"/>
+      <w:bookmarkEnd w:id="92"/>
     </w:p>
     <w:p>
       <w:pPr>
@@ -6892,11 +7091,11 @@
       <w:pPr>
         <w:pStyle w:val="Heading1"/>
       </w:pPr>
-      <w:bookmarkStart w:id="92" w:name="_Toc192620819"/>
+      <w:bookmarkStart w:id="93" w:name="_Toc216856860"/>
       <w:r>
         <w:t>Logging</w:t>
       </w:r>
-      <w:bookmarkEnd w:id="92"/>
+      <w:bookmarkEnd w:id="93"/>
     </w:p>
     <w:p>
       <w:pPr>
@@ -6946,11 +7145,11 @@
       <w:pPr>
         <w:pStyle w:val="Heading1"/>
       </w:pPr>
-      <w:bookmarkStart w:id="93" w:name="_Toc192620820"/>
+      <w:bookmarkStart w:id="94" w:name="_Toc216856861"/>
       <w:r>
         <w:t>Resolving issues and support</w:t>
       </w:r>
-      <w:bookmarkEnd w:id="93"/>
+      <w:bookmarkEnd w:id="94"/>
     </w:p>
     <w:p>
       <w:pPr>
@@ -7023,11 +7222,11 @@
       <w:pPr>
         <w:pStyle w:val="Heading2"/>
       </w:pPr>
-      <w:bookmarkStart w:id="94" w:name="_Toc192620821"/>
+      <w:bookmarkStart w:id="95" w:name="_Toc216856862"/>
       <w:r>
         <w:t>Common problems and solutions</w:t>
       </w:r>
-      <w:bookmarkEnd w:id="94"/>
+      <w:bookmarkEnd w:id="95"/>
     </w:p>
     <w:p>
       <w:pPr>
@@ -7218,6 +7417,7 @@
               <w:b/>
               <w:sz w:val="14"/>
               <w:szCs w:val="14"/>
+              <w:lang w:val="fi-FI"/>
             </w:rPr>
           </w:pPr>
           <w:r>
@@ -7226,6 +7426,7 @@
               <w:b/>
               <w:sz w:val="14"/>
               <w:szCs w:val="14"/>
+              <w:lang w:val="fi-FI"/>
             </w:rPr>
             <w:t>Svea Payments Oy</w:t>
           </w:r>
@@ -7238,6 +7439,7 @@
               <w:rFonts w:ascii="Arial" w:hAnsi="Arial" w:cs="Arial"/>
               <w:sz w:val="12"/>
               <w:szCs w:val="12"/>
+              <w:lang w:val="fi-FI"/>
             </w:rPr>
           </w:pPr>
           <w:r>
@@ -7245,26 +7447,9 @@
               <w:rFonts w:ascii="Arial" w:hAnsi="Arial" w:cs="Arial"/>
               <w:sz w:val="12"/>
               <w:szCs w:val="12"/>
+              <w:lang w:val="fi-FI"/>
             </w:rPr>
-            <w:t>Y-</w:t>
-          </w:r>
-          <w:proofErr w:type="spellStart"/>
-          <w:r>
-            <w:rPr>
-              <w:rFonts w:ascii="Arial" w:hAnsi="Arial" w:cs="Arial"/>
-              <w:sz w:val="12"/>
-              <w:szCs w:val="12"/>
-            </w:rPr>
-            <w:t>tunnus</w:t>
-          </w:r>
-          <w:proofErr w:type="spellEnd"/>
-          <w:r>
-            <w:rPr>
-              <w:rFonts w:ascii="Arial" w:hAnsi="Arial" w:cs="Arial"/>
-              <w:sz w:val="12"/>
-              <w:szCs w:val="12"/>
-            </w:rPr>
-            <w:t xml:space="preserve">: </w:t>
+            <w:t xml:space="preserve">Y-tunnus: </w:t>
           </w:r>
           <w:r>
             <w:rPr>
@@ -7272,6 +7457,7 @@
               <w:color w:val="000000"/>
               <w:sz w:val="12"/>
               <w:szCs w:val="12"/>
+              <w:lang w:val="fi-FI"/>
             </w:rPr>
             <w:t>2121703-0</w:t>
           </w:r>
@@ -7551,6 +7737,7 @@
               <w:b/>
               <w:sz w:val="14"/>
               <w:szCs w:val="14"/>
+              <w:lang w:val="fi-FI"/>
             </w:rPr>
           </w:pPr>
           <w:r>
@@ -7559,6 +7746,7 @@
               <w:b/>
               <w:sz w:val="14"/>
               <w:szCs w:val="14"/>
+              <w:lang w:val="fi-FI"/>
             </w:rPr>
             <w:t>Svea Payments Oy</w:t>
           </w:r>
@@ -7571,6 +7759,7 @@
               <w:rFonts w:ascii="Arial" w:hAnsi="Arial" w:cs="Arial"/>
               <w:sz w:val="12"/>
               <w:szCs w:val="12"/>
+              <w:lang w:val="fi-FI"/>
             </w:rPr>
           </w:pPr>
           <w:r>
@@ -7578,26 +7767,9 @@
               <w:rFonts w:ascii="Arial" w:hAnsi="Arial" w:cs="Arial"/>
               <w:sz w:val="12"/>
               <w:szCs w:val="12"/>
+              <w:lang w:val="fi-FI"/>
             </w:rPr>
-            <w:t>Y-</w:t>
-          </w:r>
-          <w:proofErr w:type="spellStart"/>
-          <w:r>
-            <w:rPr>
-              <w:rFonts w:ascii="Arial" w:hAnsi="Arial" w:cs="Arial"/>
-              <w:sz w:val="12"/>
-              <w:szCs w:val="12"/>
-            </w:rPr>
-            <w:t>tunnus</w:t>
-          </w:r>
-          <w:proofErr w:type="spellEnd"/>
-          <w:r>
-            <w:rPr>
-              <w:rFonts w:ascii="Arial" w:hAnsi="Arial" w:cs="Arial"/>
-              <w:sz w:val="12"/>
-              <w:szCs w:val="12"/>
-            </w:rPr>
-            <w:t xml:space="preserve">: </w:t>
+            <w:t xml:space="preserve">Y-tunnus: </w:t>
           </w:r>
           <w:r>
             <w:rPr>
@@ -7605,6 +7777,7 @@
               <w:color w:val="000000"/>
               <w:sz w:val="12"/>
               <w:szCs w:val="12"/>
+              <w:lang w:val="fi-FI"/>
             </w:rPr>
             <w:t>2121703-0</w:t>
           </w:r>

</xml_diff>

<commit_message>
FACELIFT - Updated Docs/Manual for Pay Now / Pay Later Split Payment Methods
</commit_message>
<xml_diff>
--- a/docs/Manual - Payment Module for Adobe Commerce (Magento) - Svea Payments Finland.docx
+++ b/docs/Manual - Payment Module for Adobe Commerce (Magento) - Svea Payments Finland.docx
@@ -329,7 +329,7 @@
           <w:iCs/>
           <w:szCs w:val="22"/>
         </w:rPr>
-        <w:t>3</w:t>
+        <w:t>4</w:t>
       </w:r>
       <w:r>
         <w:br w:type="page"/>
@@ -378,7 +378,7 @@
               <w:rFonts w:asciiTheme="minorHAnsi" w:eastAsiaTheme="minorEastAsia" w:hAnsiTheme="minorHAnsi" w:cstheme="minorBidi"/>
               <w:noProof/>
               <w:szCs w:val="24"/>
-              <w:lang w:val="en-FI" w:eastAsia="en-FI" w:bidi="ar-SA"/>
+              <w:lang w:val="fi-FI" w:eastAsia="fi-FI" w:bidi="ar-SA"/>
               <w14:ligatures w14:val="standardContextual"/>
             </w:rPr>
           </w:pPr>
@@ -399,7 +399,7 @@
             </w:rPr>
             <w:fldChar w:fldCharType="separate"/>
           </w:r>
-          <w:hyperlink w:anchor="_Toc216856835" w:history="1">
+          <w:hyperlink w:anchor="_Toc227579903" w:history="1">
             <w:r>
               <w:rPr>
                 <w:rStyle w:val="Hyperlink"/>
@@ -412,7 +412,7 @@
                 <w:rFonts w:asciiTheme="minorHAnsi" w:eastAsiaTheme="minorEastAsia" w:hAnsiTheme="minorHAnsi" w:cstheme="minorBidi"/>
                 <w:noProof/>
                 <w:szCs w:val="24"/>
-                <w:lang w:val="en-FI" w:eastAsia="en-FI" w:bidi="ar-SA"/>
+                <w:lang w:val="fi-FI" w:eastAsia="fi-FI" w:bidi="ar-SA"/>
                 <w14:ligatures w14:val="standardContextual"/>
               </w:rPr>
               <w:tab/>
@@ -440,7 +440,7 @@
               <w:rPr>
                 <w:noProof/>
               </w:rPr>
-              <w:instrText xml:space="preserve"> PAGEREF _Toc216856835 \h </w:instrText>
+              <w:instrText xml:space="preserve"> PAGEREF _Toc227579903 \h </w:instrText>
             </w:r>
             <w:r>
               <w:rPr>
@@ -478,11 +478,11 @@
               <w:rFonts w:asciiTheme="minorHAnsi" w:eastAsiaTheme="minorEastAsia" w:hAnsiTheme="minorHAnsi" w:cstheme="minorBidi"/>
               <w:noProof/>
               <w:szCs w:val="24"/>
-              <w:lang w:val="en-FI" w:eastAsia="en-FI" w:bidi="ar-SA"/>
+              <w:lang w:val="fi-FI" w:eastAsia="fi-FI" w:bidi="ar-SA"/>
               <w14:ligatures w14:val="standardContextual"/>
             </w:rPr>
           </w:pPr>
-          <w:hyperlink w:anchor="_Toc216856836" w:history="1">
+          <w:hyperlink w:anchor="_Toc227579904" w:history="1">
             <w:r>
               <w:rPr>
                 <w:rStyle w:val="Hyperlink"/>
@@ -495,7 +495,7 @@
                 <w:rFonts w:asciiTheme="minorHAnsi" w:eastAsiaTheme="minorEastAsia" w:hAnsiTheme="minorHAnsi" w:cstheme="minorBidi"/>
                 <w:noProof/>
                 <w:szCs w:val="24"/>
-                <w:lang w:val="en-FI" w:eastAsia="en-FI" w:bidi="ar-SA"/>
+                <w:lang w:val="fi-FI" w:eastAsia="fi-FI" w:bidi="ar-SA"/>
                 <w14:ligatures w14:val="standardContextual"/>
               </w:rPr>
               <w:tab/>
@@ -523,7 +523,7 @@
               <w:rPr>
                 <w:noProof/>
               </w:rPr>
-              <w:instrText xml:space="preserve"> PAGEREF _Toc216856836 \h </w:instrText>
+              <w:instrText xml:space="preserve"> PAGEREF _Toc227579904 \h </w:instrText>
             </w:r>
             <w:r>
               <w:rPr>
@@ -561,11 +561,11 @@
               <w:rFonts w:asciiTheme="minorHAnsi" w:eastAsiaTheme="minorEastAsia" w:hAnsiTheme="minorHAnsi" w:cstheme="minorBidi"/>
               <w:noProof/>
               <w:szCs w:val="24"/>
-              <w:lang w:val="en-FI" w:eastAsia="en-FI" w:bidi="ar-SA"/>
+              <w:lang w:val="fi-FI" w:eastAsia="fi-FI" w:bidi="ar-SA"/>
               <w14:ligatures w14:val="standardContextual"/>
             </w:rPr>
           </w:pPr>
-          <w:hyperlink w:anchor="_Toc216856837" w:history="1">
+          <w:hyperlink w:anchor="_Toc227579905" w:history="1">
             <w:r>
               <w:rPr>
                 <w:rStyle w:val="Hyperlink"/>
@@ -578,7 +578,7 @@
                 <w:rFonts w:asciiTheme="minorHAnsi" w:eastAsiaTheme="minorEastAsia" w:hAnsiTheme="minorHAnsi" w:cstheme="minorBidi"/>
                 <w:noProof/>
                 <w:szCs w:val="24"/>
-                <w:lang w:val="en-FI" w:eastAsia="en-FI" w:bidi="ar-SA"/>
+                <w:lang w:val="fi-FI" w:eastAsia="fi-FI" w:bidi="ar-SA"/>
                 <w14:ligatures w14:val="standardContextual"/>
               </w:rPr>
               <w:tab/>
@@ -606,7 +606,7 @@
               <w:rPr>
                 <w:noProof/>
               </w:rPr>
-              <w:instrText xml:space="preserve"> PAGEREF _Toc216856837 \h </w:instrText>
+              <w:instrText xml:space="preserve"> PAGEREF _Toc227579905 \h </w:instrText>
             </w:r>
             <w:r>
               <w:rPr>
@@ -644,11 +644,11 @@
               <w:rFonts w:asciiTheme="minorHAnsi" w:eastAsiaTheme="minorEastAsia" w:hAnsiTheme="minorHAnsi" w:cstheme="minorBidi"/>
               <w:noProof/>
               <w:szCs w:val="24"/>
-              <w:lang w:val="en-FI" w:eastAsia="en-FI" w:bidi="ar-SA"/>
+              <w:lang w:val="fi-FI" w:eastAsia="fi-FI" w:bidi="ar-SA"/>
               <w14:ligatures w14:val="standardContextual"/>
             </w:rPr>
           </w:pPr>
-          <w:hyperlink w:anchor="_Toc216856838" w:history="1">
+          <w:hyperlink w:anchor="_Toc227579906" w:history="1">
             <w:r>
               <w:rPr>
                 <w:rStyle w:val="Hyperlink"/>
@@ -661,7 +661,7 @@
                 <w:rFonts w:asciiTheme="minorHAnsi" w:eastAsiaTheme="minorEastAsia" w:hAnsiTheme="minorHAnsi" w:cstheme="minorBidi"/>
                 <w:noProof/>
                 <w:szCs w:val="24"/>
-                <w:lang w:val="en-FI" w:eastAsia="en-FI" w:bidi="ar-SA"/>
+                <w:lang w:val="fi-FI" w:eastAsia="fi-FI" w:bidi="ar-SA"/>
                 <w14:ligatures w14:val="standardContextual"/>
               </w:rPr>
               <w:tab/>
@@ -689,7 +689,7 @@
               <w:rPr>
                 <w:noProof/>
               </w:rPr>
-              <w:instrText xml:space="preserve"> PAGEREF _Toc216856838 \h </w:instrText>
+              <w:instrText xml:space="preserve"> PAGEREF _Toc227579906 \h </w:instrText>
             </w:r>
             <w:r>
               <w:rPr>
@@ -727,11 +727,11 @@
               <w:rFonts w:asciiTheme="minorHAnsi" w:eastAsiaTheme="minorEastAsia" w:hAnsiTheme="minorHAnsi" w:cstheme="minorBidi"/>
               <w:noProof/>
               <w:szCs w:val="24"/>
-              <w:lang w:val="en-FI" w:eastAsia="en-FI" w:bidi="ar-SA"/>
+              <w:lang w:val="fi-FI" w:eastAsia="fi-FI" w:bidi="ar-SA"/>
               <w14:ligatures w14:val="standardContextual"/>
             </w:rPr>
           </w:pPr>
-          <w:hyperlink w:anchor="_Toc216856839" w:history="1">
+          <w:hyperlink w:anchor="_Toc227579907" w:history="1">
             <w:r>
               <w:rPr>
                 <w:rStyle w:val="Hyperlink"/>
@@ -744,7 +744,7 @@
                 <w:rFonts w:asciiTheme="minorHAnsi" w:eastAsiaTheme="minorEastAsia" w:hAnsiTheme="minorHAnsi" w:cstheme="minorBidi"/>
                 <w:noProof/>
                 <w:szCs w:val="24"/>
-                <w:lang w:val="en-FI" w:eastAsia="en-FI" w:bidi="ar-SA"/>
+                <w:lang w:val="fi-FI" w:eastAsia="fi-FI" w:bidi="ar-SA"/>
                 <w14:ligatures w14:val="standardContextual"/>
               </w:rPr>
               <w:tab/>
@@ -772,7 +772,7 @@
               <w:rPr>
                 <w:noProof/>
               </w:rPr>
-              <w:instrText xml:space="preserve"> PAGEREF _Toc216856839 \h </w:instrText>
+              <w:instrText xml:space="preserve"> PAGEREF _Toc227579907 \h </w:instrText>
             </w:r>
             <w:r>
               <w:rPr>
@@ -810,11 +810,11 @@
               <w:rFonts w:asciiTheme="minorHAnsi" w:eastAsiaTheme="minorEastAsia" w:hAnsiTheme="minorHAnsi" w:cstheme="minorBidi"/>
               <w:noProof/>
               <w:szCs w:val="24"/>
-              <w:lang w:val="en-FI" w:eastAsia="en-FI" w:bidi="ar-SA"/>
+              <w:lang w:val="fi-FI" w:eastAsia="fi-FI" w:bidi="ar-SA"/>
               <w14:ligatures w14:val="standardContextual"/>
             </w:rPr>
           </w:pPr>
-          <w:hyperlink w:anchor="_Toc216856840" w:history="1">
+          <w:hyperlink w:anchor="_Toc227579908" w:history="1">
             <w:r>
               <w:rPr>
                 <w:rStyle w:val="Hyperlink"/>
@@ -827,7 +827,7 @@
                 <w:rFonts w:asciiTheme="minorHAnsi" w:eastAsiaTheme="minorEastAsia" w:hAnsiTheme="minorHAnsi" w:cstheme="minorBidi"/>
                 <w:noProof/>
                 <w:szCs w:val="24"/>
-                <w:lang w:val="en-FI" w:eastAsia="en-FI" w:bidi="ar-SA"/>
+                <w:lang w:val="fi-FI" w:eastAsia="fi-FI" w:bidi="ar-SA"/>
                 <w14:ligatures w14:val="standardContextual"/>
               </w:rPr>
               <w:tab/>
@@ -855,7 +855,7 @@
               <w:rPr>
                 <w:noProof/>
               </w:rPr>
-              <w:instrText xml:space="preserve"> PAGEREF _Toc216856840 \h </w:instrText>
+              <w:instrText xml:space="preserve"> PAGEREF _Toc227579908 \h </w:instrText>
             </w:r>
             <w:r>
               <w:rPr>
@@ -893,11 +893,11 @@
               <w:rFonts w:asciiTheme="minorHAnsi" w:eastAsiaTheme="minorEastAsia" w:hAnsiTheme="minorHAnsi" w:cstheme="minorBidi"/>
               <w:noProof/>
               <w:szCs w:val="24"/>
-              <w:lang w:val="en-FI" w:eastAsia="en-FI" w:bidi="ar-SA"/>
+              <w:lang w:val="fi-FI" w:eastAsia="fi-FI" w:bidi="ar-SA"/>
               <w14:ligatures w14:val="standardContextual"/>
             </w:rPr>
           </w:pPr>
-          <w:hyperlink w:anchor="_Toc216856841" w:history="1">
+          <w:hyperlink w:anchor="_Toc227579909" w:history="1">
             <w:r>
               <w:rPr>
                 <w:rStyle w:val="Hyperlink"/>
@@ -910,7 +910,7 @@
                 <w:rFonts w:asciiTheme="minorHAnsi" w:eastAsiaTheme="minorEastAsia" w:hAnsiTheme="minorHAnsi" w:cstheme="minorBidi"/>
                 <w:noProof/>
                 <w:szCs w:val="24"/>
-                <w:lang w:val="en-FI" w:eastAsia="en-FI" w:bidi="ar-SA"/>
+                <w:lang w:val="fi-FI" w:eastAsia="fi-FI" w:bidi="ar-SA"/>
                 <w14:ligatures w14:val="standardContextual"/>
               </w:rPr>
               <w:tab/>
@@ -938,7 +938,7 @@
               <w:rPr>
                 <w:noProof/>
               </w:rPr>
-              <w:instrText xml:space="preserve"> PAGEREF _Toc216856841 \h </w:instrText>
+              <w:instrText xml:space="preserve"> PAGEREF _Toc227579909 \h </w:instrText>
             </w:r>
             <w:r>
               <w:rPr>
@@ -976,11 +976,11 @@
               <w:rFonts w:asciiTheme="minorHAnsi" w:eastAsiaTheme="minorEastAsia" w:hAnsiTheme="minorHAnsi" w:cstheme="minorBidi"/>
               <w:noProof/>
               <w:szCs w:val="24"/>
-              <w:lang w:val="en-FI" w:eastAsia="en-FI" w:bidi="ar-SA"/>
+              <w:lang w:val="fi-FI" w:eastAsia="fi-FI" w:bidi="ar-SA"/>
               <w14:ligatures w14:val="standardContextual"/>
             </w:rPr>
           </w:pPr>
-          <w:hyperlink w:anchor="_Toc216856842" w:history="1">
+          <w:hyperlink w:anchor="_Toc227579910" w:history="1">
             <w:r>
               <w:rPr>
                 <w:rStyle w:val="Hyperlink"/>
@@ -993,7 +993,7 @@
                 <w:rFonts w:asciiTheme="minorHAnsi" w:eastAsiaTheme="minorEastAsia" w:hAnsiTheme="minorHAnsi" w:cstheme="minorBidi"/>
                 <w:noProof/>
                 <w:szCs w:val="24"/>
-                <w:lang w:val="en-FI" w:eastAsia="en-FI" w:bidi="ar-SA"/>
+                <w:lang w:val="fi-FI" w:eastAsia="fi-FI" w:bidi="ar-SA"/>
                 <w14:ligatures w14:val="standardContextual"/>
               </w:rPr>
               <w:tab/>
@@ -1021,7 +1021,7 @@
               <w:rPr>
                 <w:noProof/>
               </w:rPr>
-              <w:instrText xml:space="preserve"> PAGEREF _Toc216856842 \h </w:instrText>
+              <w:instrText xml:space="preserve"> PAGEREF _Toc227579910 \h </w:instrText>
             </w:r>
             <w:r>
               <w:rPr>
@@ -1059,11 +1059,11 @@
               <w:rFonts w:asciiTheme="minorHAnsi" w:eastAsiaTheme="minorEastAsia" w:hAnsiTheme="minorHAnsi" w:cstheme="minorBidi"/>
               <w:noProof/>
               <w:szCs w:val="24"/>
-              <w:lang w:val="en-FI" w:eastAsia="en-FI" w:bidi="ar-SA"/>
+              <w:lang w:val="fi-FI" w:eastAsia="fi-FI" w:bidi="ar-SA"/>
               <w14:ligatures w14:val="standardContextual"/>
             </w:rPr>
           </w:pPr>
-          <w:hyperlink w:anchor="_Toc216856843" w:history="1">
+          <w:hyperlink w:anchor="_Toc227579911" w:history="1">
             <w:r>
               <w:rPr>
                 <w:rStyle w:val="Hyperlink"/>
@@ -1076,7 +1076,7 @@
                 <w:rFonts w:asciiTheme="minorHAnsi" w:eastAsiaTheme="minorEastAsia" w:hAnsiTheme="minorHAnsi" w:cstheme="minorBidi"/>
                 <w:noProof/>
                 <w:szCs w:val="24"/>
-                <w:lang w:val="en-FI" w:eastAsia="en-FI" w:bidi="ar-SA"/>
+                <w:lang w:val="fi-FI" w:eastAsia="fi-FI" w:bidi="ar-SA"/>
                 <w14:ligatures w14:val="standardContextual"/>
               </w:rPr>
               <w:tab/>
@@ -1104,7 +1104,7 @@
               <w:rPr>
                 <w:noProof/>
               </w:rPr>
-              <w:instrText xml:space="preserve"> PAGEREF _Toc216856843 \h </w:instrText>
+              <w:instrText xml:space="preserve"> PAGEREF _Toc227579911 \h </w:instrText>
             </w:r>
             <w:r>
               <w:rPr>
@@ -1142,11 +1142,11 @@
               <w:rFonts w:asciiTheme="minorHAnsi" w:eastAsiaTheme="minorEastAsia" w:hAnsiTheme="minorHAnsi" w:cstheme="minorBidi"/>
               <w:noProof/>
               <w:szCs w:val="24"/>
-              <w:lang w:val="en-FI" w:eastAsia="en-FI" w:bidi="ar-SA"/>
+              <w:lang w:val="fi-FI" w:eastAsia="fi-FI" w:bidi="ar-SA"/>
               <w14:ligatures w14:val="standardContextual"/>
             </w:rPr>
           </w:pPr>
-          <w:hyperlink w:anchor="_Toc216856844" w:history="1">
+          <w:hyperlink w:anchor="_Toc227579912" w:history="1">
             <w:r>
               <w:rPr>
                 <w:rStyle w:val="Hyperlink"/>
@@ -1159,7 +1159,7 @@
                 <w:rFonts w:asciiTheme="minorHAnsi" w:eastAsiaTheme="minorEastAsia" w:hAnsiTheme="minorHAnsi" w:cstheme="minorBidi"/>
                 <w:noProof/>
                 <w:szCs w:val="24"/>
-                <w:lang w:val="en-FI" w:eastAsia="en-FI" w:bidi="ar-SA"/>
+                <w:lang w:val="fi-FI" w:eastAsia="fi-FI" w:bidi="ar-SA"/>
                 <w14:ligatures w14:val="standardContextual"/>
               </w:rPr>
               <w:tab/>
@@ -1187,7 +1187,7 @@
               <w:rPr>
                 <w:noProof/>
               </w:rPr>
-              <w:instrText xml:space="preserve"> PAGEREF _Toc216856844 \h </w:instrText>
+              <w:instrText xml:space="preserve"> PAGEREF _Toc227579912 \h </w:instrText>
             </w:r>
             <w:r>
               <w:rPr>
@@ -1225,11 +1225,11 @@
               <w:rFonts w:asciiTheme="minorHAnsi" w:eastAsiaTheme="minorEastAsia" w:hAnsiTheme="minorHAnsi" w:cstheme="minorBidi"/>
               <w:noProof/>
               <w:szCs w:val="24"/>
-              <w:lang w:val="en-FI" w:eastAsia="en-FI" w:bidi="ar-SA"/>
+              <w:lang w:val="fi-FI" w:eastAsia="fi-FI" w:bidi="ar-SA"/>
               <w14:ligatures w14:val="standardContextual"/>
             </w:rPr>
           </w:pPr>
-          <w:hyperlink w:anchor="_Toc216856845" w:history="1">
+          <w:hyperlink w:anchor="_Toc227579913" w:history="1">
             <w:r>
               <w:rPr>
                 <w:rStyle w:val="Hyperlink"/>
@@ -1243,7 +1243,7 @@
                 <w:rFonts w:asciiTheme="minorHAnsi" w:eastAsiaTheme="minorEastAsia" w:hAnsiTheme="minorHAnsi" w:cstheme="minorBidi"/>
                 <w:noProof/>
                 <w:szCs w:val="24"/>
-                <w:lang w:val="en-FI" w:eastAsia="en-FI" w:bidi="ar-SA"/>
+                <w:lang w:val="fi-FI" w:eastAsia="fi-FI" w:bidi="ar-SA"/>
                 <w14:ligatures w14:val="standardContextual"/>
               </w:rPr>
               <w:tab/>
@@ -1272,7 +1272,7 @@
               <w:rPr>
                 <w:noProof/>
               </w:rPr>
-              <w:instrText xml:space="preserve"> PAGEREF _Toc216856845 \h </w:instrText>
+              <w:instrText xml:space="preserve"> PAGEREF _Toc227579913 \h </w:instrText>
             </w:r>
             <w:r>
               <w:rPr>
@@ -1310,11 +1310,11 @@
               <w:rFonts w:asciiTheme="minorHAnsi" w:eastAsiaTheme="minorEastAsia" w:hAnsiTheme="minorHAnsi" w:cstheme="minorBidi"/>
               <w:noProof/>
               <w:szCs w:val="24"/>
-              <w:lang w:val="en-FI" w:eastAsia="en-FI" w:bidi="ar-SA"/>
+              <w:lang w:val="fi-FI" w:eastAsia="fi-FI" w:bidi="ar-SA"/>
               <w14:ligatures w14:val="standardContextual"/>
             </w:rPr>
           </w:pPr>
-          <w:hyperlink w:anchor="_Toc216856846" w:history="1">
+          <w:hyperlink w:anchor="_Toc227579914" w:history="1">
             <w:r>
               <w:rPr>
                 <w:rStyle w:val="Hyperlink"/>
@@ -1327,7 +1327,7 @@
                 <w:rFonts w:asciiTheme="minorHAnsi" w:eastAsiaTheme="minorEastAsia" w:hAnsiTheme="minorHAnsi" w:cstheme="minorBidi"/>
                 <w:noProof/>
                 <w:szCs w:val="24"/>
-                <w:lang w:val="en-FI" w:eastAsia="en-FI" w:bidi="ar-SA"/>
+                <w:lang w:val="fi-FI" w:eastAsia="fi-FI" w:bidi="ar-SA"/>
                 <w14:ligatures w14:val="standardContextual"/>
               </w:rPr>
               <w:tab/>
@@ -1355,7 +1355,7 @@
               <w:rPr>
                 <w:noProof/>
               </w:rPr>
-              <w:instrText xml:space="preserve"> PAGEREF _Toc216856846 \h </w:instrText>
+              <w:instrText xml:space="preserve"> PAGEREF _Toc227579914 \h </w:instrText>
             </w:r>
             <w:r>
               <w:rPr>
@@ -1393,11 +1393,11 @@
               <w:rFonts w:asciiTheme="minorHAnsi" w:eastAsiaTheme="minorEastAsia" w:hAnsiTheme="minorHAnsi" w:cstheme="minorBidi"/>
               <w:noProof/>
               <w:szCs w:val="24"/>
-              <w:lang w:val="en-FI" w:eastAsia="en-FI" w:bidi="ar-SA"/>
+              <w:lang w:val="fi-FI" w:eastAsia="fi-FI" w:bidi="ar-SA"/>
               <w14:ligatures w14:val="standardContextual"/>
             </w:rPr>
           </w:pPr>
-          <w:hyperlink w:anchor="_Toc216856847" w:history="1">
+          <w:hyperlink w:anchor="_Toc227579915" w:history="1">
             <w:r>
               <w:rPr>
                 <w:rStyle w:val="Hyperlink"/>
@@ -1410,7 +1410,7 @@
                 <w:rFonts w:asciiTheme="minorHAnsi" w:eastAsiaTheme="minorEastAsia" w:hAnsiTheme="minorHAnsi" w:cstheme="minorBidi"/>
                 <w:noProof/>
                 <w:szCs w:val="24"/>
-                <w:lang w:val="en-FI" w:eastAsia="en-FI" w:bidi="ar-SA"/>
+                <w:lang w:val="fi-FI" w:eastAsia="fi-FI" w:bidi="ar-SA"/>
                 <w14:ligatures w14:val="standardContextual"/>
               </w:rPr>
               <w:tab/>
@@ -1438,7 +1438,7 @@
               <w:rPr>
                 <w:noProof/>
               </w:rPr>
-              <w:instrText xml:space="preserve"> PAGEREF _Toc216856847 \h </w:instrText>
+              <w:instrText xml:space="preserve"> PAGEREF _Toc227579915 \h </w:instrText>
             </w:r>
             <w:r>
               <w:rPr>
@@ -1476,11 +1476,11 @@
               <w:rFonts w:asciiTheme="minorHAnsi" w:eastAsiaTheme="minorEastAsia" w:hAnsiTheme="minorHAnsi" w:cstheme="minorBidi"/>
               <w:noProof/>
               <w:szCs w:val="24"/>
-              <w:lang w:val="en-FI" w:eastAsia="en-FI" w:bidi="ar-SA"/>
+              <w:lang w:val="fi-FI" w:eastAsia="fi-FI" w:bidi="ar-SA"/>
               <w14:ligatures w14:val="standardContextual"/>
             </w:rPr>
           </w:pPr>
-          <w:hyperlink w:anchor="_Toc216856848" w:history="1">
+          <w:hyperlink w:anchor="_Toc227579916" w:history="1">
             <w:r>
               <w:rPr>
                 <w:rStyle w:val="Hyperlink"/>
@@ -1493,7 +1493,7 @@
                 <w:rFonts w:asciiTheme="minorHAnsi" w:eastAsiaTheme="minorEastAsia" w:hAnsiTheme="minorHAnsi" w:cstheme="minorBidi"/>
                 <w:noProof/>
                 <w:szCs w:val="24"/>
-                <w:lang w:val="en-FI" w:eastAsia="en-FI" w:bidi="ar-SA"/>
+                <w:lang w:val="fi-FI" w:eastAsia="fi-FI" w:bidi="ar-SA"/>
                 <w14:ligatures w14:val="standardContextual"/>
               </w:rPr>
               <w:tab/>
@@ -1521,7 +1521,7 @@
               <w:rPr>
                 <w:noProof/>
               </w:rPr>
-              <w:instrText xml:space="preserve"> PAGEREF _Toc216856848 \h </w:instrText>
+              <w:instrText xml:space="preserve"> PAGEREF _Toc227579916 \h </w:instrText>
             </w:r>
             <w:r>
               <w:rPr>
@@ -1559,11 +1559,11 @@
               <w:rFonts w:asciiTheme="minorHAnsi" w:eastAsiaTheme="minorEastAsia" w:hAnsiTheme="minorHAnsi" w:cstheme="minorBidi"/>
               <w:noProof/>
               <w:szCs w:val="24"/>
-              <w:lang w:val="en-FI" w:eastAsia="en-FI" w:bidi="ar-SA"/>
+              <w:lang w:val="fi-FI" w:eastAsia="fi-FI" w:bidi="ar-SA"/>
               <w14:ligatures w14:val="standardContextual"/>
             </w:rPr>
           </w:pPr>
-          <w:hyperlink w:anchor="_Toc216856849" w:history="1">
+          <w:hyperlink w:anchor="_Toc227579917" w:history="1">
             <w:r>
               <w:rPr>
                 <w:rStyle w:val="Hyperlink"/>
@@ -1576,7 +1576,7 @@
                 <w:rFonts w:asciiTheme="minorHAnsi" w:eastAsiaTheme="minorEastAsia" w:hAnsiTheme="minorHAnsi" w:cstheme="minorBidi"/>
                 <w:noProof/>
                 <w:szCs w:val="24"/>
-                <w:lang w:val="en-FI" w:eastAsia="en-FI" w:bidi="ar-SA"/>
+                <w:lang w:val="fi-FI" w:eastAsia="fi-FI" w:bidi="ar-SA"/>
                 <w14:ligatures w14:val="standardContextual"/>
               </w:rPr>
               <w:tab/>
@@ -1586,7 +1586,7 @@
                 <w:rStyle w:val="Hyperlink"/>
                 <w:noProof/>
               </w:rPr>
-              <w:t>Collated payment methods</w:t>
+              <w:t>Pay Now / Pay Later Split Payment Methods</w:t>
             </w:r>
             <w:r>
               <w:rPr>
@@ -1604,7 +1604,7 @@
               <w:rPr>
                 <w:noProof/>
               </w:rPr>
-              <w:instrText xml:space="preserve"> PAGEREF _Toc216856849 \h </w:instrText>
+              <w:instrText xml:space="preserve"> PAGEREF _Toc227579917 \h </w:instrText>
             </w:r>
             <w:r>
               <w:rPr>
@@ -1642,11 +1642,11 @@
               <w:rFonts w:asciiTheme="minorHAnsi" w:eastAsiaTheme="minorEastAsia" w:hAnsiTheme="minorHAnsi" w:cstheme="minorBidi"/>
               <w:noProof/>
               <w:szCs w:val="24"/>
-              <w:lang w:val="en-FI" w:eastAsia="en-FI" w:bidi="ar-SA"/>
+              <w:lang w:val="fi-FI" w:eastAsia="fi-FI" w:bidi="ar-SA"/>
               <w14:ligatures w14:val="standardContextual"/>
             </w:rPr>
           </w:pPr>
-          <w:hyperlink w:anchor="_Toc216856850" w:history="1">
+          <w:hyperlink w:anchor="_Toc227579918" w:history="1">
             <w:r>
               <w:rPr>
                 <w:rStyle w:val="Hyperlink"/>
@@ -1659,7 +1659,7 @@
                 <w:rFonts w:asciiTheme="minorHAnsi" w:eastAsiaTheme="minorEastAsia" w:hAnsiTheme="minorHAnsi" w:cstheme="minorBidi"/>
                 <w:noProof/>
                 <w:szCs w:val="24"/>
-                <w:lang w:val="en-FI" w:eastAsia="en-FI" w:bidi="ar-SA"/>
+                <w:lang w:val="fi-FI" w:eastAsia="fi-FI" w:bidi="ar-SA"/>
                 <w14:ligatures w14:val="standardContextual"/>
               </w:rPr>
               <w:tab/>
@@ -1669,7 +1669,7 @@
                 <w:rStyle w:val="Hyperlink"/>
                 <w:noProof/>
               </w:rPr>
-              <w:t>Separate payment methods</w:t>
+              <w:t>Collated Payment Methods</w:t>
             </w:r>
             <w:r>
               <w:rPr>
@@ -1687,7 +1687,7 @@
               <w:rPr>
                 <w:noProof/>
               </w:rPr>
-              <w:instrText xml:space="preserve"> PAGEREF _Toc216856850 \h </w:instrText>
+              <w:instrText xml:space="preserve"> PAGEREF _Toc227579918 \h </w:instrText>
             </w:r>
             <w:r>
               <w:rPr>
@@ -1704,7 +1704,7 @@
               <w:rPr>
                 <w:noProof/>
               </w:rPr>
-              <w:t>8</w:t>
+              <w:t>9</w:t>
             </w:r>
             <w:r>
               <w:rPr>
@@ -1725,11 +1725,11 @@
               <w:rFonts w:asciiTheme="minorHAnsi" w:eastAsiaTheme="minorEastAsia" w:hAnsiTheme="minorHAnsi" w:cstheme="minorBidi"/>
               <w:noProof/>
               <w:szCs w:val="24"/>
-              <w:lang w:val="en-FI" w:eastAsia="en-FI" w:bidi="ar-SA"/>
+              <w:lang w:val="fi-FI" w:eastAsia="fi-FI" w:bidi="ar-SA"/>
               <w14:ligatures w14:val="standardContextual"/>
             </w:rPr>
           </w:pPr>
-          <w:hyperlink w:anchor="_Toc216856851" w:history="1">
+          <w:hyperlink w:anchor="_Toc227579919" w:history="1">
             <w:r>
               <w:rPr>
                 <w:rStyle w:val="Hyperlink"/>
@@ -1742,7 +1742,7 @@
                 <w:rFonts w:asciiTheme="minorHAnsi" w:eastAsiaTheme="minorEastAsia" w:hAnsiTheme="minorHAnsi" w:cstheme="minorBidi"/>
                 <w:noProof/>
                 <w:szCs w:val="24"/>
-                <w:lang w:val="en-FI" w:eastAsia="en-FI" w:bidi="ar-SA"/>
+                <w:lang w:val="fi-FI" w:eastAsia="fi-FI" w:bidi="ar-SA"/>
                 <w14:ligatures w14:val="standardContextual"/>
               </w:rPr>
               <w:tab/>
@@ -1752,6 +1752,89 @@
                 <w:rStyle w:val="Hyperlink"/>
                 <w:noProof/>
               </w:rPr>
+              <w:t>Separate payment methods</w:t>
+            </w:r>
+            <w:r>
+              <w:rPr>
+                <w:noProof/>
+              </w:rPr>
+              <w:tab/>
+            </w:r>
+            <w:r>
+              <w:rPr>
+                <w:noProof/>
+              </w:rPr>
+              <w:fldChar w:fldCharType="begin"/>
+            </w:r>
+            <w:r>
+              <w:rPr>
+                <w:noProof/>
+              </w:rPr>
+              <w:instrText xml:space="preserve"> PAGEREF _Toc227579919 \h </w:instrText>
+            </w:r>
+            <w:r>
+              <w:rPr>
+                <w:noProof/>
+              </w:rPr>
+            </w:r>
+            <w:r>
+              <w:rPr>
+                <w:noProof/>
+              </w:rPr>
+              <w:fldChar w:fldCharType="separate"/>
+            </w:r>
+            <w:r>
+              <w:rPr>
+                <w:noProof/>
+              </w:rPr>
+              <w:t>10</w:t>
+            </w:r>
+            <w:r>
+              <w:rPr>
+                <w:noProof/>
+              </w:rPr>
+              <w:fldChar w:fldCharType="end"/>
+            </w:r>
+          </w:hyperlink>
+        </w:p>
+        <w:p>
+          <w:pPr>
+            <w:pStyle w:val="TOC3"/>
+            <w:tabs>
+              <w:tab w:val="left" w:pos="1200"/>
+              <w:tab w:val="right" w:leader="dot" w:pos="9736"/>
+            </w:tabs>
+            <w:rPr>
+              <w:rFonts w:asciiTheme="minorHAnsi" w:eastAsiaTheme="minorEastAsia" w:hAnsiTheme="minorHAnsi" w:cstheme="minorBidi"/>
+              <w:noProof/>
+              <w:szCs w:val="24"/>
+              <w:lang w:val="fi-FI" w:eastAsia="fi-FI" w:bidi="ar-SA"/>
+              <w14:ligatures w14:val="standardContextual"/>
+            </w:rPr>
+          </w:pPr>
+          <w:hyperlink w:anchor="_Toc227579920" w:history="1">
+            <w:r>
+              <w:rPr>
+                <w:rStyle w:val="Hyperlink"/>
+                <w:noProof/>
+              </w:rPr>
+              <w:t>5.2.4</w:t>
+            </w:r>
+            <w:r>
+              <w:rPr>
+                <w:rFonts w:asciiTheme="minorHAnsi" w:eastAsiaTheme="minorEastAsia" w:hAnsiTheme="minorHAnsi" w:cstheme="minorBidi"/>
+                <w:noProof/>
+                <w:szCs w:val="24"/>
+                <w:lang w:val="fi-FI" w:eastAsia="fi-FI" w:bidi="ar-SA"/>
+                <w14:ligatures w14:val="standardContextual"/>
+              </w:rPr>
+              <w:tab/>
+            </w:r>
+            <w:r>
+              <w:rPr>
+                <w:rStyle w:val="Hyperlink"/>
+                <w:noProof/>
+              </w:rPr>
               <w:t>Redirect to Svea’s Payment Method Selection Page</w:t>
             </w:r>
             <w:r>
@@ -1770,7 +1853,7 @@
               <w:rPr>
                 <w:noProof/>
               </w:rPr>
-              <w:instrText xml:space="preserve"> PAGEREF _Toc216856851 \h </w:instrText>
+              <w:instrText xml:space="preserve"> PAGEREF _Toc227579920 \h </w:instrText>
             </w:r>
             <w:r>
               <w:rPr>
@@ -1787,7 +1870,7 @@
               <w:rPr>
                 <w:noProof/>
               </w:rPr>
-              <w:t>9</w:t>
+              <w:t>11</w:t>
             </w:r>
             <w:r>
               <w:rPr>
@@ -1808,11 +1891,11 @@
               <w:rFonts w:asciiTheme="minorHAnsi" w:eastAsiaTheme="minorEastAsia" w:hAnsiTheme="minorHAnsi" w:cstheme="minorBidi"/>
               <w:noProof/>
               <w:szCs w:val="24"/>
-              <w:lang w:val="en-FI" w:eastAsia="en-FI" w:bidi="ar-SA"/>
+              <w:lang w:val="fi-FI" w:eastAsia="fi-FI" w:bidi="ar-SA"/>
               <w14:ligatures w14:val="standardContextual"/>
             </w:rPr>
           </w:pPr>
-          <w:hyperlink w:anchor="_Toc216856852" w:history="1">
+          <w:hyperlink w:anchor="_Toc227579921" w:history="1">
             <w:r>
               <w:rPr>
                 <w:rStyle w:val="Hyperlink"/>
@@ -1825,7 +1908,7 @@
                 <w:rFonts w:asciiTheme="minorHAnsi" w:eastAsiaTheme="minorEastAsia" w:hAnsiTheme="minorHAnsi" w:cstheme="minorBidi"/>
                 <w:noProof/>
                 <w:szCs w:val="24"/>
-                <w:lang w:val="en-FI" w:eastAsia="en-FI" w:bidi="ar-SA"/>
+                <w:lang w:val="fi-FI" w:eastAsia="fi-FI" w:bidi="ar-SA"/>
                 <w14:ligatures w14:val="standardContextual"/>
               </w:rPr>
               <w:tab/>
@@ -1853,7 +1936,7 @@
               <w:rPr>
                 <w:noProof/>
               </w:rPr>
-              <w:instrText xml:space="preserve"> PAGEREF _Toc216856852 \h </w:instrText>
+              <w:instrText xml:space="preserve"> PAGEREF _Toc227579921 \h </w:instrText>
             </w:r>
             <w:r>
               <w:rPr>
@@ -1870,7 +1953,7 @@
               <w:rPr>
                 <w:noProof/>
               </w:rPr>
-              <w:t>10</w:t>
+              <w:t>12</w:t>
             </w:r>
             <w:r>
               <w:rPr>
@@ -1891,11 +1974,11 @@
               <w:rFonts w:asciiTheme="minorHAnsi" w:eastAsiaTheme="minorEastAsia" w:hAnsiTheme="minorHAnsi" w:cstheme="minorBidi"/>
               <w:noProof/>
               <w:szCs w:val="24"/>
-              <w:lang w:val="en-FI" w:eastAsia="en-FI" w:bidi="ar-SA"/>
+              <w:lang w:val="fi-FI" w:eastAsia="fi-FI" w:bidi="ar-SA"/>
               <w14:ligatures w14:val="standardContextual"/>
             </w:rPr>
           </w:pPr>
-          <w:hyperlink w:anchor="_Toc216856853" w:history="1">
+          <w:hyperlink w:anchor="_Toc227579922" w:history="1">
             <w:r>
               <w:rPr>
                 <w:rStyle w:val="Hyperlink"/>
@@ -1908,7 +1991,7 @@
                 <w:rFonts w:asciiTheme="minorHAnsi" w:eastAsiaTheme="minorEastAsia" w:hAnsiTheme="minorHAnsi" w:cstheme="minorBidi"/>
                 <w:noProof/>
                 <w:szCs w:val="24"/>
-                <w:lang w:val="en-FI" w:eastAsia="en-FI" w:bidi="ar-SA"/>
+                <w:lang w:val="fi-FI" w:eastAsia="fi-FI" w:bidi="ar-SA"/>
                 <w14:ligatures w14:val="standardContextual"/>
               </w:rPr>
               <w:tab/>
@@ -1936,7 +2019,7 @@
               <w:rPr>
                 <w:noProof/>
               </w:rPr>
-              <w:instrText xml:space="preserve"> PAGEREF _Toc216856853 \h </w:instrText>
+              <w:instrText xml:space="preserve"> PAGEREF _Toc227579922 \h </w:instrText>
             </w:r>
             <w:r>
               <w:rPr>
@@ -1953,7 +2036,7 @@
               <w:rPr>
                 <w:noProof/>
               </w:rPr>
-              <w:t>12</w:t>
+              <w:t>14</w:t>
             </w:r>
             <w:r>
               <w:rPr>
@@ -1974,11 +2057,11 @@
               <w:rFonts w:asciiTheme="minorHAnsi" w:eastAsiaTheme="minorEastAsia" w:hAnsiTheme="minorHAnsi" w:cstheme="minorBidi"/>
               <w:noProof/>
               <w:szCs w:val="24"/>
-              <w:lang w:val="en-FI" w:eastAsia="en-FI" w:bidi="ar-SA"/>
+              <w:lang w:val="fi-FI" w:eastAsia="fi-FI" w:bidi="ar-SA"/>
               <w14:ligatures w14:val="standardContextual"/>
             </w:rPr>
           </w:pPr>
-          <w:hyperlink w:anchor="_Toc216856854" w:history="1">
+          <w:hyperlink w:anchor="_Toc227579923" w:history="1">
             <w:r>
               <w:rPr>
                 <w:rStyle w:val="Hyperlink"/>
@@ -1991,7 +2074,7 @@
                 <w:rFonts w:asciiTheme="minorHAnsi" w:eastAsiaTheme="minorEastAsia" w:hAnsiTheme="minorHAnsi" w:cstheme="minorBidi"/>
                 <w:noProof/>
                 <w:szCs w:val="24"/>
-                <w:lang w:val="en-FI" w:eastAsia="en-FI" w:bidi="ar-SA"/>
+                <w:lang w:val="fi-FI" w:eastAsia="fi-FI" w:bidi="ar-SA"/>
                 <w14:ligatures w14:val="standardContextual"/>
               </w:rPr>
               <w:tab/>
@@ -2019,7 +2102,7 @@
               <w:rPr>
                 <w:noProof/>
               </w:rPr>
-              <w:instrText xml:space="preserve"> PAGEREF _Toc216856854 \h </w:instrText>
+              <w:instrText xml:space="preserve"> PAGEREF _Toc227579923 \h </w:instrText>
             </w:r>
             <w:r>
               <w:rPr>
@@ -2036,7 +2119,7 @@
               <w:rPr>
                 <w:noProof/>
               </w:rPr>
-              <w:t>14</w:t>
+              <w:t>16</w:t>
             </w:r>
             <w:r>
               <w:rPr>
@@ -2057,11 +2140,11 @@
               <w:rFonts w:asciiTheme="minorHAnsi" w:eastAsiaTheme="minorEastAsia" w:hAnsiTheme="minorHAnsi" w:cstheme="minorBidi"/>
               <w:noProof/>
               <w:szCs w:val="24"/>
-              <w:lang w:val="en-FI" w:eastAsia="en-FI" w:bidi="ar-SA"/>
+              <w:lang w:val="fi-FI" w:eastAsia="fi-FI" w:bidi="ar-SA"/>
               <w14:ligatures w14:val="standardContextual"/>
             </w:rPr>
           </w:pPr>
-          <w:hyperlink w:anchor="_Toc216856855" w:history="1">
+          <w:hyperlink w:anchor="_Toc227579924" w:history="1">
             <w:r>
               <w:rPr>
                 <w:rStyle w:val="Hyperlink"/>
@@ -2074,7 +2157,7 @@
                 <w:rFonts w:asciiTheme="minorHAnsi" w:eastAsiaTheme="minorEastAsia" w:hAnsiTheme="minorHAnsi" w:cstheme="minorBidi"/>
                 <w:noProof/>
                 <w:szCs w:val="24"/>
-                <w:lang w:val="en-FI" w:eastAsia="en-FI" w:bidi="ar-SA"/>
+                <w:lang w:val="fi-FI" w:eastAsia="fi-FI" w:bidi="ar-SA"/>
                 <w14:ligatures w14:val="standardContextual"/>
               </w:rPr>
               <w:tab/>
@@ -2102,7 +2185,7 @@
               <w:rPr>
                 <w:noProof/>
               </w:rPr>
-              <w:instrText xml:space="preserve"> PAGEREF _Toc216856855 \h </w:instrText>
+              <w:instrText xml:space="preserve"> PAGEREF _Toc227579924 \h </w:instrText>
             </w:r>
             <w:r>
               <w:rPr>
@@ -2119,7 +2202,7 @@
               <w:rPr>
                 <w:noProof/>
               </w:rPr>
-              <w:t>14</w:t>
+              <w:t>16</w:t>
             </w:r>
             <w:r>
               <w:rPr>
@@ -2140,11 +2223,11 @@
               <w:rFonts w:asciiTheme="minorHAnsi" w:eastAsiaTheme="minorEastAsia" w:hAnsiTheme="minorHAnsi" w:cstheme="minorBidi"/>
               <w:noProof/>
               <w:szCs w:val="24"/>
-              <w:lang w:val="en-FI" w:eastAsia="en-FI" w:bidi="ar-SA"/>
+              <w:lang w:val="fi-FI" w:eastAsia="fi-FI" w:bidi="ar-SA"/>
               <w14:ligatures w14:val="standardContextual"/>
             </w:rPr>
           </w:pPr>
-          <w:hyperlink w:anchor="_Toc216856856" w:history="1">
+          <w:hyperlink w:anchor="_Toc227579925" w:history="1">
             <w:r>
               <w:rPr>
                 <w:rStyle w:val="Hyperlink"/>
@@ -2157,7 +2240,7 @@
                 <w:rFonts w:asciiTheme="minorHAnsi" w:eastAsiaTheme="minorEastAsia" w:hAnsiTheme="minorHAnsi" w:cstheme="minorBidi"/>
                 <w:noProof/>
                 <w:szCs w:val="24"/>
-                <w:lang w:val="en-FI" w:eastAsia="en-FI" w:bidi="ar-SA"/>
+                <w:lang w:val="fi-FI" w:eastAsia="fi-FI" w:bidi="ar-SA"/>
                 <w14:ligatures w14:val="standardContextual"/>
               </w:rPr>
               <w:tab/>
@@ -2185,7 +2268,7 @@
               <w:rPr>
                 <w:noProof/>
               </w:rPr>
-              <w:instrText xml:space="preserve"> PAGEREF _Toc216856856 \h </w:instrText>
+              <w:instrText xml:space="preserve"> PAGEREF _Toc227579925 \h </w:instrText>
             </w:r>
             <w:r>
               <w:rPr>
@@ -2202,7 +2285,7 @@
               <w:rPr>
                 <w:noProof/>
               </w:rPr>
-              <w:t>14</w:t>
+              <w:t>16</w:t>
             </w:r>
             <w:r>
               <w:rPr>
@@ -2223,11 +2306,11 @@
               <w:rFonts w:asciiTheme="minorHAnsi" w:eastAsiaTheme="minorEastAsia" w:hAnsiTheme="minorHAnsi" w:cstheme="minorBidi"/>
               <w:noProof/>
               <w:szCs w:val="24"/>
-              <w:lang w:val="en-FI" w:eastAsia="en-FI" w:bidi="ar-SA"/>
+              <w:lang w:val="fi-FI" w:eastAsia="fi-FI" w:bidi="ar-SA"/>
               <w14:ligatures w14:val="standardContextual"/>
             </w:rPr>
           </w:pPr>
-          <w:hyperlink w:anchor="_Toc216856857" w:history="1">
+          <w:hyperlink w:anchor="_Toc227579926" w:history="1">
             <w:r>
               <w:rPr>
                 <w:rStyle w:val="Hyperlink"/>
@@ -2240,7 +2323,7 @@
                 <w:rFonts w:asciiTheme="minorHAnsi" w:eastAsiaTheme="minorEastAsia" w:hAnsiTheme="minorHAnsi" w:cstheme="minorBidi"/>
                 <w:noProof/>
                 <w:szCs w:val="24"/>
-                <w:lang w:val="en-FI" w:eastAsia="en-FI" w:bidi="ar-SA"/>
+                <w:lang w:val="fi-FI" w:eastAsia="fi-FI" w:bidi="ar-SA"/>
                 <w14:ligatures w14:val="standardContextual"/>
               </w:rPr>
               <w:tab/>
@@ -2268,7 +2351,7 @@
               <w:rPr>
                 <w:noProof/>
               </w:rPr>
-              <w:instrText xml:space="preserve"> PAGEREF _Toc216856857 \h </w:instrText>
+              <w:instrText xml:space="preserve"> PAGEREF _Toc227579926 \h </w:instrText>
             </w:r>
             <w:r>
               <w:rPr>
@@ -2285,7 +2368,7 @@
               <w:rPr>
                 <w:noProof/>
               </w:rPr>
-              <w:t>14</w:t>
+              <w:t>16</w:t>
             </w:r>
             <w:r>
               <w:rPr>
@@ -2306,11 +2389,11 @@
               <w:rFonts w:asciiTheme="minorHAnsi" w:eastAsiaTheme="minorEastAsia" w:hAnsiTheme="minorHAnsi" w:cstheme="minorBidi"/>
               <w:noProof/>
               <w:szCs w:val="24"/>
-              <w:lang w:val="en-FI" w:eastAsia="en-FI" w:bidi="ar-SA"/>
+              <w:lang w:val="fi-FI" w:eastAsia="fi-FI" w:bidi="ar-SA"/>
               <w14:ligatures w14:val="standardContextual"/>
             </w:rPr>
           </w:pPr>
-          <w:hyperlink w:anchor="_Toc216856858" w:history="1">
+          <w:hyperlink w:anchor="_Toc227579927" w:history="1">
             <w:r>
               <w:rPr>
                 <w:rStyle w:val="Hyperlink"/>
@@ -2323,7 +2406,7 @@
                 <w:rFonts w:asciiTheme="minorHAnsi" w:eastAsiaTheme="minorEastAsia" w:hAnsiTheme="minorHAnsi" w:cstheme="minorBidi"/>
                 <w:noProof/>
                 <w:szCs w:val="24"/>
-                <w:lang w:val="en-FI" w:eastAsia="en-FI" w:bidi="ar-SA"/>
+                <w:lang w:val="fi-FI" w:eastAsia="fi-FI" w:bidi="ar-SA"/>
                 <w14:ligatures w14:val="standardContextual"/>
               </w:rPr>
               <w:tab/>
@@ -2351,7 +2434,7 @@
               <w:rPr>
                 <w:noProof/>
               </w:rPr>
-              <w:instrText xml:space="preserve"> PAGEREF _Toc216856858 \h </w:instrText>
+              <w:instrText xml:space="preserve"> PAGEREF _Toc227579927 \h </w:instrText>
             </w:r>
             <w:r>
               <w:rPr>
@@ -2368,7 +2451,7 @@
               <w:rPr>
                 <w:noProof/>
               </w:rPr>
-              <w:t>15</w:t>
+              <w:t>17</w:t>
             </w:r>
             <w:r>
               <w:rPr>
@@ -2389,11 +2472,11 @@
               <w:rFonts w:asciiTheme="minorHAnsi" w:eastAsiaTheme="minorEastAsia" w:hAnsiTheme="minorHAnsi" w:cstheme="minorBidi"/>
               <w:noProof/>
               <w:szCs w:val="24"/>
-              <w:lang w:val="en-FI" w:eastAsia="en-FI" w:bidi="ar-SA"/>
+              <w:lang w:val="fi-FI" w:eastAsia="fi-FI" w:bidi="ar-SA"/>
               <w14:ligatures w14:val="standardContextual"/>
             </w:rPr>
           </w:pPr>
-          <w:hyperlink w:anchor="_Toc216856859" w:history="1">
+          <w:hyperlink w:anchor="_Toc227579928" w:history="1">
             <w:r>
               <w:rPr>
                 <w:rStyle w:val="Hyperlink"/>
@@ -2406,7 +2489,7 @@
                 <w:rFonts w:asciiTheme="minorHAnsi" w:eastAsiaTheme="minorEastAsia" w:hAnsiTheme="minorHAnsi" w:cstheme="minorBidi"/>
                 <w:noProof/>
                 <w:szCs w:val="24"/>
-                <w:lang w:val="en-FI" w:eastAsia="en-FI" w:bidi="ar-SA"/>
+                <w:lang w:val="fi-FI" w:eastAsia="fi-FI" w:bidi="ar-SA"/>
                 <w14:ligatures w14:val="standardContextual"/>
               </w:rPr>
               <w:tab/>
@@ -2434,7 +2517,7 @@
               <w:rPr>
                 <w:noProof/>
               </w:rPr>
-              <w:instrText xml:space="preserve"> PAGEREF _Toc216856859 \h </w:instrText>
+              <w:instrText xml:space="preserve"> PAGEREF _Toc227579928 \h </w:instrText>
             </w:r>
             <w:r>
               <w:rPr>
@@ -2451,7 +2534,7 @@
               <w:rPr>
                 <w:noProof/>
               </w:rPr>
-              <w:t>16</w:t>
+              <w:t>18</w:t>
             </w:r>
             <w:r>
               <w:rPr>
@@ -2472,11 +2555,11 @@
               <w:rFonts w:asciiTheme="minorHAnsi" w:eastAsiaTheme="minorEastAsia" w:hAnsiTheme="minorHAnsi" w:cstheme="minorBidi"/>
               <w:noProof/>
               <w:szCs w:val="24"/>
-              <w:lang w:val="en-FI" w:eastAsia="en-FI" w:bidi="ar-SA"/>
+              <w:lang w:val="fi-FI" w:eastAsia="fi-FI" w:bidi="ar-SA"/>
               <w14:ligatures w14:val="standardContextual"/>
             </w:rPr>
           </w:pPr>
-          <w:hyperlink w:anchor="_Toc216856860" w:history="1">
+          <w:hyperlink w:anchor="_Toc227579929" w:history="1">
             <w:r>
               <w:rPr>
                 <w:rStyle w:val="Hyperlink"/>
@@ -2489,7 +2572,7 @@
                 <w:rFonts w:asciiTheme="minorHAnsi" w:eastAsiaTheme="minorEastAsia" w:hAnsiTheme="minorHAnsi" w:cstheme="minorBidi"/>
                 <w:noProof/>
                 <w:szCs w:val="24"/>
-                <w:lang w:val="en-FI" w:eastAsia="en-FI" w:bidi="ar-SA"/>
+                <w:lang w:val="fi-FI" w:eastAsia="fi-FI" w:bidi="ar-SA"/>
                 <w14:ligatures w14:val="standardContextual"/>
               </w:rPr>
               <w:tab/>
@@ -2517,7 +2600,7 @@
               <w:rPr>
                 <w:noProof/>
               </w:rPr>
-              <w:instrText xml:space="preserve"> PAGEREF _Toc216856860 \h </w:instrText>
+              <w:instrText xml:space="preserve"> PAGEREF _Toc227579929 \h </w:instrText>
             </w:r>
             <w:r>
               <w:rPr>
@@ -2534,7 +2617,7 @@
               <w:rPr>
                 <w:noProof/>
               </w:rPr>
-              <w:t>17</w:t>
+              <w:t>19</w:t>
             </w:r>
             <w:r>
               <w:rPr>
@@ -2555,11 +2638,11 @@
               <w:rFonts w:asciiTheme="minorHAnsi" w:eastAsiaTheme="minorEastAsia" w:hAnsiTheme="minorHAnsi" w:cstheme="minorBidi"/>
               <w:noProof/>
               <w:szCs w:val="24"/>
-              <w:lang w:val="en-FI" w:eastAsia="en-FI" w:bidi="ar-SA"/>
+              <w:lang w:val="fi-FI" w:eastAsia="fi-FI" w:bidi="ar-SA"/>
               <w14:ligatures w14:val="standardContextual"/>
             </w:rPr>
           </w:pPr>
-          <w:hyperlink w:anchor="_Toc216856861" w:history="1">
+          <w:hyperlink w:anchor="_Toc227579930" w:history="1">
             <w:r>
               <w:rPr>
                 <w:rStyle w:val="Hyperlink"/>
@@ -2572,7 +2655,7 @@
                 <w:rFonts w:asciiTheme="minorHAnsi" w:eastAsiaTheme="minorEastAsia" w:hAnsiTheme="minorHAnsi" w:cstheme="minorBidi"/>
                 <w:noProof/>
                 <w:szCs w:val="24"/>
-                <w:lang w:val="en-FI" w:eastAsia="en-FI" w:bidi="ar-SA"/>
+                <w:lang w:val="fi-FI" w:eastAsia="fi-FI" w:bidi="ar-SA"/>
                 <w14:ligatures w14:val="standardContextual"/>
               </w:rPr>
               <w:tab/>
@@ -2600,7 +2683,7 @@
               <w:rPr>
                 <w:noProof/>
               </w:rPr>
-              <w:instrText xml:space="preserve"> PAGEREF _Toc216856861 \h </w:instrText>
+              <w:instrText xml:space="preserve"> PAGEREF _Toc227579930 \h </w:instrText>
             </w:r>
             <w:r>
               <w:rPr>
@@ -2617,7 +2700,7 @@
               <w:rPr>
                 <w:noProof/>
               </w:rPr>
-              <w:t>17</w:t>
+              <w:t>19</w:t>
             </w:r>
             <w:r>
               <w:rPr>
@@ -2638,11 +2721,11 @@
               <w:rFonts w:asciiTheme="minorHAnsi" w:eastAsiaTheme="minorEastAsia" w:hAnsiTheme="minorHAnsi" w:cstheme="minorBidi"/>
               <w:noProof/>
               <w:szCs w:val="24"/>
-              <w:lang w:val="en-FI" w:eastAsia="en-FI" w:bidi="ar-SA"/>
+              <w:lang w:val="fi-FI" w:eastAsia="fi-FI" w:bidi="ar-SA"/>
               <w14:ligatures w14:val="standardContextual"/>
             </w:rPr>
           </w:pPr>
-          <w:hyperlink w:anchor="_Toc216856862" w:history="1">
+          <w:hyperlink w:anchor="_Toc227579931" w:history="1">
             <w:r>
               <w:rPr>
                 <w:rStyle w:val="Hyperlink"/>
@@ -2655,7 +2738,7 @@
                 <w:rFonts w:asciiTheme="minorHAnsi" w:eastAsiaTheme="minorEastAsia" w:hAnsiTheme="minorHAnsi" w:cstheme="minorBidi"/>
                 <w:noProof/>
                 <w:szCs w:val="24"/>
-                <w:lang w:val="en-FI" w:eastAsia="en-FI" w:bidi="ar-SA"/>
+                <w:lang w:val="fi-FI" w:eastAsia="fi-FI" w:bidi="ar-SA"/>
                 <w14:ligatures w14:val="standardContextual"/>
               </w:rPr>
               <w:tab/>
@@ -2683,7 +2766,7 @@
               <w:rPr>
                 <w:noProof/>
               </w:rPr>
-              <w:instrText xml:space="preserve"> PAGEREF _Toc216856862 \h </w:instrText>
+              <w:instrText xml:space="preserve"> PAGEREF _Toc227579931 \h </w:instrText>
             </w:r>
             <w:r>
               <w:rPr>
@@ -2700,7 +2783,7 @@
               <w:rPr>
                 <w:noProof/>
               </w:rPr>
-              <w:t>17</w:t>
+              <w:t>19</w:t>
             </w:r>
             <w:r>
               <w:rPr>
@@ -2784,7 +2867,7 @@
         <w:pStyle w:val="Heading1"/>
         <w:spacing w:before="0"/>
       </w:pPr>
-      <w:bookmarkStart w:id="9" w:name="_Toc216856835"/>
+      <w:bookmarkStart w:id="9" w:name="_Toc227579903"/>
       <w:r>
         <w:lastRenderedPageBreak/>
         <w:t>General information</w:t>
@@ -2855,7 +2938,7 @@
       <w:bookmarkStart w:id="15" w:name="_Toc11253821_Copy_1"/>
       <w:bookmarkStart w:id="16" w:name="_Toc11353120_Copy_1"/>
       <w:bookmarkStart w:id="17" w:name="_Toc11353194_Copy_1"/>
-      <w:bookmarkStart w:id="18" w:name="_Toc216856836"/>
+      <w:bookmarkStart w:id="18" w:name="_Toc227579904"/>
       <w:bookmarkEnd w:id="10"/>
       <w:bookmarkEnd w:id="11"/>
       <w:bookmarkEnd w:id="12"/>
@@ -2930,7 +3013,7 @@
       <w:bookmarkStart w:id="31" w:name="_Toc11253823"/>
       <w:bookmarkStart w:id="32" w:name="_Toc11353122"/>
       <w:bookmarkStart w:id="33" w:name="_Toc11353196"/>
-      <w:bookmarkStart w:id="34" w:name="_Toc216856837"/>
+      <w:bookmarkStart w:id="34" w:name="_Toc227579905"/>
       <w:bookmarkEnd w:id="19"/>
       <w:bookmarkEnd w:id="20"/>
       <w:bookmarkEnd w:id="21"/>
@@ -3211,7 +3294,7 @@
       <w:bookmarkStart w:id="39" w:name="_Toc11253825"/>
       <w:bookmarkStart w:id="40" w:name="_Toc11353124"/>
       <w:bookmarkStart w:id="41" w:name="_Toc11353198"/>
-      <w:bookmarkStart w:id="42" w:name="_Toc216856838"/>
+      <w:bookmarkStart w:id="42" w:name="_Toc227579906"/>
       <w:r>
         <w:lastRenderedPageBreak/>
         <w:t>Installation</w:t>
@@ -3262,15 +3345,7 @@
         <w:pStyle w:val="Textbody"/>
       </w:pPr>
       <w:r>
-        <w:t xml:space="preserve">During installation, the module installs required database tables and adds </w:t>
-      </w:r>
-      <w:proofErr w:type="spellStart"/>
-      <w:r>
-        <w:t>cron</w:t>
-      </w:r>
-      <w:proofErr w:type="spellEnd"/>
-      <w:r>
-        <w:t xml:space="preserve"> jobs for payment status query background jobs.</w:t>
+        <w:t>During installation, the module installs required database tables and adds cron jobs for payment status query background jobs.</w:t>
       </w:r>
     </w:p>
     <w:p>
@@ -3356,7 +3431,7 @@
       <w:bookmarkStart w:id="49" w:name="_Toc10743691"/>
       <w:bookmarkStart w:id="50" w:name="_Toc10741271"/>
       <w:bookmarkStart w:id="51" w:name="_Toc10646645"/>
-      <w:bookmarkStart w:id="52" w:name="_Toc216856839"/>
+      <w:bookmarkStart w:id="52" w:name="_Toc227579907"/>
       <w:bookmarkEnd w:id="44"/>
       <w:r>
         <w:t>Install</w:t>
@@ -3386,23 +3461,7 @@
         <w:pStyle w:val="Codeblock"/>
       </w:pPr>
       <w:r>
-        <w:t xml:space="preserve">composer require </w:t>
-      </w:r>
-      <w:proofErr w:type="spellStart"/>
-      <w:r>
-        <w:t>svea</w:t>
-      </w:r>
-      <w:proofErr w:type="spellEnd"/>
-      <w:r>
-        <w:t>-payments-</w:t>
-      </w:r>
-      <w:proofErr w:type="spellStart"/>
-      <w:r>
-        <w:t>finland</w:t>
-      </w:r>
-      <w:proofErr w:type="spellEnd"/>
-      <w:r>
-        <w:t>/magento2-svea-payments</w:t>
+        <w:t>composer require svea-payments-finland/magento2-svea-payments</w:t>
       </w:r>
     </w:p>
     <w:p>
@@ -3422,51 +3481,22 @@
       <w:pPr>
         <w:pStyle w:val="Codeblock"/>
       </w:pPr>
-      <w:proofErr w:type="spellStart"/>
-      <w:r>
-        <w:t>php</w:t>
-      </w:r>
-      <w:proofErr w:type="spellEnd"/>
-      <w:r>
-        <w:t xml:space="preserve"> bin/</w:t>
-      </w:r>
-      <w:proofErr w:type="spellStart"/>
-      <w:r>
-        <w:t>magento</w:t>
-      </w:r>
-      <w:proofErr w:type="spellEnd"/>
-      <w:r>
-        <w:t xml:space="preserve"> </w:t>
-      </w:r>
-      <w:proofErr w:type="spellStart"/>
+      <w:r>
+        <w:t xml:space="preserve">php bin/magento </w:t>
+      </w:r>
       <w:proofErr w:type="gramStart"/>
       <w:r>
         <w:t>setup:upgrade</w:t>
       </w:r>
-      <w:proofErr w:type="spellEnd"/>
       <w:proofErr w:type="gramEnd"/>
     </w:p>
     <w:p>
       <w:pPr>
         <w:pStyle w:val="Codeblock"/>
       </w:pPr>
-      <w:proofErr w:type="spellStart"/>
-      <w:r>
-        <w:t>php</w:t>
-      </w:r>
-      <w:proofErr w:type="spellEnd"/>
-      <w:r>
-        <w:t xml:space="preserve"> bin/</w:t>
-      </w:r>
-      <w:proofErr w:type="spellStart"/>
-      <w:r>
-        <w:t>magento</w:t>
-      </w:r>
-      <w:proofErr w:type="spellEnd"/>
-      <w:r>
-        <w:t xml:space="preserve"> </w:t>
-      </w:r>
-      <w:proofErr w:type="spellStart"/>
+      <w:r>
+        <w:t xml:space="preserve">php bin/magento </w:t>
+      </w:r>
       <w:proofErr w:type="gramStart"/>
       <w:r>
         <w:t>setup:di</w:t>
@@ -3475,68 +3505,34 @@
       <w:r>
         <w:t>:compile</w:t>
       </w:r>
-      <w:proofErr w:type="spellEnd"/>
     </w:p>
     <w:p>
       <w:pPr>
         <w:pStyle w:val="Codeblock"/>
       </w:pPr>
-      <w:proofErr w:type="spellStart"/>
-      <w:r>
-        <w:t>php</w:t>
-      </w:r>
-      <w:proofErr w:type="spellEnd"/>
-      <w:r>
-        <w:t xml:space="preserve"> bin/</w:t>
-      </w:r>
-      <w:proofErr w:type="spellStart"/>
-      <w:r>
-        <w:t>magento</w:t>
-      </w:r>
-      <w:proofErr w:type="spellEnd"/>
-      <w:r>
-        <w:t xml:space="preserve"> </w:t>
-      </w:r>
-      <w:proofErr w:type="spellStart"/>
+      <w:r>
+        <w:t xml:space="preserve">php bin/magento </w:t>
+      </w:r>
       <w:proofErr w:type="gramStart"/>
       <w:r>
         <w:t>setup:static</w:t>
       </w:r>
       <w:proofErr w:type="gramEnd"/>
       <w:r>
-        <w:t>-content:deploy</w:t>
-      </w:r>
-      <w:proofErr w:type="spellEnd"/>
-      <w:r>
-        <w:t xml:space="preserve"> -f -j 3</w:t>
+        <w:t>-content:deploy -f -j 3</w:t>
       </w:r>
     </w:p>
     <w:p>
       <w:pPr>
         <w:pStyle w:val="Codeblock"/>
       </w:pPr>
-      <w:proofErr w:type="spellStart"/>
-      <w:r>
-        <w:t>php</w:t>
-      </w:r>
-      <w:proofErr w:type="spellEnd"/>
-      <w:r>
-        <w:t xml:space="preserve"> bin/</w:t>
-      </w:r>
-      <w:proofErr w:type="spellStart"/>
-      <w:r>
-        <w:t>magento</w:t>
-      </w:r>
-      <w:proofErr w:type="spellEnd"/>
-      <w:r>
-        <w:t xml:space="preserve"> </w:t>
-      </w:r>
-      <w:proofErr w:type="spellStart"/>
+      <w:r>
+        <w:t xml:space="preserve">php bin/magento </w:t>
+      </w:r>
       <w:proofErr w:type="gramStart"/>
       <w:r>
         <w:t>cache:flush</w:t>
       </w:r>
-      <w:proofErr w:type="spellEnd"/>
       <w:proofErr w:type="gramEnd"/>
     </w:p>
     <w:p>
@@ -3549,15 +3545,7 @@
         <w:pStyle w:val="Textbody"/>
       </w:pPr>
       <w:r>
-        <w:t xml:space="preserve">Check that </w:t>
-      </w:r>
-      <w:proofErr w:type="spellStart"/>
-      <w:r>
-        <w:t>cron</w:t>
-      </w:r>
-      <w:proofErr w:type="spellEnd"/>
-      <w:r>
-        <w:t xml:space="preserve"> service is running.</w:t>
+        <w:t>Check that cron service is running.</w:t>
       </w:r>
     </w:p>
     <w:p>
@@ -3565,31 +3553,15 @@
         <w:pStyle w:val="Codeblock"/>
       </w:pPr>
       <w:r>
-        <w:t xml:space="preserve">service </w:t>
-      </w:r>
-      <w:proofErr w:type="spellStart"/>
-      <w:r>
-        <w:t>cron</w:t>
-      </w:r>
-      <w:proofErr w:type="spellEnd"/>
-      <w:r>
-        <w:t xml:space="preserve"> status</w:t>
-      </w:r>
-    </w:p>
-    <w:p>
-      <w:pPr>
-        <w:pStyle w:val="Textbody"/>
-      </w:pPr>
-      <w:r>
-        <w:t xml:space="preserve">if needed, start </w:t>
-      </w:r>
-      <w:proofErr w:type="spellStart"/>
-      <w:r>
-        <w:t>cron</w:t>
-      </w:r>
-      <w:proofErr w:type="spellEnd"/>
-      <w:r>
-        <w:t xml:space="preserve"> as follows.</w:t>
+        <w:t>service cron status</w:t>
+      </w:r>
+    </w:p>
+    <w:p>
+      <w:pPr>
+        <w:pStyle w:val="Textbody"/>
+      </w:pPr>
+      <w:r>
+        <w:t>if needed, start cron as follows.</w:t>
       </w:r>
     </w:p>
     <w:p>
@@ -3597,15 +3569,7 @@
         <w:pStyle w:val="Codeblock"/>
       </w:pPr>
       <w:r>
-        <w:t xml:space="preserve">service </w:t>
-      </w:r>
-      <w:proofErr w:type="spellStart"/>
-      <w:r>
-        <w:t>cron</w:t>
-      </w:r>
-      <w:proofErr w:type="spellEnd"/>
-      <w:r>
-        <w:t xml:space="preserve"> start</w:t>
+        <w:t>service cron start</w:t>
       </w:r>
     </w:p>
     <w:p/>
@@ -3613,7 +3577,7 @@
       <w:pPr>
         <w:pStyle w:val="Heading2"/>
       </w:pPr>
-      <w:bookmarkStart w:id="53" w:name="_Toc216856840"/>
+      <w:bookmarkStart w:id="53" w:name="_Toc227579908"/>
       <w:r>
         <w:t>Check the current version information</w:t>
       </w:r>
@@ -3632,23 +3596,7 @@
         <w:pStyle w:val="Codeblock"/>
       </w:pPr>
       <w:r>
-        <w:t xml:space="preserve">composer show </w:t>
-      </w:r>
-      <w:proofErr w:type="spellStart"/>
-      <w:r>
-        <w:t>svea</w:t>
-      </w:r>
-      <w:proofErr w:type="spellEnd"/>
-      <w:r>
-        <w:t>-payments-</w:t>
-      </w:r>
-      <w:proofErr w:type="spellStart"/>
-      <w:r>
-        <w:t>finland</w:t>
-      </w:r>
-      <w:proofErr w:type="spellEnd"/>
-      <w:r>
-        <w:t>/magento2-svea-payments</w:t>
+        <w:t>composer show svea-payments-finland/magento2-svea-payments</w:t>
       </w:r>
     </w:p>
     <w:p/>
@@ -3664,7 +3612,7 @@
       <w:bookmarkStart w:id="59" w:name="_Toc11253826"/>
       <w:bookmarkStart w:id="60" w:name="_Toc11353125"/>
       <w:bookmarkStart w:id="61" w:name="_Toc11353199"/>
-      <w:bookmarkStart w:id="62" w:name="_Toc216856841"/>
+      <w:bookmarkStart w:id="62" w:name="_Toc227579909"/>
       <w:bookmarkEnd w:id="54"/>
       <w:r>
         <w:t xml:space="preserve">Upgrade the existing </w:t>
@@ -3695,23 +3643,7 @@
       </w:pPr>
       <w:r>
         <w:lastRenderedPageBreak/>
-        <w:t xml:space="preserve">composer update </w:t>
-      </w:r>
-      <w:proofErr w:type="spellStart"/>
-      <w:r>
-        <w:t>svea</w:t>
-      </w:r>
-      <w:proofErr w:type="spellEnd"/>
-      <w:r>
-        <w:t>-payments-</w:t>
-      </w:r>
-      <w:proofErr w:type="spellStart"/>
-      <w:r>
-        <w:t>finland</w:t>
-      </w:r>
-      <w:proofErr w:type="spellEnd"/>
-      <w:r>
-        <w:t>/magento2-svea-payments</w:t>
+        <w:t>composer update svea-payments-finland/magento2-svea-payments</w:t>
       </w:r>
     </w:p>
     <w:p>
@@ -3731,51 +3663,22 @@
       <w:pPr>
         <w:pStyle w:val="Codeblock"/>
       </w:pPr>
-      <w:proofErr w:type="spellStart"/>
-      <w:r>
-        <w:t>php</w:t>
-      </w:r>
-      <w:proofErr w:type="spellEnd"/>
-      <w:r>
-        <w:t xml:space="preserve"> bin/</w:t>
-      </w:r>
-      <w:proofErr w:type="spellStart"/>
-      <w:r>
-        <w:t>magento</w:t>
-      </w:r>
-      <w:proofErr w:type="spellEnd"/>
-      <w:r>
-        <w:t xml:space="preserve"> </w:t>
-      </w:r>
-      <w:proofErr w:type="spellStart"/>
+      <w:r>
+        <w:t xml:space="preserve">php bin/magento </w:t>
+      </w:r>
       <w:proofErr w:type="gramStart"/>
       <w:r>
         <w:t>setup:upgrade</w:t>
       </w:r>
-      <w:proofErr w:type="spellEnd"/>
       <w:proofErr w:type="gramEnd"/>
     </w:p>
     <w:p>
       <w:pPr>
         <w:pStyle w:val="Codeblock"/>
       </w:pPr>
-      <w:proofErr w:type="spellStart"/>
-      <w:r>
-        <w:t>php</w:t>
-      </w:r>
-      <w:proofErr w:type="spellEnd"/>
-      <w:r>
-        <w:t xml:space="preserve"> bin/</w:t>
-      </w:r>
-      <w:proofErr w:type="spellStart"/>
-      <w:r>
-        <w:t>magento</w:t>
-      </w:r>
-      <w:proofErr w:type="spellEnd"/>
-      <w:r>
-        <w:t xml:space="preserve"> </w:t>
-      </w:r>
-      <w:proofErr w:type="spellStart"/>
+      <w:r>
+        <w:t xml:space="preserve">php bin/magento </w:t>
+      </w:r>
       <w:proofErr w:type="gramStart"/>
       <w:r>
         <w:t>setup:di</w:t>
@@ -3784,75 +3687,41 @@
       <w:r>
         <w:t>:compile</w:t>
       </w:r>
-      <w:proofErr w:type="spellEnd"/>
     </w:p>
     <w:p>
       <w:pPr>
         <w:pStyle w:val="Codeblock"/>
       </w:pPr>
-      <w:proofErr w:type="spellStart"/>
-      <w:r>
-        <w:t>php</w:t>
-      </w:r>
-      <w:proofErr w:type="spellEnd"/>
-      <w:r>
-        <w:t xml:space="preserve"> bin/</w:t>
-      </w:r>
-      <w:proofErr w:type="spellStart"/>
-      <w:r>
-        <w:t>magento</w:t>
-      </w:r>
-      <w:proofErr w:type="spellEnd"/>
-      <w:r>
-        <w:t xml:space="preserve"> </w:t>
-      </w:r>
-      <w:proofErr w:type="spellStart"/>
+      <w:r>
+        <w:t xml:space="preserve">php bin/magento </w:t>
+      </w:r>
       <w:proofErr w:type="gramStart"/>
       <w:r>
         <w:t>setup:static</w:t>
       </w:r>
       <w:proofErr w:type="gramEnd"/>
       <w:r>
-        <w:t>-content:deploy</w:t>
-      </w:r>
-      <w:proofErr w:type="spellEnd"/>
-      <w:r>
-        <w:t xml:space="preserve"> -f -j 3</w:t>
+        <w:t>-content:deploy -f -j 3</w:t>
       </w:r>
     </w:p>
     <w:p>
       <w:pPr>
         <w:pStyle w:val="Codeblock"/>
       </w:pPr>
-      <w:proofErr w:type="spellStart"/>
-      <w:r>
-        <w:t>php</w:t>
-      </w:r>
-      <w:proofErr w:type="spellEnd"/>
-      <w:r>
-        <w:t xml:space="preserve"> bin/</w:t>
-      </w:r>
-      <w:proofErr w:type="spellStart"/>
-      <w:r>
-        <w:t>magento</w:t>
-      </w:r>
-      <w:proofErr w:type="spellEnd"/>
-      <w:r>
-        <w:t xml:space="preserve"> </w:t>
-      </w:r>
-      <w:proofErr w:type="spellStart"/>
+      <w:r>
+        <w:t xml:space="preserve">php bin/magento </w:t>
+      </w:r>
       <w:proofErr w:type="gramStart"/>
       <w:r>
         <w:t>cache:flush</w:t>
       </w:r>
-      <w:proofErr w:type="spellEnd"/>
       <w:proofErr w:type="gramEnd"/>
     </w:p>
     <w:p>
       <w:pPr>
         <w:pStyle w:val="Heading2"/>
       </w:pPr>
-      <w:bookmarkStart w:id="63" w:name="_Toc216856842"/>
+      <w:bookmarkStart w:id="63" w:name="_Toc227579910"/>
       <w:r>
         <w:t>Remove the payment module</w:t>
       </w:r>
@@ -3871,23 +3740,7 @@
         <w:pStyle w:val="Codeblock"/>
       </w:pPr>
       <w:r>
-        <w:t xml:space="preserve">composer remove </w:t>
-      </w:r>
-      <w:proofErr w:type="spellStart"/>
-      <w:r>
-        <w:t>svea</w:t>
-      </w:r>
-      <w:proofErr w:type="spellEnd"/>
-      <w:r>
-        <w:t>-payments-</w:t>
-      </w:r>
-      <w:proofErr w:type="spellStart"/>
-      <w:r>
-        <w:t>finland</w:t>
-      </w:r>
-      <w:proofErr w:type="spellEnd"/>
-      <w:r>
-        <w:t>/magento2-svea-payments</w:t>
+        <w:t>composer remove svea-payments-finland/magento2-svea-payments</w:t>
       </w:r>
     </w:p>
     <w:p>
@@ -3915,7 +3768,7 @@
       </w:pPr>
       <w:bookmarkStart w:id="64" w:name="_Migrate_from_previous"/>
       <w:bookmarkStart w:id="65" w:name="_Migrating_from_previous"/>
-      <w:bookmarkStart w:id="66" w:name="_Toc216856843"/>
+      <w:bookmarkStart w:id="66" w:name="_Toc227579911"/>
       <w:bookmarkEnd w:id="64"/>
       <w:bookmarkEnd w:id="65"/>
       <w:r>
@@ -4054,93 +3907,17 @@
       <w:pPr>
         <w:pStyle w:val="Codeblock"/>
       </w:pPr>
-      <w:proofErr w:type="spellStart"/>
-      <w:r>
-        <w:t>php</w:t>
-      </w:r>
-      <w:proofErr w:type="spellEnd"/>
-      <w:r>
-        <w:t xml:space="preserve"> bin/</w:t>
-      </w:r>
-      <w:proofErr w:type="spellStart"/>
-      <w:r>
-        <w:t>magento</w:t>
-      </w:r>
-      <w:proofErr w:type="spellEnd"/>
-      <w:r>
-        <w:t xml:space="preserve"> </w:t>
-      </w:r>
-      <w:proofErr w:type="spellStart"/>
+      <w:r>
+        <w:t xml:space="preserve">php bin/magento </w:t>
+      </w:r>
       <w:proofErr w:type="gramStart"/>
       <w:r>
         <w:t>module:disable</w:t>
       </w:r>
-      <w:proofErr w:type="spellEnd"/>
       <w:proofErr w:type="gramEnd"/>
       <w:r>
-        <w:t xml:space="preserve"> </w:t>
-      </w:r>
-      <w:proofErr w:type="spellStart"/>
-      <w:r>
-        <w:t>Svea_Maksuturva</w:t>
-      </w:r>
-      <w:proofErr w:type="spellEnd"/>
-      <w:r>
-        <w:t xml:space="preserve"> </w:t>
-      </w:r>
-      <w:proofErr w:type="spellStart"/>
-      <w:r>
-        <w:t>Svea_MaksuturvaBase</w:t>
-      </w:r>
-      <w:proofErr w:type="spellEnd"/>
-      <w:r>
-        <w:t xml:space="preserve"> </w:t>
-      </w:r>
-      <w:proofErr w:type="spellStart"/>
-      <w:r>
-        <w:t>Svea_MaksuturvaCard</w:t>
-      </w:r>
-      <w:proofErr w:type="spellEnd"/>
-      <w:r>
-        <w:t xml:space="preserve"> </w:t>
-      </w:r>
-      <w:proofErr w:type="spellStart"/>
-      <w:r>
-        <w:t>Svea_MaksuturvaCollated</w:t>
-      </w:r>
-      <w:proofErr w:type="spellEnd"/>
-      <w:r>
-        <w:t xml:space="preserve"> </w:t>
-      </w:r>
-      <w:proofErr w:type="spellStart"/>
-      <w:r>
-        <w:t>Svea_MaksuturvaGeneric</w:t>
-      </w:r>
-      <w:proofErr w:type="spellEnd"/>
-      <w:r>
-        <w:t xml:space="preserve"> </w:t>
-      </w:r>
-      <w:proofErr w:type="spellStart"/>
-      <w:r>
-        <w:t>Svea_MaksuturvaInvoice</w:t>
-      </w:r>
-      <w:proofErr w:type="spellEnd"/>
-      <w:r>
-        <w:t xml:space="preserve"> </w:t>
-      </w:r>
-      <w:proofErr w:type="spellStart"/>
-      <w:r>
-        <w:t>Svea_MaksuturvaPartPayment</w:t>
-      </w:r>
-      <w:proofErr w:type="spellEnd"/>
-      <w:r>
-        <w:t xml:space="preserve"> </w:t>
-      </w:r>
-      <w:proofErr w:type="spellStart"/>
-      <w:r>
-        <w:t>Svea_OrderComment</w:t>
-      </w:r>
-      <w:proofErr w:type="spellEnd"/>
+        <w:t xml:space="preserve"> Svea_Maksuturva Svea_MaksuturvaBase Svea_MaksuturvaCard Svea_MaksuturvaCollated Svea_MaksuturvaGeneric Svea_MaksuturvaInvoice Svea_MaksuturvaPartPayment Svea_OrderComment</w:t>
+      </w:r>
     </w:p>
     <w:p>
       <w:pPr>
@@ -4181,23 +3958,9 @@
       <w:pPr>
         <w:pStyle w:val="Codeblock"/>
       </w:pPr>
-      <w:proofErr w:type="spellStart"/>
-      <w:r>
-        <w:t>php</w:t>
-      </w:r>
-      <w:proofErr w:type="spellEnd"/>
-      <w:r>
-        <w:t xml:space="preserve"> bin/</w:t>
-      </w:r>
-      <w:proofErr w:type="spellStart"/>
-      <w:r>
-        <w:t>magento</w:t>
-      </w:r>
-      <w:proofErr w:type="spellEnd"/>
-      <w:r>
-        <w:t xml:space="preserve"> </w:t>
-      </w:r>
-      <w:proofErr w:type="spellStart"/>
+      <w:r>
+        <w:t xml:space="preserve">php bin/magento </w:t>
+      </w:r>
       <w:proofErr w:type="gramStart"/>
       <w:r>
         <w:t>svea:migrate</w:t>
@@ -4206,7 +3969,6 @@
       <w:r>
         <w:t>:config</w:t>
       </w:r>
-      <w:proofErr w:type="spellEnd"/>
     </w:p>
     <w:p>
       <w:pPr>
@@ -4270,14 +4032,12 @@
       <w:r>
         <w:t xml:space="preserve">Optional but recommended: migrate old orders to new module format. Orders placed with previous </w:t>
       </w:r>
-      <w:proofErr w:type="spellStart"/>
       <w:r>
         <w:rPr>
           <w:rStyle w:val="CodeblockChar"/>
         </w:rPr>
         <w:t>Svea_Maksuturva</w:t>
       </w:r>
-      <w:proofErr w:type="spellEnd"/>
       <w:r>
         <w:t xml:space="preserve"> payment methods can be migrated via Command Line Interface (CLI). </w:t>
       </w:r>
@@ -4289,14 +4049,12 @@
       <w:r>
         <w:t xml:space="preserve">Without migration, you cannot refund or make status queries for orders created with </w:t>
       </w:r>
-      <w:proofErr w:type="spellStart"/>
       <w:r>
         <w:rPr>
           <w:rStyle w:val="CodeblockChar"/>
         </w:rPr>
         <w:t>Svea_Maksuturva</w:t>
       </w:r>
-      <w:proofErr w:type="spellEnd"/>
       <w:r>
         <w:t xml:space="preserve"> payment methods.</w:t>
       </w:r>
@@ -4305,34 +4063,16 @@
       <w:pPr>
         <w:pStyle w:val="Codeblock"/>
       </w:pPr>
-      <w:proofErr w:type="spellStart"/>
-      <w:r>
-        <w:t>php</w:t>
-      </w:r>
-      <w:proofErr w:type="spellEnd"/>
-      <w:r>
-        <w:t xml:space="preserve"> bin/</w:t>
-      </w:r>
-      <w:proofErr w:type="spellStart"/>
-      <w:r>
-        <w:t>magento</w:t>
-      </w:r>
-      <w:proofErr w:type="spellEnd"/>
-      <w:r>
-        <w:t xml:space="preserve"> </w:t>
-      </w:r>
-      <w:proofErr w:type="spellStart"/>
+      <w:r>
+        <w:t xml:space="preserve">php bin/magento </w:t>
+      </w:r>
       <w:proofErr w:type="gramStart"/>
       <w:r>
         <w:t>svea:migrate</w:t>
       </w:r>
       <w:proofErr w:type="gramEnd"/>
       <w:r>
-        <w:t>:sales</w:t>
-      </w:r>
-      <w:proofErr w:type="spellEnd"/>
-      <w:r>
-        <w:t xml:space="preserve"> --date </w:t>
+        <w:t xml:space="preserve">:sales --date </w:t>
       </w:r>
       <w:r>
         <w:rPr>
@@ -4422,17 +4162,9 @@
       <w:pPr>
         <w:pStyle w:val="Heading2"/>
       </w:pPr>
-      <w:bookmarkStart w:id="67" w:name="_Toc216856844"/>
-      <w:r>
-        <w:t xml:space="preserve">Possible conflicts with </w:t>
-      </w:r>
-      <w:proofErr w:type="spellStart"/>
-      <w:r>
-        <w:t>Svea_Maksuturva</w:t>
-      </w:r>
-      <w:proofErr w:type="spellEnd"/>
-      <w:r>
-        <w:t xml:space="preserve"> module</w:t>
+      <w:bookmarkStart w:id="67" w:name="_Toc227579912"/>
+      <w:r>
+        <w:t>Possible conflicts with Svea_Maksuturva module</w:t>
       </w:r>
       <w:bookmarkEnd w:id="67"/>
     </w:p>
@@ -4443,46 +4175,21 @@
       <w:r>
         <w:t xml:space="preserve">If you have enabled </w:t>
       </w:r>
-      <w:proofErr w:type="spellStart"/>
       <w:r>
         <w:rPr>
           <w:rStyle w:val="CodeblockChar"/>
         </w:rPr>
         <w:t>Svea_Maksuturva</w:t>
       </w:r>
-      <w:proofErr w:type="spellEnd"/>
       <w:r>
         <w:t xml:space="preserve"> module, the </w:t>
       </w:r>
-      <w:proofErr w:type="spellStart"/>
       <w:r>
         <w:rPr>
           <w:rStyle w:val="CodeblockChar"/>
         </w:rPr>
-        <w:t>php</w:t>
-      </w:r>
-      <w:proofErr w:type="spellEnd"/>
-      <w:r>
-        <w:rPr>
-          <w:rStyle w:val="CodeblockChar"/>
-        </w:rPr>
-        <w:t xml:space="preserve"> bin/</w:t>
-      </w:r>
-      <w:proofErr w:type="spellStart"/>
-      <w:r>
-        <w:rPr>
-          <w:rStyle w:val="CodeblockChar"/>
-        </w:rPr>
-        <w:t>magento</w:t>
-      </w:r>
-      <w:proofErr w:type="spellEnd"/>
-      <w:r>
-        <w:rPr>
-          <w:rStyle w:val="CodeblockChar"/>
-        </w:rPr>
-        <w:t xml:space="preserve"> </w:t>
-      </w:r>
-      <w:proofErr w:type="spellStart"/>
+        <w:t xml:space="preserve">php bin/magento </w:t>
+      </w:r>
       <w:proofErr w:type="gramStart"/>
       <w:r>
         <w:rPr>
@@ -4490,19 +4197,16 @@
         </w:rPr>
         <w:t>setup:upgrade</w:t>
       </w:r>
-      <w:proofErr w:type="spellEnd"/>
       <w:proofErr w:type="gramEnd"/>
       <w:r>
         <w:t xml:space="preserve"> step of installation will inform you if you need to disable </w:t>
       </w:r>
-      <w:proofErr w:type="spellStart"/>
       <w:r>
         <w:rPr>
           <w:rStyle w:val="CodeblockChar"/>
         </w:rPr>
         <w:t>Svea_Maksuturva</w:t>
       </w:r>
-      <w:proofErr w:type="spellEnd"/>
       <w:r>
         <w:t xml:space="preserve"> module.</w:t>
       </w:r>
@@ -4514,35 +4218,12 @@
       <w:r>
         <w:t xml:space="preserve">After that you need to repeat the </w:t>
       </w:r>
-      <w:proofErr w:type="spellStart"/>
       <w:r>
         <w:rPr>
           <w:rStyle w:val="CodeblockChar"/>
         </w:rPr>
-        <w:t>php</w:t>
-      </w:r>
-      <w:proofErr w:type="spellEnd"/>
-      <w:r>
-        <w:rPr>
-          <w:rStyle w:val="CodeblockChar"/>
-        </w:rPr>
-        <w:t xml:space="preserve"> bin/</w:t>
-      </w:r>
-      <w:proofErr w:type="spellStart"/>
-      <w:r>
-        <w:rPr>
-          <w:rStyle w:val="CodeblockChar"/>
-        </w:rPr>
-        <w:t>magento</w:t>
-      </w:r>
-      <w:proofErr w:type="spellEnd"/>
-      <w:r>
-        <w:rPr>
-          <w:rStyle w:val="CodeblockChar"/>
-        </w:rPr>
-        <w:t xml:space="preserve"> </w:t>
-      </w:r>
-      <w:proofErr w:type="spellStart"/>
+        <w:t xml:space="preserve">php bin/magento </w:t>
+      </w:r>
       <w:proofErr w:type="gramStart"/>
       <w:r>
         <w:rPr>
@@ -4550,7 +4231,6 @@
         </w:rPr>
         <w:t>setup:upgrade</w:t>
       </w:r>
-      <w:proofErr w:type="spellEnd"/>
       <w:proofErr w:type="gramEnd"/>
       <w:r>
         <w:t xml:space="preserve"> step to continue with the installation process.</w:t>
@@ -4563,26 +4243,18 @@
           <w:rFonts w:eastAsia="Arial Unicode MS" w:cs="Arial"/>
         </w:rPr>
       </w:pPr>
-      <w:bookmarkStart w:id="68" w:name="_Toc216856845"/>
+      <w:bookmarkStart w:id="68" w:name="_Toc227579913"/>
       <w:r>
         <w:rPr>
           <w:rFonts w:eastAsia="Arial Unicode MS" w:cs="Arial"/>
         </w:rPr>
         <w:t xml:space="preserve">Compatibility with </w:t>
       </w:r>
-      <w:proofErr w:type="spellStart"/>
       <w:r>
         <w:rPr>
           <w:rFonts w:eastAsia="Arial Unicode MS" w:cs="Arial"/>
         </w:rPr>
-        <w:t>Hyvä</w:t>
-      </w:r>
-      <w:proofErr w:type="spellEnd"/>
-      <w:r>
-        <w:rPr>
-          <w:rFonts w:eastAsia="Arial Unicode MS" w:cs="Arial"/>
-        </w:rPr>
-        <w:t xml:space="preserve"> Theme</w:t>
+        <w:t>Hyvä Theme</w:t>
       </w:r>
       <w:bookmarkEnd w:id="68"/>
     </w:p>
@@ -4607,23 +4279,7 @@
         <w:pStyle w:val="Textbody"/>
       </w:pPr>
       <w:r>
-        <w:t xml:space="preserve">If you intend to use Svea Payments module with </w:t>
-      </w:r>
-      <w:proofErr w:type="spellStart"/>
-      <w:r>
-        <w:t>Hyvä</w:t>
-      </w:r>
-      <w:proofErr w:type="spellEnd"/>
-      <w:r>
-        <w:t xml:space="preserve"> Theme you need to also install the Compatibility module we provide via </w:t>
-      </w:r>
-      <w:proofErr w:type="spellStart"/>
-      <w:r>
-        <w:t>Hyvä</w:t>
-      </w:r>
-      <w:proofErr w:type="spellEnd"/>
-      <w:r>
-        <w:t xml:space="preserve"> Theme repository.</w:t>
+        <w:t>If you intend to use Svea Payments module with Hyvä Theme you need to also install the Compatibility module we provide via Hyvä Theme repository.</w:t>
       </w:r>
       <w:r>
         <w:t xml:space="preserve"> </w:t>
@@ -4648,21 +4304,7 @@
         <w:rPr>
           <w:rFonts w:ascii="Courier New" w:hAnsi="Courier New" w:cs="Courier New"/>
         </w:rPr>
-        <w:t xml:space="preserve"> require </w:t>
-      </w:r>
-      <w:proofErr w:type="spellStart"/>
-      <w:r>
-        <w:rPr>
-          <w:rFonts w:ascii="Courier New" w:hAnsi="Courier New" w:cs="Courier New"/>
-        </w:rPr>
-        <w:t>hyva</w:t>
-      </w:r>
-      <w:proofErr w:type="spellEnd"/>
-      <w:r>
-        <w:rPr>
-          <w:rFonts w:ascii="Courier New" w:hAnsi="Courier New" w:cs="Courier New"/>
-        </w:rPr>
-        <w:t>-themes/magento2-hyva-checkout-svea-payment</w:t>
+        <w:t xml:space="preserve"> require hyva-themes/magento2-hyva-checkout-svea-payment</w:t>
       </w:r>
     </w:p>
     <w:p>
@@ -4699,7 +4341,7 @@
       <w:bookmarkStart w:id="74" w:name="_Toc10743692"/>
       <w:bookmarkStart w:id="75" w:name="_Toc10741272"/>
       <w:bookmarkStart w:id="76" w:name="_Toc10646646"/>
-      <w:bookmarkStart w:id="77" w:name="_Toc216856846"/>
+      <w:bookmarkStart w:id="77" w:name="_Toc227579914"/>
       <w:bookmarkEnd w:id="69"/>
       <w:r>
         <w:lastRenderedPageBreak/>
@@ -4800,7 +4442,7 @@
       <w:pPr>
         <w:pStyle w:val="Heading2"/>
       </w:pPr>
-      <w:bookmarkStart w:id="78" w:name="_Toc216856847"/>
+      <w:bookmarkStart w:id="78" w:name="_Toc227579915"/>
       <w:r>
         <w:t>Preferred Magento settings</w:t>
       </w:r>
@@ -4966,7 +4608,7 @@
         <w:pStyle w:val="Heading2"/>
       </w:pPr>
       <w:bookmarkStart w:id="80" w:name="_Payment_methods_page"/>
-      <w:bookmarkStart w:id="81" w:name="_Toc216856848"/>
+      <w:bookmarkStart w:id="81" w:name="_Toc227579916"/>
       <w:bookmarkEnd w:id="80"/>
       <w:r>
         <w:t>Payment methods page</w:t>
@@ -5066,7 +4708,22 @@
         </w:numPr>
       </w:pPr>
       <w:r>
-        <w:t>Collated Payment Methods - This option groups Svea payment methods together, and you can customize various settings. This is the recommended option.</w:t>
+        <w:t xml:space="preserve">Pay Now / Pay Later Split Payment Methods – This option groups Svea payment methods into 4 subgroups = Pay </w:t>
+      </w:r>
+      <w:proofErr w:type="gramStart"/>
+      <w:r>
+        <w:t>With</w:t>
+      </w:r>
+      <w:proofErr w:type="gramEnd"/>
+      <w:r>
+        <w:t xml:space="preserve"> Online Banking, Pay With Mobile Payment, Pay With Card, Pay Later. You can configure various settings, like which payment methods to show in each </w:t>
+      </w:r>
+      <w:r>
+        <w:lastRenderedPageBreak/>
+        <w:t xml:space="preserve">subgroup. </w:t>
+      </w:r>
+      <w:r>
+        <w:t>This is the recommended option.</w:t>
       </w:r>
     </w:p>
     <w:p>
@@ -5078,7 +4735,7 @@
         </w:numPr>
       </w:pPr>
       <w:r>
-        <w:t>Separate Payment Methods - This option activates individual Svea payment methods.</w:t>
+        <w:t>Collated Payment Methods - This option groups Svea payment methods together, and you can customize various settings.</w:t>
       </w:r>
     </w:p>
     <w:p>
@@ -5090,19 +4747,228 @@
         </w:numPr>
       </w:pPr>
       <w:r>
+        <w:t>Separate Payment Methods - This option activates individual Svea payment methods.</w:t>
+      </w:r>
+    </w:p>
+    <w:p>
+      <w:pPr>
+        <w:pStyle w:val="Textbody"/>
+        <w:numPr>
+          <w:ilvl w:val="0"/>
+          <w:numId w:val="2"/>
+        </w:numPr>
+      </w:pPr>
+      <w:r>
+        <w:t>Redirect to the Svea Selection Page - With this option, the payment method redirects to the Svea website for the final payment method selection.</w:t>
+      </w:r>
+    </w:p>
+    <w:p>
+      <w:pPr>
+        <w:pStyle w:val="Heading3"/>
+      </w:pPr>
+      <w:bookmarkStart w:id="82" w:name="_Toc227579917"/>
+      <w:r>
+        <w:t>Pay Now / Pay Later Split Payment Methods</w:t>
+      </w:r>
+      <w:bookmarkEnd w:id="82"/>
+    </w:p>
+    <w:p>
+      <w:pPr>
+        <w:pStyle w:val="Textbody"/>
+      </w:pPr>
+      <w:r>
+        <w:t>Ensure that the Enabled option is set to Yes in the Common section. This section contains the main title that appears on the checkout page for payment options in Magento.</w:t>
+      </w:r>
+    </w:p>
+    <w:p>
+      <w:pPr>
+        <w:pStyle w:val="Textbody"/>
+      </w:pPr>
+      <w:r>
+        <w:drawing>
+          <wp:inline distT="0" distB="0" distL="0" distR="0" wp14:anchorId="12AE919B" wp14:editId="061B92DC">
+            <wp:extent cx="5353797" cy="3829584"/>
+            <wp:effectExtent l="0" t="0" r="0" b="0"/>
+            <wp:docPr id="1977114394" name="Picture 1" descr="A screenshot of a computer screen&#10;&#10;AI-generated content may be incorrect."/>
+            <wp:cNvGraphicFramePr>
+              <a:graphicFrameLocks xmlns:a="http://schemas.openxmlformats.org/drawingml/2006/main" noChangeAspect="1"/>
+            </wp:cNvGraphicFramePr>
+            <a:graphic xmlns:a="http://schemas.openxmlformats.org/drawingml/2006/main">
+              <a:graphicData uri="http://schemas.openxmlformats.org/drawingml/2006/picture">
+                <pic:pic xmlns:pic="http://schemas.openxmlformats.org/drawingml/2006/picture">
+                  <pic:nvPicPr>
+                    <pic:cNvPr id="1977114394" name="Picture 1" descr="A screenshot of a computer screen&#10;&#10;AI-generated content may be incorrect."/>
+                    <pic:cNvPicPr/>
+                  </pic:nvPicPr>
+                  <pic:blipFill>
+                    <a:blip r:embed="rId17"/>
+                    <a:stretch>
+                      <a:fillRect/>
+                    </a:stretch>
+                  </pic:blipFill>
+                  <pic:spPr>
+                    <a:xfrm>
+                      <a:off x="0" y="0"/>
+                      <a:ext cx="5353797" cy="3829584"/>
+                    </a:xfrm>
+                    <a:prstGeom prst="rect">
+                      <a:avLst/>
+                    </a:prstGeom>
+                  </pic:spPr>
+                </pic:pic>
+              </a:graphicData>
+            </a:graphic>
+          </wp:inline>
+        </w:drawing>
+      </w:r>
+    </w:p>
+    <w:p>
+      <w:pPr>
+        <w:pStyle w:val="Textbody"/>
+      </w:pPr>
+      <w:r>
+        <w:t xml:space="preserve">Under the Common section, there are </w:t>
+      </w:r>
+      <w:r>
+        <w:t xml:space="preserve">four </w:t>
+      </w:r>
+      <w:r>
+        <w:t xml:space="preserve">subgroups of Payment methods that come with default titles. These subgroups </w:t>
+      </w:r>
+      <w:r>
+        <w:t xml:space="preserve">are divided by payment type and </w:t>
+      </w:r>
+      <w:r>
+        <w:t xml:space="preserve">offer various payment methods that sellers can choose from. You are free to customize the title of each subgroup and select the payment methods that you want to make </w:t>
+      </w:r>
+      <w:proofErr w:type="gramStart"/>
+      <w:r>
+        <w:t>available</w:t>
+      </w:r>
+      <w:r>
+        <w:t xml:space="preserve">  for</w:t>
+      </w:r>
+      <w:proofErr w:type="gramEnd"/>
+      <w:r>
+        <w:t xml:space="preserve"> each subgroup</w:t>
+      </w:r>
+      <w:r>
+        <w:t>.</w:t>
+      </w:r>
+    </w:p>
+    <w:p>
+      <w:pPr>
+        <w:pStyle w:val="Textbody"/>
+      </w:pPr>
+      <w:r>
+        <w:t xml:space="preserve">If you wish, you can also set a default </w:t>
+      </w:r>
+      <w:proofErr w:type="gramStart"/>
+      <w:r>
+        <w:t>invoicing</w:t>
+      </w:r>
+      <w:proofErr w:type="gramEnd"/>
+      <w:r>
+        <w:t xml:space="preserve"> fee for all payment methods. Alternatively, you can set the fee individually for each payment method by adding the details in the table view provided. The </w:t>
+      </w:r>
+      <w:proofErr w:type="gramStart"/>
+      <w:r>
+        <w:t>invoicing</w:t>
+      </w:r>
+      <w:proofErr w:type="gramEnd"/>
+      <w:r>
+        <w:t xml:space="preserve"> fee will be added to the payment amount.</w:t>
+      </w:r>
+    </w:p>
+    <w:p>
+      <w:pPr>
+        <w:pStyle w:val="Textbody"/>
+      </w:pPr>
+      <w:r>
+        <w:t>Remember to click Save Config after configuration changes and flush Magento cache.</w:t>
+      </w:r>
+    </w:p>
+    <w:p>
+      <w:pPr>
+        <w:pStyle w:val="Textbody"/>
+      </w:pPr>
+      <w:r>
+        <w:t xml:space="preserve">Example of </w:t>
+      </w:r>
+      <w:r>
+        <w:t>Pay Now / Pay Later Split</w:t>
+      </w:r>
+      <w:r>
+        <w:t xml:space="preserve"> payment methods on Checkout page</w:t>
+      </w:r>
+      <w:r>
+        <w:t>:</w:t>
+      </w:r>
+    </w:p>
+    <w:p>
+      <w:pPr>
+        <w:pStyle w:val="Textbody"/>
+      </w:pPr>
+      <w:r>
         <w:lastRenderedPageBreak/>
-        <w:t>Redirect to the Svea Selection Page - With this option, the payment method redirects to the Svea website for the final payment method selection.</w:t>
+        <w:drawing>
+          <wp:inline distT="0" distB="0" distL="0" distR="0" wp14:anchorId="28B12F5B" wp14:editId="3291E40F">
+            <wp:extent cx="5572903" cy="6592220"/>
+            <wp:effectExtent l="0" t="0" r="8890" b="0"/>
+            <wp:docPr id="1105269053" name="Picture 1" descr="A screenshot of a phone&#10;&#10;AI-generated content may be incorrect."/>
+            <wp:cNvGraphicFramePr>
+              <a:graphicFrameLocks xmlns:a="http://schemas.openxmlformats.org/drawingml/2006/main" noChangeAspect="1"/>
+            </wp:cNvGraphicFramePr>
+            <a:graphic xmlns:a="http://schemas.openxmlformats.org/drawingml/2006/main">
+              <a:graphicData uri="http://schemas.openxmlformats.org/drawingml/2006/picture">
+                <pic:pic xmlns:pic="http://schemas.openxmlformats.org/drawingml/2006/picture">
+                  <pic:nvPicPr>
+                    <pic:cNvPr id="1105269053" name="Picture 1" descr="A screenshot of a phone&#10;&#10;AI-generated content may be incorrect."/>
+                    <pic:cNvPicPr/>
+                  </pic:nvPicPr>
+                  <pic:blipFill>
+                    <a:blip r:embed="rId18"/>
+                    <a:stretch>
+                      <a:fillRect/>
+                    </a:stretch>
+                  </pic:blipFill>
+                  <pic:spPr>
+                    <a:xfrm>
+                      <a:off x="0" y="0"/>
+                      <a:ext cx="5572903" cy="6592220"/>
+                    </a:xfrm>
+                    <a:prstGeom prst="rect">
+                      <a:avLst/>
+                    </a:prstGeom>
+                  </pic:spPr>
+                </pic:pic>
+              </a:graphicData>
+            </a:graphic>
+          </wp:inline>
+        </w:drawing>
       </w:r>
     </w:p>
     <w:p>
       <w:pPr>
         <w:pStyle w:val="Heading3"/>
       </w:pPr>
-      <w:bookmarkStart w:id="82" w:name="_Toc216856849"/>
-      <w:r>
-        <w:t>Collated payment methods</w:t>
-      </w:r>
-      <w:bookmarkEnd w:id="82"/>
+      <w:bookmarkStart w:id="83" w:name="_Toc227579918"/>
+      <w:r>
+        <w:t xml:space="preserve">Collated </w:t>
+      </w:r>
+      <w:r>
+        <w:t>P</w:t>
+      </w:r>
+      <w:r>
+        <w:t xml:space="preserve">ayment </w:t>
+      </w:r>
+      <w:r>
+        <w:t>M</w:t>
+      </w:r>
+      <w:r>
+        <w:t>ethods</w:t>
+      </w:r>
+      <w:bookmarkEnd w:id="83"/>
     </w:p>
     <w:p>
       <w:pPr>
@@ -5120,6 +4986,7 @@
         <w:rPr>
           <w:noProof/>
         </w:rPr>
+        <w:lastRenderedPageBreak/>
         <w:drawing>
           <wp:inline distT="0" distB="0" distL="0" distR="0" wp14:anchorId="4CFA95C4" wp14:editId="44504D61">
             <wp:extent cx="6188710" cy="2326640"/>
@@ -5138,7 +5005,7 @@
                     </pic:cNvPicPr>
                   </pic:nvPicPr>
                   <pic:blipFill>
-                    <a:blip r:embed="rId17"/>
+                    <a:blip r:embed="rId19"/>
                     <a:stretch>
                       <a:fillRect/>
                     </a:stretch>
@@ -5190,6 +5057,9 @@
       </w:pPr>
       <w:r>
         <w:t>Example of collated payment methods on Checkout page</w:t>
+      </w:r>
+      <w:r>
+        <w:t>:</w:t>
       </w:r>
       <w:r>
         <w:br/>
@@ -5216,7 +5086,7 @@
                     </pic:cNvPicPr>
                   </pic:nvPicPr>
                   <pic:blipFill>
-                    <a:blip r:embed="rId18"/>
+                    <a:blip r:embed="rId20"/>
                     <a:stretch>
                       <a:fillRect/>
                     </a:stretch>
@@ -5242,11 +5112,11 @@
       <w:pPr>
         <w:pStyle w:val="Heading3"/>
       </w:pPr>
-      <w:bookmarkStart w:id="83" w:name="_Toc216856850"/>
+      <w:bookmarkStart w:id="84" w:name="_Toc227579919"/>
       <w:r>
         <w:t>Separate payment methods</w:t>
       </w:r>
-      <w:bookmarkEnd w:id="83"/>
+      <w:bookmarkEnd w:id="84"/>
     </w:p>
     <w:p>
       <w:pPr>
@@ -5261,11 +5131,7 @@
         <w:pStyle w:val="Textbody"/>
       </w:pPr>
       <w:r>
-        <w:t xml:space="preserve">Enable the selected payment method groups and add payment methods under each group or use the default system setting. You can change the header of the payment method group and select the </w:t>
-      </w:r>
-      <w:r>
-        <w:lastRenderedPageBreak/>
-        <w:t>order of the payment method groups to be shown at the checkout.</w:t>
+        <w:t>Enable the selected payment method groups and add payment methods under each group or use the default system setting. You can change the header of the payment method group and select the order of the payment method groups to be shown at the checkout.</w:t>
       </w:r>
     </w:p>
     <w:p>
@@ -5284,6 +5150,7 @@
         <w:rPr>
           <w:noProof/>
         </w:rPr>
+        <w:lastRenderedPageBreak/>
         <w:drawing>
           <wp:inline distT="0" distB="0" distL="0" distR="0" wp14:anchorId="7FC7A38B" wp14:editId="28DA1152">
             <wp:extent cx="6188710" cy="2190750"/>
@@ -5302,7 +5169,7 @@
                     </pic:cNvPicPr>
                   </pic:nvPicPr>
                   <pic:blipFill>
-                    <a:blip r:embed="rId19"/>
+                    <a:blip r:embed="rId21"/>
                     <a:stretch>
                       <a:fillRect/>
                     </a:stretch>
@@ -5328,11 +5195,11 @@
       <w:pPr>
         <w:pStyle w:val="Heading3"/>
       </w:pPr>
-      <w:bookmarkStart w:id="84" w:name="_Toc216856851"/>
+      <w:bookmarkStart w:id="85" w:name="_Toc227579920"/>
       <w:r>
         <w:t>Redirect to Svea’s Payment Method Selection Page</w:t>
       </w:r>
-      <w:bookmarkEnd w:id="84"/>
+      <w:bookmarkEnd w:id="85"/>
     </w:p>
     <w:p>
       <w:pPr>
@@ -5368,7 +5235,7 @@
                     </pic:cNvPicPr>
                   </pic:nvPicPr>
                   <pic:blipFill>
-                    <a:blip r:embed="rId20"/>
+                    <a:blip r:embed="rId22"/>
                     <a:stretch>
                       <a:fillRect/>
                     </a:stretch>
@@ -5433,7 +5300,7 @@
                     </pic:cNvPicPr>
                   </pic:nvPicPr>
                   <pic:blipFill>
-                    <a:blip r:embed="rId21"/>
+                    <a:blip r:embed="rId23"/>
                     <a:stretch>
                       <a:fillRect/>
                     </a:stretch>
@@ -5464,11 +5331,11 @@
       <w:pPr>
         <w:pStyle w:val="Heading2"/>
       </w:pPr>
-      <w:bookmarkStart w:id="85" w:name="_Toc216856852"/>
+      <w:bookmarkStart w:id="86" w:name="_Toc227579921"/>
       <w:r>
         <w:t>Svea Payments Configuration</w:t>
       </w:r>
-      <w:bookmarkEnd w:id="85"/>
+      <w:bookmarkEnd w:id="86"/>
     </w:p>
     <w:p>
       <w:pPr>
@@ -5515,7 +5382,7 @@
                     </pic:cNvPicPr>
                   </pic:nvPicPr>
                   <pic:blipFill>
-                    <a:blip r:embed="rId22"/>
+                    <a:blip r:embed="rId24"/>
                     <a:stretch>
                       <a:fillRect/>
                     </a:stretch>
@@ -5619,7 +5486,7 @@
             <w:r>
               <w:t xml:space="preserve">You get your production credentials by contacting Svea sales or for testing environment, see </w:t>
             </w:r>
-            <w:hyperlink r:id="rId23">
+            <w:hyperlink r:id="rId25">
               <w:r>
                 <w:rPr>
                   <w:rStyle w:val="Hyperlink"/>
@@ -6188,7 +6055,6 @@
               <w:pStyle w:val="Textbody"/>
             </w:pPr>
             <w:r>
-              <w:lastRenderedPageBreak/>
               <w:t>Enable refunds after settlement</w:t>
             </w:r>
           </w:p>
@@ -6252,11 +6118,11 @@
       <w:pPr>
         <w:pStyle w:val="Heading2"/>
       </w:pPr>
-      <w:bookmarkStart w:id="86" w:name="_Toc216856853"/>
+      <w:bookmarkStart w:id="87" w:name="_Toc227579922"/>
       <w:r>
         <w:t>Svea Part Payment Calculator</w:t>
       </w:r>
-      <w:bookmarkEnd w:id="86"/>
+      <w:bookmarkEnd w:id="87"/>
     </w:p>
     <w:p>
       <w:pPr>
@@ -6319,7 +6185,7 @@
                     </pic:cNvPicPr>
                   </pic:nvPicPr>
                   <pic:blipFill>
-                    <a:blip r:embed="rId24"/>
+                    <a:blip r:embed="rId26"/>
                     <a:stretch>
                       <a:fillRect/>
                     </a:stretch>
@@ -6451,7 +6317,7 @@
                     </pic:cNvPicPr>
                   </pic:nvPicPr>
                   <pic:blipFill>
-                    <a:blip r:embed="rId25"/>
+                    <a:blip r:embed="rId27"/>
                     <a:stretch>
                       <a:fillRect/>
                     </a:stretch>
@@ -6502,7 +6368,7 @@
                     </pic:cNvPicPr>
                   </pic:nvPicPr>
                   <pic:blipFill>
-                    <a:blip r:embed="rId26"/>
+                    <a:blip r:embed="rId28"/>
                     <a:stretch>
                       <a:fillRect/>
                     </a:stretch>
@@ -6536,29 +6402,41 @@
       <w:pPr>
         <w:pStyle w:val="Heading2"/>
       </w:pPr>
-      <w:bookmarkStart w:id="87" w:name="_Toc216856854"/>
+      <w:bookmarkStart w:id="88" w:name="_Toc227579923"/>
       <w:r>
         <w:lastRenderedPageBreak/>
         <w:t>Additional features</w:t>
       </w:r>
-      <w:bookmarkEnd w:id="87"/>
+      <w:bookmarkEnd w:id="88"/>
     </w:p>
     <w:p>
       <w:pPr>
         <w:pStyle w:val="Heading3"/>
       </w:pPr>
-      <w:bookmarkStart w:id="88" w:name="_Toc216856855"/>
+      <w:bookmarkStart w:id="89" w:name="_Toc227579924"/>
       <w:r>
         <w:t>Payment Fees</w:t>
       </w:r>
-      <w:bookmarkEnd w:id="88"/>
-    </w:p>
-    <w:p>
-      <w:pPr>
-        <w:pStyle w:val="Textbody"/>
-      </w:pPr>
-      <w:r>
-        <w:t>The payment module has support for defining invoicing fees for each sub method under each payment method, including Collated payment method. For example, with "</w:t>
+      <w:bookmarkEnd w:id="89"/>
+    </w:p>
+    <w:p>
+      <w:pPr>
+        <w:pStyle w:val="Textbody"/>
+      </w:pPr>
+      <w:r>
+        <w:t xml:space="preserve">The payment module has support for defining invoicing fees for each sub method under each payment method, including </w:t>
+      </w:r>
+      <w:r>
+        <w:t xml:space="preserve">Pay Now / Pay Later Split &amp; </w:t>
+      </w:r>
+      <w:r>
+        <w:t>Collated payment method</w:t>
+      </w:r>
+      <w:r>
+        <w:t>s</w:t>
+      </w:r>
+      <w:r>
+        <w:t>. For example, with "</w:t>
       </w:r>
       <w:proofErr w:type="gramStart"/>
       <w:r>
@@ -6566,15 +6444,7 @@
       </w:r>
       <w:proofErr w:type="gramEnd"/>
       <w:r>
-        <w:t>01=</w:t>
-      </w:r>
-      <w:proofErr w:type="gramStart"/>
-      <w:r>
-        <w:t>5;FI</w:t>
-      </w:r>
-      <w:proofErr w:type="gramEnd"/>
-      <w:r>
-        <w:t>06=7.5" the fee in quote gets resolved based on the selected method in the following way:</w:t>
+        <w:t>01=5;FI06=7.5" the fee in quote gets resolved based on the selected method in the following way:</w:t>
       </w:r>
     </w:p>
     <w:p>
@@ -6605,11 +6475,11 @@
       <w:pPr>
         <w:pStyle w:val="Heading3"/>
       </w:pPr>
-      <w:bookmarkStart w:id="89" w:name="_Toc216856856"/>
+      <w:bookmarkStart w:id="90" w:name="_Toc227579925"/>
       <w:r>
         <w:t>Delayed capture</w:t>
       </w:r>
-      <w:bookmarkEnd w:id="89"/>
+      <w:bookmarkEnd w:id="90"/>
     </w:p>
     <w:p>
       <w:pPr>
@@ -6639,11 +6509,11 @@
       <w:pPr>
         <w:pStyle w:val="Heading3"/>
       </w:pPr>
-      <w:bookmarkStart w:id="90" w:name="_Toc216856857"/>
+      <w:bookmarkStart w:id="91" w:name="_Toc227579926"/>
       <w:r>
         <w:t>Automatic status query</w:t>
       </w:r>
-      <w:bookmarkEnd w:id="90"/>
+      <w:bookmarkEnd w:id="91"/>
     </w:p>
     <w:p>
       <w:pPr>
@@ -6700,12 +6570,12 @@
         <w:pStyle w:val="Heading1"/>
         <w:spacing w:before="0"/>
       </w:pPr>
-      <w:bookmarkStart w:id="91" w:name="_Toc216856858"/>
+      <w:bookmarkStart w:id="92" w:name="_Toc227579927"/>
       <w:r>
         <w:lastRenderedPageBreak/>
         <w:t>Order administration</w:t>
       </w:r>
-      <w:bookmarkEnd w:id="91"/>
+      <w:bookmarkEnd w:id="92"/>
     </w:p>
     <w:p>
       <w:pPr>
@@ -6749,7 +6619,7 @@
                     </pic:cNvPicPr>
                   </pic:nvPicPr>
                   <pic:blipFill>
-                    <a:blip r:embed="rId27"/>
+                    <a:blip r:embed="rId29"/>
                     <a:stretch>
                       <a:fillRect/>
                     </a:stretch>
@@ -6803,7 +6673,7 @@
                     </pic:cNvPicPr>
                   </pic:nvPicPr>
                   <pic:blipFill>
-                    <a:blip r:embed="rId28"/>
+                    <a:blip r:embed="rId30"/>
                     <a:stretch>
                       <a:fillRect/>
                     </a:stretch>
@@ -6850,12 +6720,12 @@
         <w:pStyle w:val="Heading2"/>
         <w:spacing w:before="0"/>
       </w:pPr>
-      <w:bookmarkStart w:id="92" w:name="_Toc216856859"/>
+      <w:bookmarkStart w:id="93" w:name="_Toc227579928"/>
       <w:r>
         <w:lastRenderedPageBreak/>
         <w:t>Refunding order</w:t>
       </w:r>
-      <w:bookmarkEnd w:id="92"/>
+      <w:bookmarkEnd w:id="93"/>
     </w:p>
     <w:p>
       <w:pPr>
@@ -6891,7 +6761,7 @@
                     </pic:cNvPicPr>
                   </pic:nvPicPr>
                   <pic:blipFill>
-                    <a:blip r:embed="rId29"/>
+                    <a:blip r:embed="rId31"/>
                     <a:stretch>
                       <a:fillRect/>
                     </a:stretch>
@@ -6946,7 +6816,7 @@
                     </pic:cNvPicPr>
                   </pic:nvPicPr>
                   <pic:blipFill>
-                    <a:blip r:embed="rId30"/>
+                    <a:blip r:embed="rId32"/>
                     <a:stretch>
                       <a:fillRect/>
                     </a:stretch>
@@ -7050,7 +6920,7 @@
                     </pic:cNvPicPr>
                   </pic:nvPicPr>
                   <pic:blipFill>
-                    <a:blip r:embed="rId31"/>
+                    <a:blip r:embed="rId33"/>
                     <a:stretch>
                       <a:fillRect/>
                     </a:stretch>
@@ -7091,11 +6961,11 @@
       <w:pPr>
         <w:pStyle w:val="Heading1"/>
       </w:pPr>
-      <w:bookmarkStart w:id="93" w:name="_Toc216856860"/>
+      <w:bookmarkStart w:id="94" w:name="_Toc227579929"/>
       <w:r>
         <w:t>Logging</w:t>
       </w:r>
-      <w:bookmarkEnd w:id="93"/>
+      <w:bookmarkEnd w:id="94"/>
     </w:p>
     <w:p>
       <w:pPr>
@@ -7145,11 +7015,11 @@
       <w:pPr>
         <w:pStyle w:val="Heading1"/>
       </w:pPr>
-      <w:bookmarkStart w:id="94" w:name="_Toc216856861"/>
+      <w:bookmarkStart w:id="95" w:name="_Toc227579930"/>
       <w:r>
         <w:t>Resolving issues and support</w:t>
       </w:r>
-      <w:bookmarkEnd w:id="94"/>
+      <w:bookmarkEnd w:id="95"/>
     </w:p>
     <w:p>
       <w:pPr>
@@ -7178,7 +7048,7 @@
       <w:r>
         <w:t xml:space="preserve">For General support, please contact </w:t>
       </w:r>
-      <w:hyperlink r:id="rId32">
+      <w:hyperlink r:id="rId34">
         <w:r>
           <w:rPr>
             <w:rStyle w:val="Hyperlink"/>
@@ -7201,7 +7071,7 @@
       <w:r>
         <w:t xml:space="preserve">For Technical support, please contact </w:t>
       </w:r>
-      <w:hyperlink r:id="rId33">
+      <w:hyperlink r:id="rId35">
         <w:r>
           <w:rPr>
             <w:rStyle w:val="Hyperlink"/>
@@ -7222,11 +7092,11 @@
       <w:pPr>
         <w:pStyle w:val="Heading2"/>
       </w:pPr>
-      <w:bookmarkStart w:id="95" w:name="_Toc216856862"/>
+      <w:bookmarkStart w:id="96" w:name="_Toc227579931"/>
       <w:r>
         <w:t>Common problems and solutions</w:t>
       </w:r>
-      <w:bookmarkEnd w:id="95"/>
+      <w:bookmarkEnd w:id="96"/>
     </w:p>
     <w:p>
       <w:pPr>
@@ -7237,15 +7107,7 @@
         </w:numPr>
       </w:pPr>
       <w:r>
-        <w:t xml:space="preserve">If you get `No payment methods available` on payment page, you might check the </w:t>
-      </w:r>
-      <w:proofErr w:type="spellStart"/>
-      <w:r>
-        <w:t>sellerid</w:t>
-      </w:r>
-      <w:proofErr w:type="spellEnd"/>
-      <w:r>
-        <w:t>, secret key and endpoint once more.</w:t>
+        <w:t>If you get `No payment methods available` on payment page, you might check the sellerid, secret key and endpoint once more.</w:t>
       </w:r>
     </w:p>
     <w:p>
@@ -7259,10 +7121,10 @@
       </w:pPr>
     </w:p>
     <w:sectPr>
-      <w:headerReference w:type="default" r:id="rId34"/>
-      <w:footerReference w:type="default" r:id="rId35"/>
-      <w:headerReference w:type="first" r:id="rId36"/>
-      <w:footerReference w:type="first" r:id="rId37"/>
+      <w:headerReference w:type="default" r:id="rId36"/>
+      <w:footerReference w:type="default" r:id="rId37"/>
+      <w:headerReference w:type="first" r:id="rId38"/>
+      <w:footerReference w:type="first" r:id="rId39"/>
       <w:pgSz w:w="11906" w:h="16838"/>
       <w:pgMar w:top="1440" w:right="1080" w:bottom="1440" w:left="1080" w:header="900" w:footer="125" w:gutter="0"/>
       <w:cols w:space="720"/>
@@ -7417,7 +7279,6 @@
               <w:b/>
               <w:sz w:val="14"/>
               <w:szCs w:val="14"/>
-              <w:lang w:val="fi-FI"/>
             </w:rPr>
           </w:pPr>
           <w:r>
@@ -7426,7 +7287,6 @@
               <w:b/>
               <w:sz w:val="14"/>
               <w:szCs w:val="14"/>
-              <w:lang w:val="fi-FI"/>
             </w:rPr>
             <w:t>Svea Payments Oy</w:t>
           </w:r>
@@ -7439,7 +7299,6 @@
               <w:rFonts w:ascii="Arial" w:hAnsi="Arial" w:cs="Arial"/>
               <w:sz w:val="12"/>
               <w:szCs w:val="12"/>
-              <w:lang w:val="fi-FI"/>
             </w:rPr>
           </w:pPr>
           <w:r>
@@ -7447,7 +7306,6 @@
               <w:rFonts w:ascii="Arial" w:hAnsi="Arial" w:cs="Arial"/>
               <w:sz w:val="12"/>
               <w:szCs w:val="12"/>
-              <w:lang w:val="fi-FI"/>
             </w:rPr>
             <w:t xml:space="preserve">Y-tunnus: </w:t>
           </w:r>
@@ -7457,7 +7315,6 @@
               <w:color w:val="000000"/>
               <w:sz w:val="12"/>
               <w:szCs w:val="12"/>
-              <w:lang w:val="fi-FI"/>
             </w:rPr>
             <w:t>2121703-0</w:t>
           </w:r>
@@ -7737,7 +7594,6 @@
               <w:b/>
               <w:sz w:val="14"/>
               <w:szCs w:val="14"/>
-              <w:lang w:val="fi-FI"/>
             </w:rPr>
           </w:pPr>
           <w:r>
@@ -7746,7 +7602,6 @@
               <w:b/>
               <w:sz w:val="14"/>
               <w:szCs w:val="14"/>
-              <w:lang w:val="fi-FI"/>
             </w:rPr>
             <w:t>Svea Payments Oy</w:t>
           </w:r>
@@ -7759,7 +7614,6 @@
               <w:rFonts w:ascii="Arial" w:hAnsi="Arial" w:cs="Arial"/>
               <w:sz w:val="12"/>
               <w:szCs w:val="12"/>
-              <w:lang w:val="fi-FI"/>
             </w:rPr>
           </w:pPr>
           <w:r>
@@ -7767,7 +7621,6 @@
               <w:rFonts w:ascii="Arial" w:hAnsi="Arial" w:cs="Arial"/>
               <w:sz w:val="12"/>
               <w:szCs w:val="12"/>
-              <w:lang w:val="fi-FI"/>
             </w:rPr>
             <w:t xml:space="preserve">Y-tunnus: </w:t>
           </w:r>
@@ -7777,7 +7630,6 @@
               <w:color w:val="000000"/>
               <w:sz w:val="12"/>
               <w:szCs w:val="12"/>
-              <w:lang w:val="fi-FI"/>
             </w:rPr>
             <w:t>2121703-0</w:t>
           </w:r>
@@ -8047,7 +7899,15 @@
         <w:sz w:val="20"/>
         <w:szCs w:val="20"/>
       </w:rPr>
-      <w:t>28</w:t>
+      <w:t>2</w:t>
+    </w:r>
+    <w:r>
+      <w:rPr>
+        <w:rFonts w:ascii="Arial" w:hAnsi="Arial" w:cs="Arial"/>
+        <w:sz w:val="20"/>
+        <w:szCs w:val="20"/>
+      </w:rPr>
+      <w:t>0</w:t>
     </w:r>
     <w:r>
       <w:rPr>
@@ -8063,7 +7923,7 @@
         <w:sz w:val="20"/>
         <w:szCs w:val="20"/>
       </w:rPr>
-      <w:t>8</w:t>
+      <w:t>4</w:t>
     </w:r>
     <w:r>
       <w:rPr>
@@ -8071,7 +7931,15 @@
         <w:sz w:val="20"/>
         <w:szCs w:val="20"/>
       </w:rPr>
-      <w:t>.2025</w:t>
+      <w:t>.202</w:t>
+    </w:r>
+    <w:r>
+      <w:rPr>
+        <w:rFonts w:ascii="Arial" w:hAnsi="Arial" w:cs="Arial"/>
+        <w:sz w:val="20"/>
+        <w:szCs w:val="20"/>
+      </w:rPr>
+      <w:t>6</w:t>
     </w:r>
   </w:p>
 </w:hdr>

</xml_diff>

<commit_message>
New Payment Method grouping
* New payment methods grouping: Pay Now / Pay Later Split
* Updated Docs/Manual for Pay Now / Pay Later Split Payment Methods
</commit_message>
<xml_diff>
--- a/docs/Manual - Payment Module for Adobe Commerce (Magento) - Svea Payments Finland.docx
+++ b/docs/Manual - Payment Module for Adobe Commerce (Magento) - Svea Payments Finland.docx
@@ -329,7 +329,7 @@
           <w:iCs/>
           <w:szCs w:val="22"/>
         </w:rPr>
-        <w:t>3</w:t>
+        <w:t>4</w:t>
       </w:r>
       <w:r>
         <w:br w:type="page"/>
@@ -378,7 +378,7 @@
               <w:rFonts w:asciiTheme="minorHAnsi" w:eastAsiaTheme="minorEastAsia" w:hAnsiTheme="minorHAnsi" w:cstheme="minorBidi"/>
               <w:noProof/>
               <w:szCs w:val="24"/>
-              <w:lang w:val="en-FI" w:eastAsia="en-FI" w:bidi="ar-SA"/>
+              <w:lang w:val="fi-FI" w:eastAsia="fi-FI" w:bidi="ar-SA"/>
               <w14:ligatures w14:val="standardContextual"/>
             </w:rPr>
           </w:pPr>
@@ -399,7 +399,7 @@
             </w:rPr>
             <w:fldChar w:fldCharType="separate"/>
           </w:r>
-          <w:hyperlink w:anchor="_Toc216856835" w:history="1">
+          <w:hyperlink w:anchor="_Toc227579903" w:history="1">
             <w:r>
               <w:rPr>
                 <w:rStyle w:val="Hyperlink"/>
@@ -412,7 +412,7 @@
                 <w:rFonts w:asciiTheme="minorHAnsi" w:eastAsiaTheme="minorEastAsia" w:hAnsiTheme="minorHAnsi" w:cstheme="minorBidi"/>
                 <w:noProof/>
                 <w:szCs w:val="24"/>
-                <w:lang w:val="en-FI" w:eastAsia="en-FI" w:bidi="ar-SA"/>
+                <w:lang w:val="fi-FI" w:eastAsia="fi-FI" w:bidi="ar-SA"/>
                 <w14:ligatures w14:val="standardContextual"/>
               </w:rPr>
               <w:tab/>
@@ -440,7 +440,7 @@
               <w:rPr>
                 <w:noProof/>
               </w:rPr>
-              <w:instrText xml:space="preserve"> PAGEREF _Toc216856835 \h </w:instrText>
+              <w:instrText xml:space="preserve"> PAGEREF _Toc227579903 \h </w:instrText>
             </w:r>
             <w:r>
               <w:rPr>
@@ -478,11 +478,11 @@
               <w:rFonts w:asciiTheme="minorHAnsi" w:eastAsiaTheme="minorEastAsia" w:hAnsiTheme="minorHAnsi" w:cstheme="minorBidi"/>
               <w:noProof/>
               <w:szCs w:val="24"/>
-              <w:lang w:val="en-FI" w:eastAsia="en-FI" w:bidi="ar-SA"/>
+              <w:lang w:val="fi-FI" w:eastAsia="fi-FI" w:bidi="ar-SA"/>
               <w14:ligatures w14:val="standardContextual"/>
             </w:rPr>
           </w:pPr>
-          <w:hyperlink w:anchor="_Toc216856836" w:history="1">
+          <w:hyperlink w:anchor="_Toc227579904" w:history="1">
             <w:r>
               <w:rPr>
                 <w:rStyle w:val="Hyperlink"/>
@@ -495,7 +495,7 @@
                 <w:rFonts w:asciiTheme="minorHAnsi" w:eastAsiaTheme="minorEastAsia" w:hAnsiTheme="minorHAnsi" w:cstheme="minorBidi"/>
                 <w:noProof/>
                 <w:szCs w:val="24"/>
-                <w:lang w:val="en-FI" w:eastAsia="en-FI" w:bidi="ar-SA"/>
+                <w:lang w:val="fi-FI" w:eastAsia="fi-FI" w:bidi="ar-SA"/>
                 <w14:ligatures w14:val="standardContextual"/>
               </w:rPr>
               <w:tab/>
@@ -523,7 +523,7 @@
               <w:rPr>
                 <w:noProof/>
               </w:rPr>
-              <w:instrText xml:space="preserve"> PAGEREF _Toc216856836 \h </w:instrText>
+              <w:instrText xml:space="preserve"> PAGEREF _Toc227579904 \h </w:instrText>
             </w:r>
             <w:r>
               <w:rPr>
@@ -561,11 +561,11 @@
               <w:rFonts w:asciiTheme="minorHAnsi" w:eastAsiaTheme="minorEastAsia" w:hAnsiTheme="minorHAnsi" w:cstheme="minorBidi"/>
               <w:noProof/>
               <w:szCs w:val="24"/>
-              <w:lang w:val="en-FI" w:eastAsia="en-FI" w:bidi="ar-SA"/>
+              <w:lang w:val="fi-FI" w:eastAsia="fi-FI" w:bidi="ar-SA"/>
               <w14:ligatures w14:val="standardContextual"/>
             </w:rPr>
           </w:pPr>
-          <w:hyperlink w:anchor="_Toc216856837" w:history="1">
+          <w:hyperlink w:anchor="_Toc227579905" w:history="1">
             <w:r>
               <w:rPr>
                 <w:rStyle w:val="Hyperlink"/>
@@ -578,7 +578,7 @@
                 <w:rFonts w:asciiTheme="minorHAnsi" w:eastAsiaTheme="minorEastAsia" w:hAnsiTheme="minorHAnsi" w:cstheme="minorBidi"/>
                 <w:noProof/>
                 <w:szCs w:val="24"/>
-                <w:lang w:val="en-FI" w:eastAsia="en-FI" w:bidi="ar-SA"/>
+                <w:lang w:val="fi-FI" w:eastAsia="fi-FI" w:bidi="ar-SA"/>
                 <w14:ligatures w14:val="standardContextual"/>
               </w:rPr>
               <w:tab/>
@@ -606,7 +606,7 @@
               <w:rPr>
                 <w:noProof/>
               </w:rPr>
-              <w:instrText xml:space="preserve"> PAGEREF _Toc216856837 \h </w:instrText>
+              <w:instrText xml:space="preserve"> PAGEREF _Toc227579905 \h </w:instrText>
             </w:r>
             <w:r>
               <w:rPr>
@@ -644,11 +644,11 @@
               <w:rFonts w:asciiTheme="minorHAnsi" w:eastAsiaTheme="minorEastAsia" w:hAnsiTheme="minorHAnsi" w:cstheme="minorBidi"/>
               <w:noProof/>
               <w:szCs w:val="24"/>
-              <w:lang w:val="en-FI" w:eastAsia="en-FI" w:bidi="ar-SA"/>
+              <w:lang w:val="fi-FI" w:eastAsia="fi-FI" w:bidi="ar-SA"/>
               <w14:ligatures w14:val="standardContextual"/>
             </w:rPr>
           </w:pPr>
-          <w:hyperlink w:anchor="_Toc216856838" w:history="1">
+          <w:hyperlink w:anchor="_Toc227579906" w:history="1">
             <w:r>
               <w:rPr>
                 <w:rStyle w:val="Hyperlink"/>
@@ -661,7 +661,7 @@
                 <w:rFonts w:asciiTheme="minorHAnsi" w:eastAsiaTheme="minorEastAsia" w:hAnsiTheme="minorHAnsi" w:cstheme="minorBidi"/>
                 <w:noProof/>
                 <w:szCs w:val="24"/>
-                <w:lang w:val="en-FI" w:eastAsia="en-FI" w:bidi="ar-SA"/>
+                <w:lang w:val="fi-FI" w:eastAsia="fi-FI" w:bidi="ar-SA"/>
                 <w14:ligatures w14:val="standardContextual"/>
               </w:rPr>
               <w:tab/>
@@ -689,7 +689,7 @@
               <w:rPr>
                 <w:noProof/>
               </w:rPr>
-              <w:instrText xml:space="preserve"> PAGEREF _Toc216856838 \h </w:instrText>
+              <w:instrText xml:space="preserve"> PAGEREF _Toc227579906 \h </w:instrText>
             </w:r>
             <w:r>
               <w:rPr>
@@ -727,11 +727,11 @@
               <w:rFonts w:asciiTheme="minorHAnsi" w:eastAsiaTheme="minorEastAsia" w:hAnsiTheme="minorHAnsi" w:cstheme="minorBidi"/>
               <w:noProof/>
               <w:szCs w:val="24"/>
-              <w:lang w:val="en-FI" w:eastAsia="en-FI" w:bidi="ar-SA"/>
+              <w:lang w:val="fi-FI" w:eastAsia="fi-FI" w:bidi="ar-SA"/>
               <w14:ligatures w14:val="standardContextual"/>
             </w:rPr>
           </w:pPr>
-          <w:hyperlink w:anchor="_Toc216856839" w:history="1">
+          <w:hyperlink w:anchor="_Toc227579907" w:history="1">
             <w:r>
               <w:rPr>
                 <w:rStyle w:val="Hyperlink"/>
@@ -744,7 +744,7 @@
                 <w:rFonts w:asciiTheme="minorHAnsi" w:eastAsiaTheme="minorEastAsia" w:hAnsiTheme="minorHAnsi" w:cstheme="minorBidi"/>
                 <w:noProof/>
                 <w:szCs w:val="24"/>
-                <w:lang w:val="en-FI" w:eastAsia="en-FI" w:bidi="ar-SA"/>
+                <w:lang w:val="fi-FI" w:eastAsia="fi-FI" w:bidi="ar-SA"/>
                 <w14:ligatures w14:val="standardContextual"/>
               </w:rPr>
               <w:tab/>
@@ -772,7 +772,7 @@
               <w:rPr>
                 <w:noProof/>
               </w:rPr>
-              <w:instrText xml:space="preserve"> PAGEREF _Toc216856839 \h </w:instrText>
+              <w:instrText xml:space="preserve"> PAGEREF _Toc227579907 \h </w:instrText>
             </w:r>
             <w:r>
               <w:rPr>
@@ -810,11 +810,11 @@
               <w:rFonts w:asciiTheme="minorHAnsi" w:eastAsiaTheme="minorEastAsia" w:hAnsiTheme="minorHAnsi" w:cstheme="minorBidi"/>
               <w:noProof/>
               <w:szCs w:val="24"/>
-              <w:lang w:val="en-FI" w:eastAsia="en-FI" w:bidi="ar-SA"/>
+              <w:lang w:val="fi-FI" w:eastAsia="fi-FI" w:bidi="ar-SA"/>
               <w14:ligatures w14:val="standardContextual"/>
             </w:rPr>
           </w:pPr>
-          <w:hyperlink w:anchor="_Toc216856840" w:history="1">
+          <w:hyperlink w:anchor="_Toc227579908" w:history="1">
             <w:r>
               <w:rPr>
                 <w:rStyle w:val="Hyperlink"/>
@@ -827,7 +827,7 @@
                 <w:rFonts w:asciiTheme="minorHAnsi" w:eastAsiaTheme="minorEastAsia" w:hAnsiTheme="minorHAnsi" w:cstheme="minorBidi"/>
                 <w:noProof/>
                 <w:szCs w:val="24"/>
-                <w:lang w:val="en-FI" w:eastAsia="en-FI" w:bidi="ar-SA"/>
+                <w:lang w:val="fi-FI" w:eastAsia="fi-FI" w:bidi="ar-SA"/>
                 <w14:ligatures w14:val="standardContextual"/>
               </w:rPr>
               <w:tab/>
@@ -855,7 +855,7 @@
               <w:rPr>
                 <w:noProof/>
               </w:rPr>
-              <w:instrText xml:space="preserve"> PAGEREF _Toc216856840 \h </w:instrText>
+              <w:instrText xml:space="preserve"> PAGEREF _Toc227579908 \h </w:instrText>
             </w:r>
             <w:r>
               <w:rPr>
@@ -893,11 +893,11 @@
               <w:rFonts w:asciiTheme="minorHAnsi" w:eastAsiaTheme="minorEastAsia" w:hAnsiTheme="minorHAnsi" w:cstheme="minorBidi"/>
               <w:noProof/>
               <w:szCs w:val="24"/>
-              <w:lang w:val="en-FI" w:eastAsia="en-FI" w:bidi="ar-SA"/>
+              <w:lang w:val="fi-FI" w:eastAsia="fi-FI" w:bidi="ar-SA"/>
               <w14:ligatures w14:val="standardContextual"/>
             </w:rPr>
           </w:pPr>
-          <w:hyperlink w:anchor="_Toc216856841" w:history="1">
+          <w:hyperlink w:anchor="_Toc227579909" w:history="1">
             <w:r>
               <w:rPr>
                 <w:rStyle w:val="Hyperlink"/>
@@ -910,7 +910,7 @@
                 <w:rFonts w:asciiTheme="minorHAnsi" w:eastAsiaTheme="minorEastAsia" w:hAnsiTheme="minorHAnsi" w:cstheme="minorBidi"/>
                 <w:noProof/>
                 <w:szCs w:val="24"/>
-                <w:lang w:val="en-FI" w:eastAsia="en-FI" w:bidi="ar-SA"/>
+                <w:lang w:val="fi-FI" w:eastAsia="fi-FI" w:bidi="ar-SA"/>
                 <w14:ligatures w14:val="standardContextual"/>
               </w:rPr>
               <w:tab/>
@@ -938,7 +938,7 @@
               <w:rPr>
                 <w:noProof/>
               </w:rPr>
-              <w:instrText xml:space="preserve"> PAGEREF _Toc216856841 \h </w:instrText>
+              <w:instrText xml:space="preserve"> PAGEREF _Toc227579909 \h </w:instrText>
             </w:r>
             <w:r>
               <w:rPr>
@@ -976,11 +976,11 @@
               <w:rFonts w:asciiTheme="minorHAnsi" w:eastAsiaTheme="minorEastAsia" w:hAnsiTheme="minorHAnsi" w:cstheme="minorBidi"/>
               <w:noProof/>
               <w:szCs w:val="24"/>
-              <w:lang w:val="en-FI" w:eastAsia="en-FI" w:bidi="ar-SA"/>
+              <w:lang w:val="fi-FI" w:eastAsia="fi-FI" w:bidi="ar-SA"/>
               <w14:ligatures w14:val="standardContextual"/>
             </w:rPr>
           </w:pPr>
-          <w:hyperlink w:anchor="_Toc216856842" w:history="1">
+          <w:hyperlink w:anchor="_Toc227579910" w:history="1">
             <w:r>
               <w:rPr>
                 <w:rStyle w:val="Hyperlink"/>
@@ -993,7 +993,7 @@
                 <w:rFonts w:asciiTheme="minorHAnsi" w:eastAsiaTheme="minorEastAsia" w:hAnsiTheme="minorHAnsi" w:cstheme="minorBidi"/>
                 <w:noProof/>
                 <w:szCs w:val="24"/>
-                <w:lang w:val="en-FI" w:eastAsia="en-FI" w:bidi="ar-SA"/>
+                <w:lang w:val="fi-FI" w:eastAsia="fi-FI" w:bidi="ar-SA"/>
                 <w14:ligatures w14:val="standardContextual"/>
               </w:rPr>
               <w:tab/>
@@ -1021,7 +1021,7 @@
               <w:rPr>
                 <w:noProof/>
               </w:rPr>
-              <w:instrText xml:space="preserve"> PAGEREF _Toc216856842 \h </w:instrText>
+              <w:instrText xml:space="preserve"> PAGEREF _Toc227579910 \h </w:instrText>
             </w:r>
             <w:r>
               <w:rPr>
@@ -1059,11 +1059,11 @@
               <w:rFonts w:asciiTheme="minorHAnsi" w:eastAsiaTheme="minorEastAsia" w:hAnsiTheme="minorHAnsi" w:cstheme="minorBidi"/>
               <w:noProof/>
               <w:szCs w:val="24"/>
-              <w:lang w:val="en-FI" w:eastAsia="en-FI" w:bidi="ar-SA"/>
+              <w:lang w:val="fi-FI" w:eastAsia="fi-FI" w:bidi="ar-SA"/>
               <w14:ligatures w14:val="standardContextual"/>
             </w:rPr>
           </w:pPr>
-          <w:hyperlink w:anchor="_Toc216856843" w:history="1">
+          <w:hyperlink w:anchor="_Toc227579911" w:history="1">
             <w:r>
               <w:rPr>
                 <w:rStyle w:val="Hyperlink"/>
@@ -1076,7 +1076,7 @@
                 <w:rFonts w:asciiTheme="minorHAnsi" w:eastAsiaTheme="minorEastAsia" w:hAnsiTheme="minorHAnsi" w:cstheme="minorBidi"/>
                 <w:noProof/>
                 <w:szCs w:val="24"/>
-                <w:lang w:val="en-FI" w:eastAsia="en-FI" w:bidi="ar-SA"/>
+                <w:lang w:val="fi-FI" w:eastAsia="fi-FI" w:bidi="ar-SA"/>
                 <w14:ligatures w14:val="standardContextual"/>
               </w:rPr>
               <w:tab/>
@@ -1104,7 +1104,7 @@
               <w:rPr>
                 <w:noProof/>
               </w:rPr>
-              <w:instrText xml:space="preserve"> PAGEREF _Toc216856843 \h </w:instrText>
+              <w:instrText xml:space="preserve"> PAGEREF _Toc227579911 \h </w:instrText>
             </w:r>
             <w:r>
               <w:rPr>
@@ -1142,11 +1142,11 @@
               <w:rFonts w:asciiTheme="minorHAnsi" w:eastAsiaTheme="minorEastAsia" w:hAnsiTheme="minorHAnsi" w:cstheme="minorBidi"/>
               <w:noProof/>
               <w:szCs w:val="24"/>
-              <w:lang w:val="en-FI" w:eastAsia="en-FI" w:bidi="ar-SA"/>
+              <w:lang w:val="fi-FI" w:eastAsia="fi-FI" w:bidi="ar-SA"/>
               <w14:ligatures w14:val="standardContextual"/>
             </w:rPr>
           </w:pPr>
-          <w:hyperlink w:anchor="_Toc216856844" w:history="1">
+          <w:hyperlink w:anchor="_Toc227579912" w:history="1">
             <w:r>
               <w:rPr>
                 <w:rStyle w:val="Hyperlink"/>
@@ -1159,7 +1159,7 @@
                 <w:rFonts w:asciiTheme="minorHAnsi" w:eastAsiaTheme="minorEastAsia" w:hAnsiTheme="minorHAnsi" w:cstheme="minorBidi"/>
                 <w:noProof/>
                 <w:szCs w:val="24"/>
-                <w:lang w:val="en-FI" w:eastAsia="en-FI" w:bidi="ar-SA"/>
+                <w:lang w:val="fi-FI" w:eastAsia="fi-FI" w:bidi="ar-SA"/>
                 <w14:ligatures w14:val="standardContextual"/>
               </w:rPr>
               <w:tab/>
@@ -1187,7 +1187,7 @@
               <w:rPr>
                 <w:noProof/>
               </w:rPr>
-              <w:instrText xml:space="preserve"> PAGEREF _Toc216856844 \h </w:instrText>
+              <w:instrText xml:space="preserve"> PAGEREF _Toc227579912 \h </w:instrText>
             </w:r>
             <w:r>
               <w:rPr>
@@ -1225,11 +1225,11 @@
               <w:rFonts w:asciiTheme="minorHAnsi" w:eastAsiaTheme="minorEastAsia" w:hAnsiTheme="minorHAnsi" w:cstheme="minorBidi"/>
               <w:noProof/>
               <w:szCs w:val="24"/>
-              <w:lang w:val="en-FI" w:eastAsia="en-FI" w:bidi="ar-SA"/>
+              <w:lang w:val="fi-FI" w:eastAsia="fi-FI" w:bidi="ar-SA"/>
               <w14:ligatures w14:val="standardContextual"/>
             </w:rPr>
           </w:pPr>
-          <w:hyperlink w:anchor="_Toc216856845" w:history="1">
+          <w:hyperlink w:anchor="_Toc227579913" w:history="1">
             <w:r>
               <w:rPr>
                 <w:rStyle w:val="Hyperlink"/>
@@ -1243,7 +1243,7 @@
                 <w:rFonts w:asciiTheme="minorHAnsi" w:eastAsiaTheme="minorEastAsia" w:hAnsiTheme="minorHAnsi" w:cstheme="minorBidi"/>
                 <w:noProof/>
                 <w:szCs w:val="24"/>
-                <w:lang w:val="en-FI" w:eastAsia="en-FI" w:bidi="ar-SA"/>
+                <w:lang w:val="fi-FI" w:eastAsia="fi-FI" w:bidi="ar-SA"/>
                 <w14:ligatures w14:val="standardContextual"/>
               </w:rPr>
               <w:tab/>
@@ -1272,7 +1272,7 @@
               <w:rPr>
                 <w:noProof/>
               </w:rPr>
-              <w:instrText xml:space="preserve"> PAGEREF _Toc216856845 \h </w:instrText>
+              <w:instrText xml:space="preserve"> PAGEREF _Toc227579913 \h </w:instrText>
             </w:r>
             <w:r>
               <w:rPr>
@@ -1310,11 +1310,11 @@
               <w:rFonts w:asciiTheme="minorHAnsi" w:eastAsiaTheme="minorEastAsia" w:hAnsiTheme="minorHAnsi" w:cstheme="minorBidi"/>
               <w:noProof/>
               <w:szCs w:val="24"/>
-              <w:lang w:val="en-FI" w:eastAsia="en-FI" w:bidi="ar-SA"/>
+              <w:lang w:val="fi-FI" w:eastAsia="fi-FI" w:bidi="ar-SA"/>
               <w14:ligatures w14:val="standardContextual"/>
             </w:rPr>
           </w:pPr>
-          <w:hyperlink w:anchor="_Toc216856846" w:history="1">
+          <w:hyperlink w:anchor="_Toc227579914" w:history="1">
             <w:r>
               <w:rPr>
                 <w:rStyle w:val="Hyperlink"/>
@@ -1327,7 +1327,7 @@
                 <w:rFonts w:asciiTheme="minorHAnsi" w:eastAsiaTheme="minorEastAsia" w:hAnsiTheme="minorHAnsi" w:cstheme="minorBidi"/>
                 <w:noProof/>
                 <w:szCs w:val="24"/>
-                <w:lang w:val="en-FI" w:eastAsia="en-FI" w:bidi="ar-SA"/>
+                <w:lang w:val="fi-FI" w:eastAsia="fi-FI" w:bidi="ar-SA"/>
                 <w14:ligatures w14:val="standardContextual"/>
               </w:rPr>
               <w:tab/>
@@ -1355,7 +1355,7 @@
               <w:rPr>
                 <w:noProof/>
               </w:rPr>
-              <w:instrText xml:space="preserve"> PAGEREF _Toc216856846 \h </w:instrText>
+              <w:instrText xml:space="preserve"> PAGEREF _Toc227579914 \h </w:instrText>
             </w:r>
             <w:r>
               <w:rPr>
@@ -1393,11 +1393,11 @@
               <w:rFonts w:asciiTheme="minorHAnsi" w:eastAsiaTheme="minorEastAsia" w:hAnsiTheme="minorHAnsi" w:cstheme="minorBidi"/>
               <w:noProof/>
               <w:szCs w:val="24"/>
-              <w:lang w:val="en-FI" w:eastAsia="en-FI" w:bidi="ar-SA"/>
+              <w:lang w:val="fi-FI" w:eastAsia="fi-FI" w:bidi="ar-SA"/>
               <w14:ligatures w14:val="standardContextual"/>
             </w:rPr>
           </w:pPr>
-          <w:hyperlink w:anchor="_Toc216856847" w:history="1">
+          <w:hyperlink w:anchor="_Toc227579915" w:history="1">
             <w:r>
               <w:rPr>
                 <w:rStyle w:val="Hyperlink"/>
@@ -1410,7 +1410,7 @@
                 <w:rFonts w:asciiTheme="minorHAnsi" w:eastAsiaTheme="minorEastAsia" w:hAnsiTheme="minorHAnsi" w:cstheme="minorBidi"/>
                 <w:noProof/>
                 <w:szCs w:val="24"/>
-                <w:lang w:val="en-FI" w:eastAsia="en-FI" w:bidi="ar-SA"/>
+                <w:lang w:val="fi-FI" w:eastAsia="fi-FI" w:bidi="ar-SA"/>
                 <w14:ligatures w14:val="standardContextual"/>
               </w:rPr>
               <w:tab/>
@@ -1438,7 +1438,7 @@
               <w:rPr>
                 <w:noProof/>
               </w:rPr>
-              <w:instrText xml:space="preserve"> PAGEREF _Toc216856847 \h </w:instrText>
+              <w:instrText xml:space="preserve"> PAGEREF _Toc227579915 \h </w:instrText>
             </w:r>
             <w:r>
               <w:rPr>
@@ -1476,11 +1476,11 @@
               <w:rFonts w:asciiTheme="minorHAnsi" w:eastAsiaTheme="minorEastAsia" w:hAnsiTheme="minorHAnsi" w:cstheme="minorBidi"/>
               <w:noProof/>
               <w:szCs w:val="24"/>
-              <w:lang w:val="en-FI" w:eastAsia="en-FI" w:bidi="ar-SA"/>
+              <w:lang w:val="fi-FI" w:eastAsia="fi-FI" w:bidi="ar-SA"/>
               <w14:ligatures w14:val="standardContextual"/>
             </w:rPr>
           </w:pPr>
-          <w:hyperlink w:anchor="_Toc216856848" w:history="1">
+          <w:hyperlink w:anchor="_Toc227579916" w:history="1">
             <w:r>
               <w:rPr>
                 <w:rStyle w:val="Hyperlink"/>
@@ -1493,7 +1493,7 @@
                 <w:rFonts w:asciiTheme="minorHAnsi" w:eastAsiaTheme="minorEastAsia" w:hAnsiTheme="minorHAnsi" w:cstheme="minorBidi"/>
                 <w:noProof/>
                 <w:szCs w:val="24"/>
-                <w:lang w:val="en-FI" w:eastAsia="en-FI" w:bidi="ar-SA"/>
+                <w:lang w:val="fi-FI" w:eastAsia="fi-FI" w:bidi="ar-SA"/>
                 <w14:ligatures w14:val="standardContextual"/>
               </w:rPr>
               <w:tab/>
@@ -1521,7 +1521,7 @@
               <w:rPr>
                 <w:noProof/>
               </w:rPr>
-              <w:instrText xml:space="preserve"> PAGEREF _Toc216856848 \h </w:instrText>
+              <w:instrText xml:space="preserve"> PAGEREF _Toc227579916 \h </w:instrText>
             </w:r>
             <w:r>
               <w:rPr>
@@ -1559,11 +1559,11 @@
               <w:rFonts w:asciiTheme="minorHAnsi" w:eastAsiaTheme="minorEastAsia" w:hAnsiTheme="minorHAnsi" w:cstheme="minorBidi"/>
               <w:noProof/>
               <w:szCs w:val="24"/>
-              <w:lang w:val="en-FI" w:eastAsia="en-FI" w:bidi="ar-SA"/>
+              <w:lang w:val="fi-FI" w:eastAsia="fi-FI" w:bidi="ar-SA"/>
               <w14:ligatures w14:val="standardContextual"/>
             </w:rPr>
           </w:pPr>
-          <w:hyperlink w:anchor="_Toc216856849" w:history="1">
+          <w:hyperlink w:anchor="_Toc227579917" w:history="1">
             <w:r>
               <w:rPr>
                 <w:rStyle w:val="Hyperlink"/>
@@ -1576,7 +1576,7 @@
                 <w:rFonts w:asciiTheme="minorHAnsi" w:eastAsiaTheme="minorEastAsia" w:hAnsiTheme="minorHAnsi" w:cstheme="minorBidi"/>
                 <w:noProof/>
                 <w:szCs w:val="24"/>
-                <w:lang w:val="en-FI" w:eastAsia="en-FI" w:bidi="ar-SA"/>
+                <w:lang w:val="fi-FI" w:eastAsia="fi-FI" w:bidi="ar-SA"/>
                 <w14:ligatures w14:val="standardContextual"/>
               </w:rPr>
               <w:tab/>
@@ -1586,7 +1586,7 @@
                 <w:rStyle w:val="Hyperlink"/>
                 <w:noProof/>
               </w:rPr>
-              <w:t>Collated payment methods</w:t>
+              <w:t>Pay Now / Pay Later Split Payment Methods</w:t>
             </w:r>
             <w:r>
               <w:rPr>
@@ -1604,7 +1604,7 @@
               <w:rPr>
                 <w:noProof/>
               </w:rPr>
-              <w:instrText xml:space="preserve"> PAGEREF _Toc216856849 \h </w:instrText>
+              <w:instrText xml:space="preserve"> PAGEREF _Toc227579917 \h </w:instrText>
             </w:r>
             <w:r>
               <w:rPr>
@@ -1642,11 +1642,11 @@
               <w:rFonts w:asciiTheme="minorHAnsi" w:eastAsiaTheme="minorEastAsia" w:hAnsiTheme="minorHAnsi" w:cstheme="minorBidi"/>
               <w:noProof/>
               <w:szCs w:val="24"/>
-              <w:lang w:val="en-FI" w:eastAsia="en-FI" w:bidi="ar-SA"/>
+              <w:lang w:val="fi-FI" w:eastAsia="fi-FI" w:bidi="ar-SA"/>
               <w14:ligatures w14:val="standardContextual"/>
             </w:rPr>
           </w:pPr>
-          <w:hyperlink w:anchor="_Toc216856850" w:history="1">
+          <w:hyperlink w:anchor="_Toc227579918" w:history="1">
             <w:r>
               <w:rPr>
                 <w:rStyle w:val="Hyperlink"/>
@@ -1659,7 +1659,7 @@
                 <w:rFonts w:asciiTheme="minorHAnsi" w:eastAsiaTheme="minorEastAsia" w:hAnsiTheme="minorHAnsi" w:cstheme="minorBidi"/>
                 <w:noProof/>
                 <w:szCs w:val="24"/>
-                <w:lang w:val="en-FI" w:eastAsia="en-FI" w:bidi="ar-SA"/>
+                <w:lang w:val="fi-FI" w:eastAsia="fi-FI" w:bidi="ar-SA"/>
                 <w14:ligatures w14:val="standardContextual"/>
               </w:rPr>
               <w:tab/>
@@ -1669,7 +1669,7 @@
                 <w:rStyle w:val="Hyperlink"/>
                 <w:noProof/>
               </w:rPr>
-              <w:t>Separate payment methods</w:t>
+              <w:t>Collated Payment Methods</w:t>
             </w:r>
             <w:r>
               <w:rPr>
@@ -1687,7 +1687,7 @@
               <w:rPr>
                 <w:noProof/>
               </w:rPr>
-              <w:instrText xml:space="preserve"> PAGEREF _Toc216856850 \h </w:instrText>
+              <w:instrText xml:space="preserve"> PAGEREF _Toc227579918 \h </w:instrText>
             </w:r>
             <w:r>
               <w:rPr>
@@ -1704,7 +1704,7 @@
               <w:rPr>
                 <w:noProof/>
               </w:rPr>
-              <w:t>8</w:t>
+              <w:t>9</w:t>
             </w:r>
             <w:r>
               <w:rPr>
@@ -1725,11 +1725,11 @@
               <w:rFonts w:asciiTheme="minorHAnsi" w:eastAsiaTheme="minorEastAsia" w:hAnsiTheme="minorHAnsi" w:cstheme="minorBidi"/>
               <w:noProof/>
               <w:szCs w:val="24"/>
-              <w:lang w:val="en-FI" w:eastAsia="en-FI" w:bidi="ar-SA"/>
+              <w:lang w:val="fi-FI" w:eastAsia="fi-FI" w:bidi="ar-SA"/>
               <w14:ligatures w14:val="standardContextual"/>
             </w:rPr>
           </w:pPr>
-          <w:hyperlink w:anchor="_Toc216856851" w:history="1">
+          <w:hyperlink w:anchor="_Toc227579919" w:history="1">
             <w:r>
               <w:rPr>
                 <w:rStyle w:val="Hyperlink"/>
@@ -1742,7 +1742,7 @@
                 <w:rFonts w:asciiTheme="minorHAnsi" w:eastAsiaTheme="minorEastAsia" w:hAnsiTheme="minorHAnsi" w:cstheme="minorBidi"/>
                 <w:noProof/>
                 <w:szCs w:val="24"/>
-                <w:lang w:val="en-FI" w:eastAsia="en-FI" w:bidi="ar-SA"/>
+                <w:lang w:val="fi-FI" w:eastAsia="fi-FI" w:bidi="ar-SA"/>
                 <w14:ligatures w14:val="standardContextual"/>
               </w:rPr>
               <w:tab/>
@@ -1752,6 +1752,89 @@
                 <w:rStyle w:val="Hyperlink"/>
                 <w:noProof/>
               </w:rPr>
+              <w:t>Separate payment methods</w:t>
+            </w:r>
+            <w:r>
+              <w:rPr>
+                <w:noProof/>
+              </w:rPr>
+              <w:tab/>
+            </w:r>
+            <w:r>
+              <w:rPr>
+                <w:noProof/>
+              </w:rPr>
+              <w:fldChar w:fldCharType="begin"/>
+            </w:r>
+            <w:r>
+              <w:rPr>
+                <w:noProof/>
+              </w:rPr>
+              <w:instrText xml:space="preserve"> PAGEREF _Toc227579919 \h </w:instrText>
+            </w:r>
+            <w:r>
+              <w:rPr>
+                <w:noProof/>
+              </w:rPr>
+            </w:r>
+            <w:r>
+              <w:rPr>
+                <w:noProof/>
+              </w:rPr>
+              <w:fldChar w:fldCharType="separate"/>
+            </w:r>
+            <w:r>
+              <w:rPr>
+                <w:noProof/>
+              </w:rPr>
+              <w:t>10</w:t>
+            </w:r>
+            <w:r>
+              <w:rPr>
+                <w:noProof/>
+              </w:rPr>
+              <w:fldChar w:fldCharType="end"/>
+            </w:r>
+          </w:hyperlink>
+        </w:p>
+        <w:p>
+          <w:pPr>
+            <w:pStyle w:val="TOC3"/>
+            <w:tabs>
+              <w:tab w:val="left" w:pos="1200"/>
+              <w:tab w:val="right" w:leader="dot" w:pos="9736"/>
+            </w:tabs>
+            <w:rPr>
+              <w:rFonts w:asciiTheme="minorHAnsi" w:eastAsiaTheme="minorEastAsia" w:hAnsiTheme="minorHAnsi" w:cstheme="minorBidi"/>
+              <w:noProof/>
+              <w:szCs w:val="24"/>
+              <w:lang w:val="fi-FI" w:eastAsia="fi-FI" w:bidi="ar-SA"/>
+              <w14:ligatures w14:val="standardContextual"/>
+            </w:rPr>
+          </w:pPr>
+          <w:hyperlink w:anchor="_Toc227579920" w:history="1">
+            <w:r>
+              <w:rPr>
+                <w:rStyle w:val="Hyperlink"/>
+                <w:noProof/>
+              </w:rPr>
+              <w:t>5.2.4</w:t>
+            </w:r>
+            <w:r>
+              <w:rPr>
+                <w:rFonts w:asciiTheme="minorHAnsi" w:eastAsiaTheme="minorEastAsia" w:hAnsiTheme="minorHAnsi" w:cstheme="minorBidi"/>
+                <w:noProof/>
+                <w:szCs w:val="24"/>
+                <w:lang w:val="fi-FI" w:eastAsia="fi-FI" w:bidi="ar-SA"/>
+                <w14:ligatures w14:val="standardContextual"/>
+              </w:rPr>
+              <w:tab/>
+            </w:r>
+            <w:r>
+              <w:rPr>
+                <w:rStyle w:val="Hyperlink"/>
+                <w:noProof/>
+              </w:rPr>
               <w:t>Redirect to Svea’s Payment Method Selection Page</w:t>
             </w:r>
             <w:r>
@@ -1770,7 +1853,7 @@
               <w:rPr>
                 <w:noProof/>
               </w:rPr>
-              <w:instrText xml:space="preserve"> PAGEREF _Toc216856851 \h </w:instrText>
+              <w:instrText xml:space="preserve"> PAGEREF _Toc227579920 \h </w:instrText>
             </w:r>
             <w:r>
               <w:rPr>
@@ -1787,7 +1870,7 @@
               <w:rPr>
                 <w:noProof/>
               </w:rPr>
-              <w:t>9</w:t>
+              <w:t>11</w:t>
             </w:r>
             <w:r>
               <w:rPr>
@@ -1808,11 +1891,11 @@
               <w:rFonts w:asciiTheme="minorHAnsi" w:eastAsiaTheme="minorEastAsia" w:hAnsiTheme="minorHAnsi" w:cstheme="minorBidi"/>
               <w:noProof/>
               <w:szCs w:val="24"/>
-              <w:lang w:val="en-FI" w:eastAsia="en-FI" w:bidi="ar-SA"/>
+              <w:lang w:val="fi-FI" w:eastAsia="fi-FI" w:bidi="ar-SA"/>
               <w14:ligatures w14:val="standardContextual"/>
             </w:rPr>
           </w:pPr>
-          <w:hyperlink w:anchor="_Toc216856852" w:history="1">
+          <w:hyperlink w:anchor="_Toc227579921" w:history="1">
             <w:r>
               <w:rPr>
                 <w:rStyle w:val="Hyperlink"/>
@@ -1825,7 +1908,7 @@
                 <w:rFonts w:asciiTheme="minorHAnsi" w:eastAsiaTheme="minorEastAsia" w:hAnsiTheme="minorHAnsi" w:cstheme="minorBidi"/>
                 <w:noProof/>
                 <w:szCs w:val="24"/>
-                <w:lang w:val="en-FI" w:eastAsia="en-FI" w:bidi="ar-SA"/>
+                <w:lang w:val="fi-FI" w:eastAsia="fi-FI" w:bidi="ar-SA"/>
                 <w14:ligatures w14:val="standardContextual"/>
               </w:rPr>
               <w:tab/>
@@ -1853,7 +1936,7 @@
               <w:rPr>
                 <w:noProof/>
               </w:rPr>
-              <w:instrText xml:space="preserve"> PAGEREF _Toc216856852 \h </w:instrText>
+              <w:instrText xml:space="preserve"> PAGEREF _Toc227579921 \h </w:instrText>
             </w:r>
             <w:r>
               <w:rPr>
@@ -1870,7 +1953,7 @@
               <w:rPr>
                 <w:noProof/>
               </w:rPr>
-              <w:t>10</w:t>
+              <w:t>12</w:t>
             </w:r>
             <w:r>
               <w:rPr>
@@ -1891,11 +1974,11 @@
               <w:rFonts w:asciiTheme="minorHAnsi" w:eastAsiaTheme="minorEastAsia" w:hAnsiTheme="minorHAnsi" w:cstheme="minorBidi"/>
               <w:noProof/>
               <w:szCs w:val="24"/>
-              <w:lang w:val="en-FI" w:eastAsia="en-FI" w:bidi="ar-SA"/>
+              <w:lang w:val="fi-FI" w:eastAsia="fi-FI" w:bidi="ar-SA"/>
               <w14:ligatures w14:val="standardContextual"/>
             </w:rPr>
           </w:pPr>
-          <w:hyperlink w:anchor="_Toc216856853" w:history="1">
+          <w:hyperlink w:anchor="_Toc227579922" w:history="1">
             <w:r>
               <w:rPr>
                 <w:rStyle w:val="Hyperlink"/>
@@ -1908,7 +1991,7 @@
                 <w:rFonts w:asciiTheme="minorHAnsi" w:eastAsiaTheme="minorEastAsia" w:hAnsiTheme="minorHAnsi" w:cstheme="minorBidi"/>
                 <w:noProof/>
                 <w:szCs w:val="24"/>
-                <w:lang w:val="en-FI" w:eastAsia="en-FI" w:bidi="ar-SA"/>
+                <w:lang w:val="fi-FI" w:eastAsia="fi-FI" w:bidi="ar-SA"/>
                 <w14:ligatures w14:val="standardContextual"/>
               </w:rPr>
               <w:tab/>
@@ -1936,7 +2019,7 @@
               <w:rPr>
                 <w:noProof/>
               </w:rPr>
-              <w:instrText xml:space="preserve"> PAGEREF _Toc216856853 \h </w:instrText>
+              <w:instrText xml:space="preserve"> PAGEREF _Toc227579922 \h </w:instrText>
             </w:r>
             <w:r>
               <w:rPr>
@@ -1953,7 +2036,7 @@
               <w:rPr>
                 <w:noProof/>
               </w:rPr>
-              <w:t>12</w:t>
+              <w:t>14</w:t>
             </w:r>
             <w:r>
               <w:rPr>
@@ -1974,11 +2057,11 @@
               <w:rFonts w:asciiTheme="minorHAnsi" w:eastAsiaTheme="minorEastAsia" w:hAnsiTheme="minorHAnsi" w:cstheme="minorBidi"/>
               <w:noProof/>
               <w:szCs w:val="24"/>
-              <w:lang w:val="en-FI" w:eastAsia="en-FI" w:bidi="ar-SA"/>
+              <w:lang w:val="fi-FI" w:eastAsia="fi-FI" w:bidi="ar-SA"/>
               <w14:ligatures w14:val="standardContextual"/>
             </w:rPr>
           </w:pPr>
-          <w:hyperlink w:anchor="_Toc216856854" w:history="1">
+          <w:hyperlink w:anchor="_Toc227579923" w:history="1">
             <w:r>
               <w:rPr>
                 <w:rStyle w:val="Hyperlink"/>
@@ -1991,7 +2074,7 @@
                 <w:rFonts w:asciiTheme="minorHAnsi" w:eastAsiaTheme="minorEastAsia" w:hAnsiTheme="minorHAnsi" w:cstheme="minorBidi"/>
                 <w:noProof/>
                 <w:szCs w:val="24"/>
-                <w:lang w:val="en-FI" w:eastAsia="en-FI" w:bidi="ar-SA"/>
+                <w:lang w:val="fi-FI" w:eastAsia="fi-FI" w:bidi="ar-SA"/>
                 <w14:ligatures w14:val="standardContextual"/>
               </w:rPr>
               <w:tab/>
@@ -2019,7 +2102,7 @@
               <w:rPr>
                 <w:noProof/>
               </w:rPr>
-              <w:instrText xml:space="preserve"> PAGEREF _Toc216856854 \h </w:instrText>
+              <w:instrText xml:space="preserve"> PAGEREF _Toc227579923 \h </w:instrText>
             </w:r>
             <w:r>
               <w:rPr>
@@ -2036,7 +2119,7 @@
               <w:rPr>
                 <w:noProof/>
               </w:rPr>
-              <w:t>14</w:t>
+              <w:t>16</w:t>
             </w:r>
             <w:r>
               <w:rPr>
@@ -2057,11 +2140,11 @@
               <w:rFonts w:asciiTheme="minorHAnsi" w:eastAsiaTheme="minorEastAsia" w:hAnsiTheme="minorHAnsi" w:cstheme="minorBidi"/>
               <w:noProof/>
               <w:szCs w:val="24"/>
-              <w:lang w:val="en-FI" w:eastAsia="en-FI" w:bidi="ar-SA"/>
+              <w:lang w:val="fi-FI" w:eastAsia="fi-FI" w:bidi="ar-SA"/>
               <w14:ligatures w14:val="standardContextual"/>
             </w:rPr>
           </w:pPr>
-          <w:hyperlink w:anchor="_Toc216856855" w:history="1">
+          <w:hyperlink w:anchor="_Toc227579924" w:history="1">
             <w:r>
               <w:rPr>
                 <w:rStyle w:val="Hyperlink"/>
@@ -2074,7 +2157,7 @@
                 <w:rFonts w:asciiTheme="minorHAnsi" w:eastAsiaTheme="minorEastAsia" w:hAnsiTheme="minorHAnsi" w:cstheme="minorBidi"/>
                 <w:noProof/>
                 <w:szCs w:val="24"/>
-                <w:lang w:val="en-FI" w:eastAsia="en-FI" w:bidi="ar-SA"/>
+                <w:lang w:val="fi-FI" w:eastAsia="fi-FI" w:bidi="ar-SA"/>
                 <w14:ligatures w14:val="standardContextual"/>
               </w:rPr>
               <w:tab/>
@@ -2102,7 +2185,7 @@
               <w:rPr>
                 <w:noProof/>
               </w:rPr>
-              <w:instrText xml:space="preserve"> PAGEREF _Toc216856855 \h </w:instrText>
+              <w:instrText xml:space="preserve"> PAGEREF _Toc227579924 \h </w:instrText>
             </w:r>
             <w:r>
               <w:rPr>
@@ -2119,7 +2202,7 @@
               <w:rPr>
                 <w:noProof/>
               </w:rPr>
-              <w:t>14</w:t>
+              <w:t>16</w:t>
             </w:r>
             <w:r>
               <w:rPr>
@@ -2140,11 +2223,11 @@
               <w:rFonts w:asciiTheme="minorHAnsi" w:eastAsiaTheme="minorEastAsia" w:hAnsiTheme="minorHAnsi" w:cstheme="minorBidi"/>
               <w:noProof/>
               <w:szCs w:val="24"/>
-              <w:lang w:val="en-FI" w:eastAsia="en-FI" w:bidi="ar-SA"/>
+              <w:lang w:val="fi-FI" w:eastAsia="fi-FI" w:bidi="ar-SA"/>
               <w14:ligatures w14:val="standardContextual"/>
             </w:rPr>
           </w:pPr>
-          <w:hyperlink w:anchor="_Toc216856856" w:history="1">
+          <w:hyperlink w:anchor="_Toc227579925" w:history="1">
             <w:r>
               <w:rPr>
                 <w:rStyle w:val="Hyperlink"/>
@@ -2157,7 +2240,7 @@
                 <w:rFonts w:asciiTheme="minorHAnsi" w:eastAsiaTheme="minorEastAsia" w:hAnsiTheme="minorHAnsi" w:cstheme="minorBidi"/>
                 <w:noProof/>
                 <w:szCs w:val="24"/>
-                <w:lang w:val="en-FI" w:eastAsia="en-FI" w:bidi="ar-SA"/>
+                <w:lang w:val="fi-FI" w:eastAsia="fi-FI" w:bidi="ar-SA"/>
                 <w14:ligatures w14:val="standardContextual"/>
               </w:rPr>
               <w:tab/>
@@ -2185,7 +2268,7 @@
               <w:rPr>
                 <w:noProof/>
               </w:rPr>
-              <w:instrText xml:space="preserve"> PAGEREF _Toc216856856 \h </w:instrText>
+              <w:instrText xml:space="preserve"> PAGEREF _Toc227579925 \h </w:instrText>
             </w:r>
             <w:r>
               <w:rPr>
@@ -2202,7 +2285,7 @@
               <w:rPr>
                 <w:noProof/>
               </w:rPr>
-              <w:t>14</w:t>
+              <w:t>16</w:t>
             </w:r>
             <w:r>
               <w:rPr>
@@ -2223,11 +2306,11 @@
               <w:rFonts w:asciiTheme="minorHAnsi" w:eastAsiaTheme="minorEastAsia" w:hAnsiTheme="minorHAnsi" w:cstheme="minorBidi"/>
               <w:noProof/>
               <w:szCs w:val="24"/>
-              <w:lang w:val="en-FI" w:eastAsia="en-FI" w:bidi="ar-SA"/>
+              <w:lang w:val="fi-FI" w:eastAsia="fi-FI" w:bidi="ar-SA"/>
               <w14:ligatures w14:val="standardContextual"/>
             </w:rPr>
           </w:pPr>
-          <w:hyperlink w:anchor="_Toc216856857" w:history="1">
+          <w:hyperlink w:anchor="_Toc227579926" w:history="1">
             <w:r>
               <w:rPr>
                 <w:rStyle w:val="Hyperlink"/>
@@ -2240,7 +2323,7 @@
                 <w:rFonts w:asciiTheme="minorHAnsi" w:eastAsiaTheme="minorEastAsia" w:hAnsiTheme="minorHAnsi" w:cstheme="minorBidi"/>
                 <w:noProof/>
                 <w:szCs w:val="24"/>
-                <w:lang w:val="en-FI" w:eastAsia="en-FI" w:bidi="ar-SA"/>
+                <w:lang w:val="fi-FI" w:eastAsia="fi-FI" w:bidi="ar-SA"/>
                 <w14:ligatures w14:val="standardContextual"/>
               </w:rPr>
               <w:tab/>
@@ -2268,7 +2351,7 @@
               <w:rPr>
                 <w:noProof/>
               </w:rPr>
-              <w:instrText xml:space="preserve"> PAGEREF _Toc216856857 \h </w:instrText>
+              <w:instrText xml:space="preserve"> PAGEREF _Toc227579926 \h </w:instrText>
             </w:r>
             <w:r>
               <w:rPr>
@@ -2285,7 +2368,7 @@
               <w:rPr>
                 <w:noProof/>
               </w:rPr>
-              <w:t>14</w:t>
+              <w:t>16</w:t>
             </w:r>
             <w:r>
               <w:rPr>
@@ -2306,11 +2389,11 @@
               <w:rFonts w:asciiTheme="minorHAnsi" w:eastAsiaTheme="minorEastAsia" w:hAnsiTheme="minorHAnsi" w:cstheme="minorBidi"/>
               <w:noProof/>
               <w:szCs w:val="24"/>
-              <w:lang w:val="en-FI" w:eastAsia="en-FI" w:bidi="ar-SA"/>
+              <w:lang w:val="fi-FI" w:eastAsia="fi-FI" w:bidi="ar-SA"/>
               <w14:ligatures w14:val="standardContextual"/>
             </w:rPr>
           </w:pPr>
-          <w:hyperlink w:anchor="_Toc216856858" w:history="1">
+          <w:hyperlink w:anchor="_Toc227579927" w:history="1">
             <w:r>
               <w:rPr>
                 <w:rStyle w:val="Hyperlink"/>
@@ -2323,7 +2406,7 @@
                 <w:rFonts w:asciiTheme="minorHAnsi" w:eastAsiaTheme="minorEastAsia" w:hAnsiTheme="minorHAnsi" w:cstheme="minorBidi"/>
                 <w:noProof/>
                 <w:szCs w:val="24"/>
-                <w:lang w:val="en-FI" w:eastAsia="en-FI" w:bidi="ar-SA"/>
+                <w:lang w:val="fi-FI" w:eastAsia="fi-FI" w:bidi="ar-SA"/>
                 <w14:ligatures w14:val="standardContextual"/>
               </w:rPr>
               <w:tab/>
@@ -2351,7 +2434,7 @@
               <w:rPr>
                 <w:noProof/>
               </w:rPr>
-              <w:instrText xml:space="preserve"> PAGEREF _Toc216856858 \h </w:instrText>
+              <w:instrText xml:space="preserve"> PAGEREF _Toc227579927 \h </w:instrText>
             </w:r>
             <w:r>
               <w:rPr>
@@ -2368,7 +2451,7 @@
               <w:rPr>
                 <w:noProof/>
               </w:rPr>
-              <w:t>15</w:t>
+              <w:t>17</w:t>
             </w:r>
             <w:r>
               <w:rPr>
@@ -2389,11 +2472,11 @@
               <w:rFonts w:asciiTheme="minorHAnsi" w:eastAsiaTheme="minorEastAsia" w:hAnsiTheme="minorHAnsi" w:cstheme="minorBidi"/>
               <w:noProof/>
               <w:szCs w:val="24"/>
-              <w:lang w:val="en-FI" w:eastAsia="en-FI" w:bidi="ar-SA"/>
+              <w:lang w:val="fi-FI" w:eastAsia="fi-FI" w:bidi="ar-SA"/>
               <w14:ligatures w14:val="standardContextual"/>
             </w:rPr>
           </w:pPr>
-          <w:hyperlink w:anchor="_Toc216856859" w:history="1">
+          <w:hyperlink w:anchor="_Toc227579928" w:history="1">
             <w:r>
               <w:rPr>
                 <w:rStyle w:val="Hyperlink"/>
@@ -2406,7 +2489,7 @@
                 <w:rFonts w:asciiTheme="minorHAnsi" w:eastAsiaTheme="minorEastAsia" w:hAnsiTheme="minorHAnsi" w:cstheme="minorBidi"/>
                 <w:noProof/>
                 <w:szCs w:val="24"/>
-                <w:lang w:val="en-FI" w:eastAsia="en-FI" w:bidi="ar-SA"/>
+                <w:lang w:val="fi-FI" w:eastAsia="fi-FI" w:bidi="ar-SA"/>
                 <w14:ligatures w14:val="standardContextual"/>
               </w:rPr>
               <w:tab/>
@@ -2434,7 +2517,7 @@
               <w:rPr>
                 <w:noProof/>
               </w:rPr>
-              <w:instrText xml:space="preserve"> PAGEREF _Toc216856859 \h </w:instrText>
+              <w:instrText xml:space="preserve"> PAGEREF _Toc227579928 \h </w:instrText>
             </w:r>
             <w:r>
               <w:rPr>
@@ -2451,7 +2534,7 @@
               <w:rPr>
                 <w:noProof/>
               </w:rPr>
-              <w:t>16</w:t>
+              <w:t>18</w:t>
             </w:r>
             <w:r>
               <w:rPr>
@@ -2472,11 +2555,11 @@
               <w:rFonts w:asciiTheme="minorHAnsi" w:eastAsiaTheme="minorEastAsia" w:hAnsiTheme="minorHAnsi" w:cstheme="minorBidi"/>
               <w:noProof/>
               <w:szCs w:val="24"/>
-              <w:lang w:val="en-FI" w:eastAsia="en-FI" w:bidi="ar-SA"/>
+              <w:lang w:val="fi-FI" w:eastAsia="fi-FI" w:bidi="ar-SA"/>
               <w14:ligatures w14:val="standardContextual"/>
             </w:rPr>
           </w:pPr>
-          <w:hyperlink w:anchor="_Toc216856860" w:history="1">
+          <w:hyperlink w:anchor="_Toc227579929" w:history="1">
             <w:r>
               <w:rPr>
                 <w:rStyle w:val="Hyperlink"/>
@@ -2489,7 +2572,7 @@
                 <w:rFonts w:asciiTheme="minorHAnsi" w:eastAsiaTheme="minorEastAsia" w:hAnsiTheme="minorHAnsi" w:cstheme="minorBidi"/>
                 <w:noProof/>
                 <w:szCs w:val="24"/>
-                <w:lang w:val="en-FI" w:eastAsia="en-FI" w:bidi="ar-SA"/>
+                <w:lang w:val="fi-FI" w:eastAsia="fi-FI" w:bidi="ar-SA"/>
                 <w14:ligatures w14:val="standardContextual"/>
               </w:rPr>
               <w:tab/>
@@ -2517,7 +2600,7 @@
               <w:rPr>
                 <w:noProof/>
               </w:rPr>
-              <w:instrText xml:space="preserve"> PAGEREF _Toc216856860 \h </w:instrText>
+              <w:instrText xml:space="preserve"> PAGEREF _Toc227579929 \h </w:instrText>
             </w:r>
             <w:r>
               <w:rPr>
@@ -2534,7 +2617,7 @@
               <w:rPr>
                 <w:noProof/>
               </w:rPr>
-              <w:t>17</w:t>
+              <w:t>19</w:t>
             </w:r>
             <w:r>
               <w:rPr>
@@ -2555,11 +2638,11 @@
               <w:rFonts w:asciiTheme="minorHAnsi" w:eastAsiaTheme="minorEastAsia" w:hAnsiTheme="minorHAnsi" w:cstheme="minorBidi"/>
               <w:noProof/>
               <w:szCs w:val="24"/>
-              <w:lang w:val="en-FI" w:eastAsia="en-FI" w:bidi="ar-SA"/>
+              <w:lang w:val="fi-FI" w:eastAsia="fi-FI" w:bidi="ar-SA"/>
               <w14:ligatures w14:val="standardContextual"/>
             </w:rPr>
           </w:pPr>
-          <w:hyperlink w:anchor="_Toc216856861" w:history="1">
+          <w:hyperlink w:anchor="_Toc227579930" w:history="1">
             <w:r>
               <w:rPr>
                 <w:rStyle w:val="Hyperlink"/>
@@ -2572,7 +2655,7 @@
                 <w:rFonts w:asciiTheme="minorHAnsi" w:eastAsiaTheme="minorEastAsia" w:hAnsiTheme="minorHAnsi" w:cstheme="minorBidi"/>
                 <w:noProof/>
                 <w:szCs w:val="24"/>
-                <w:lang w:val="en-FI" w:eastAsia="en-FI" w:bidi="ar-SA"/>
+                <w:lang w:val="fi-FI" w:eastAsia="fi-FI" w:bidi="ar-SA"/>
                 <w14:ligatures w14:val="standardContextual"/>
               </w:rPr>
               <w:tab/>
@@ -2600,7 +2683,7 @@
               <w:rPr>
                 <w:noProof/>
               </w:rPr>
-              <w:instrText xml:space="preserve"> PAGEREF _Toc216856861 \h </w:instrText>
+              <w:instrText xml:space="preserve"> PAGEREF _Toc227579930 \h </w:instrText>
             </w:r>
             <w:r>
               <w:rPr>
@@ -2617,7 +2700,7 @@
               <w:rPr>
                 <w:noProof/>
               </w:rPr>
-              <w:t>17</w:t>
+              <w:t>19</w:t>
             </w:r>
             <w:r>
               <w:rPr>
@@ -2638,11 +2721,11 @@
               <w:rFonts w:asciiTheme="minorHAnsi" w:eastAsiaTheme="minorEastAsia" w:hAnsiTheme="minorHAnsi" w:cstheme="minorBidi"/>
               <w:noProof/>
               <w:szCs w:val="24"/>
-              <w:lang w:val="en-FI" w:eastAsia="en-FI" w:bidi="ar-SA"/>
+              <w:lang w:val="fi-FI" w:eastAsia="fi-FI" w:bidi="ar-SA"/>
               <w14:ligatures w14:val="standardContextual"/>
             </w:rPr>
           </w:pPr>
-          <w:hyperlink w:anchor="_Toc216856862" w:history="1">
+          <w:hyperlink w:anchor="_Toc227579931" w:history="1">
             <w:r>
               <w:rPr>
                 <w:rStyle w:val="Hyperlink"/>
@@ -2655,7 +2738,7 @@
                 <w:rFonts w:asciiTheme="minorHAnsi" w:eastAsiaTheme="minorEastAsia" w:hAnsiTheme="minorHAnsi" w:cstheme="minorBidi"/>
                 <w:noProof/>
                 <w:szCs w:val="24"/>
-                <w:lang w:val="en-FI" w:eastAsia="en-FI" w:bidi="ar-SA"/>
+                <w:lang w:val="fi-FI" w:eastAsia="fi-FI" w:bidi="ar-SA"/>
                 <w14:ligatures w14:val="standardContextual"/>
               </w:rPr>
               <w:tab/>
@@ -2683,7 +2766,7 @@
               <w:rPr>
                 <w:noProof/>
               </w:rPr>
-              <w:instrText xml:space="preserve"> PAGEREF _Toc216856862 \h </w:instrText>
+              <w:instrText xml:space="preserve"> PAGEREF _Toc227579931 \h </w:instrText>
             </w:r>
             <w:r>
               <w:rPr>
@@ -2700,7 +2783,7 @@
               <w:rPr>
                 <w:noProof/>
               </w:rPr>
-              <w:t>17</w:t>
+              <w:t>19</w:t>
             </w:r>
             <w:r>
               <w:rPr>
@@ -2784,7 +2867,7 @@
         <w:pStyle w:val="Heading1"/>
         <w:spacing w:before="0"/>
       </w:pPr>
-      <w:bookmarkStart w:id="9" w:name="_Toc216856835"/>
+      <w:bookmarkStart w:id="9" w:name="_Toc227579903"/>
       <w:r>
         <w:lastRenderedPageBreak/>
         <w:t>General information</w:t>
@@ -2855,7 +2938,7 @@
       <w:bookmarkStart w:id="15" w:name="_Toc11253821_Copy_1"/>
       <w:bookmarkStart w:id="16" w:name="_Toc11353120_Copy_1"/>
       <w:bookmarkStart w:id="17" w:name="_Toc11353194_Copy_1"/>
-      <w:bookmarkStart w:id="18" w:name="_Toc216856836"/>
+      <w:bookmarkStart w:id="18" w:name="_Toc227579904"/>
       <w:bookmarkEnd w:id="10"/>
       <w:bookmarkEnd w:id="11"/>
       <w:bookmarkEnd w:id="12"/>
@@ -2930,7 +3013,7 @@
       <w:bookmarkStart w:id="31" w:name="_Toc11253823"/>
       <w:bookmarkStart w:id="32" w:name="_Toc11353122"/>
       <w:bookmarkStart w:id="33" w:name="_Toc11353196"/>
-      <w:bookmarkStart w:id="34" w:name="_Toc216856837"/>
+      <w:bookmarkStart w:id="34" w:name="_Toc227579905"/>
       <w:bookmarkEnd w:id="19"/>
       <w:bookmarkEnd w:id="20"/>
       <w:bookmarkEnd w:id="21"/>
@@ -3211,7 +3294,7 @@
       <w:bookmarkStart w:id="39" w:name="_Toc11253825"/>
       <w:bookmarkStart w:id="40" w:name="_Toc11353124"/>
       <w:bookmarkStart w:id="41" w:name="_Toc11353198"/>
-      <w:bookmarkStart w:id="42" w:name="_Toc216856838"/>
+      <w:bookmarkStart w:id="42" w:name="_Toc227579906"/>
       <w:r>
         <w:lastRenderedPageBreak/>
         <w:t>Installation</w:t>
@@ -3262,15 +3345,7 @@
         <w:pStyle w:val="Textbody"/>
       </w:pPr>
       <w:r>
-        <w:t xml:space="preserve">During installation, the module installs required database tables and adds </w:t>
-      </w:r>
-      <w:proofErr w:type="spellStart"/>
-      <w:r>
-        <w:t>cron</w:t>
-      </w:r>
-      <w:proofErr w:type="spellEnd"/>
-      <w:r>
-        <w:t xml:space="preserve"> jobs for payment status query background jobs.</w:t>
+        <w:t>During installation, the module installs required database tables and adds cron jobs for payment status query background jobs.</w:t>
       </w:r>
     </w:p>
     <w:p>
@@ -3356,7 +3431,7 @@
       <w:bookmarkStart w:id="49" w:name="_Toc10743691"/>
       <w:bookmarkStart w:id="50" w:name="_Toc10741271"/>
       <w:bookmarkStart w:id="51" w:name="_Toc10646645"/>
-      <w:bookmarkStart w:id="52" w:name="_Toc216856839"/>
+      <w:bookmarkStart w:id="52" w:name="_Toc227579907"/>
       <w:bookmarkEnd w:id="44"/>
       <w:r>
         <w:t>Install</w:t>
@@ -3386,23 +3461,7 @@
         <w:pStyle w:val="Codeblock"/>
       </w:pPr>
       <w:r>
-        <w:t xml:space="preserve">composer require </w:t>
-      </w:r>
-      <w:proofErr w:type="spellStart"/>
-      <w:r>
-        <w:t>svea</w:t>
-      </w:r>
-      <w:proofErr w:type="spellEnd"/>
-      <w:r>
-        <w:t>-payments-</w:t>
-      </w:r>
-      <w:proofErr w:type="spellStart"/>
-      <w:r>
-        <w:t>finland</w:t>
-      </w:r>
-      <w:proofErr w:type="spellEnd"/>
-      <w:r>
-        <w:t>/magento2-svea-payments</w:t>
+        <w:t>composer require svea-payments-finland/magento2-svea-payments</w:t>
       </w:r>
     </w:p>
     <w:p>
@@ -3422,51 +3481,22 @@
       <w:pPr>
         <w:pStyle w:val="Codeblock"/>
       </w:pPr>
-      <w:proofErr w:type="spellStart"/>
-      <w:r>
-        <w:t>php</w:t>
-      </w:r>
-      <w:proofErr w:type="spellEnd"/>
-      <w:r>
-        <w:t xml:space="preserve"> bin/</w:t>
-      </w:r>
-      <w:proofErr w:type="spellStart"/>
-      <w:r>
-        <w:t>magento</w:t>
-      </w:r>
-      <w:proofErr w:type="spellEnd"/>
-      <w:r>
-        <w:t xml:space="preserve"> </w:t>
-      </w:r>
-      <w:proofErr w:type="spellStart"/>
+      <w:r>
+        <w:t xml:space="preserve">php bin/magento </w:t>
+      </w:r>
       <w:proofErr w:type="gramStart"/>
       <w:r>
         <w:t>setup:upgrade</w:t>
       </w:r>
-      <w:proofErr w:type="spellEnd"/>
       <w:proofErr w:type="gramEnd"/>
     </w:p>
     <w:p>
       <w:pPr>
         <w:pStyle w:val="Codeblock"/>
       </w:pPr>
-      <w:proofErr w:type="spellStart"/>
-      <w:r>
-        <w:t>php</w:t>
-      </w:r>
-      <w:proofErr w:type="spellEnd"/>
-      <w:r>
-        <w:t xml:space="preserve"> bin/</w:t>
-      </w:r>
-      <w:proofErr w:type="spellStart"/>
-      <w:r>
-        <w:t>magento</w:t>
-      </w:r>
-      <w:proofErr w:type="spellEnd"/>
-      <w:r>
-        <w:t xml:space="preserve"> </w:t>
-      </w:r>
-      <w:proofErr w:type="spellStart"/>
+      <w:r>
+        <w:t xml:space="preserve">php bin/magento </w:t>
+      </w:r>
       <w:proofErr w:type="gramStart"/>
       <w:r>
         <w:t>setup:di</w:t>
@@ -3475,68 +3505,34 @@
       <w:r>
         <w:t>:compile</w:t>
       </w:r>
-      <w:proofErr w:type="spellEnd"/>
     </w:p>
     <w:p>
       <w:pPr>
         <w:pStyle w:val="Codeblock"/>
       </w:pPr>
-      <w:proofErr w:type="spellStart"/>
-      <w:r>
-        <w:t>php</w:t>
-      </w:r>
-      <w:proofErr w:type="spellEnd"/>
-      <w:r>
-        <w:t xml:space="preserve"> bin/</w:t>
-      </w:r>
-      <w:proofErr w:type="spellStart"/>
-      <w:r>
-        <w:t>magento</w:t>
-      </w:r>
-      <w:proofErr w:type="spellEnd"/>
-      <w:r>
-        <w:t xml:space="preserve"> </w:t>
-      </w:r>
-      <w:proofErr w:type="spellStart"/>
+      <w:r>
+        <w:t xml:space="preserve">php bin/magento </w:t>
+      </w:r>
       <w:proofErr w:type="gramStart"/>
       <w:r>
         <w:t>setup:static</w:t>
       </w:r>
       <w:proofErr w:type="gramEnd"/>
       <w:r>
-        <w:t>-content:deploy</w:t>
-      </w:r>
-      <w:proofErr w:type="spellEnd"/>
-      <w:r>
-        <w:t xml:space="preserve"> -f -j 3</w:t>
+        <w:t>-content:deploy -f -j 3</w:t>
       </w:r>
     </w:p>
     <w:p>
       <w:pPr>
         <w:pStyle w:val="Codeblock"/>
       </w:pPr>
-      <w:proofErr w:type="spellStart"/>
-      <w:r>
-        <w:t>php</w:t>
-      </w:r>
-      <w:proofErr w:type="spellEnd"/>
-      <w:r>
-        <w:t xml:space="preserve"> bin/</w:t>
-      </w:r>
-      <w:proofErr w:type="spellStart"/>
-      <w:r>
-        <w:t>magento</w:t>
-      </w:r>
-      <w:proofErr w:type="spellEnd"/>
-      <w:r>
-        <w:t xml:space="preserve"> </w:t>
-      </w:r>
-      <w:proofErr w:type="spellStart"/>
+      <w:r>
+        <w:t xml:space="preserve">php bin/magento </w:t>
+      </w:r>
       <w:proofErr w:type="gramStart"/>
       <w:r>
         <w:t>cache:flush</w:t>
       </w:r>
-      <w:proofErr w:type="spellEnd"/>
       <w:proofErr w:type="gramEnd"/>
     </w:p>
     <w:p>
@@ -3549,15 +3545,7 @@
         <w:pStyle w:val="Textbody"/>
       </w:pPr>
       <w:r>
-        <w:t xml:space="preserve">Check that </w:t>
-      </w:r>
-      <w:proofErr w:type="spellStart"/>
-      <w:r>
-        <w:t>cron</w:t>
-      </w:r>
-      <w:proofErr w:type="spellEnd"/>
-      <w:r>
-        <w:t xml:space="preserve"> service is running.</w:t>
+        <w:t>Check that cron service is running.</w:t>
       </w:r>
     </w:p>
     <w:p>
@@ -3565,31 +3553,15 @@
         <w:pStyle w:val="Codeblock"/>
       </w:pPr>
       <w:r>
-        <w:t xml:space="preserve">service </w:t>
-      </w:r>
-      <w:proofErr w:type="spellStart"/>
-      <w:r>
-        <w:t>cron</w:t>
-      </w:r>
-      <w:proofErr w:type="spellEnd"/>
-      <w:r>
-        <w:t xml:space="preserve"> status</w:t>
-      </w:r>
-    </w:p>
-    <w:p>
-      <w:pPr>
-        <w:pStyle w:val="Textbody"/>
-      </w:pPr>
-      <w:r>
-        <w:t xml:space="preserve">if needed, start </w:t>
-      </w:r>
-      <w:proofErr w:type="spellStart"/>
-      <w:r>
-        <w:t>cron</w:t>
-      </w:r>
-      <w:proofErr w:type="spellEnd"/>
-      <w:r>
-        <w:t xml:space="preserve"> as follows.</w:t>
+        <w:t>service cron status</w:t>
+      </w:r>
+    </w:p>
+    <w:p>
+      <w:pPr>
+        <w:pStyle w:val="Textbody"/>
+      </w:pPr>
+      <w:r>
+        <w:t>if needed, start cron as follows.</w:t>
       </w:r>
     </w:p>
     <w:p>
@@ -3597,15 +3569,7 @@
         <w:pStyle w:val="Codeblock"/>
       </w:pPr>
       <w:r>
-        <w:t xml:space="preserve">service </w:t>
-      </w:r>
-      <w:proofErr w:type="spellStart"/>
-      <w:r>
-        <w:t>cron</w:t>
-      </w:r>
-      <w:proofErr w:type="spellEnd"/>
-      <w:r>
-        <w:t xml:space="preserve"> start</w:t>
+        <w:t>service cron start</w:t>
       </w:r>
     </w:p>
     <w:p/>
@@ -3613,7 +3577,7 @@
       <w:pPr>
         <w:pStyle w:val="Heading2"/>
       </w:pPr>
-      <w:bookmarkStart w:id="53" w:name="_Toc216856840"/>
+      <w:bookmarkStart w:id="53" w:name="_Toc227579908"/>
       <w:r>
         <w:t>Check the current version information</w:t>
       </w:r>
@@ -3632,23 +3596,7 @@
         <w:pStyle w:val="Codeblock"/>
       </w:pPr>
       <w:r>
-        <w:t xml:space="preserve">composer show </w:t>
-      </w:r>
-      <w:proofErr w:type="spellStart"/>
-      <w:r>
-        <w:t>svea</w:t>
-      </w:r>
-      <w:proofErr w:type="spellEnd"/>
-      <w:r>
-        <w:t>-payments-</w:t>
-      </w:r>
-      <w:proofErr w:type="spellStart"/>
-      <w:r>
-        <w:t>finland</w:t>
-      </w:r>
-      <w:proofErr w:type="spellEnd"/>
-      <w:r>
-        <w:t>/magento2-svea-payments</w:t>
+        <w:t>composer show svea-payments-finland/magento2-svea-payments</w:t>
       </w:r>
     </w:p>
     <w:p/>
@@ -3664,7 +3612,7 @@
       <w:bookmarkStart w:id="59" w:name="_Toc11253826"/>
       <w:bookmarkStart w:id="60" w:name="_Toc11353125"/>
       <w:bookmarkStart w:id="61" w:name="_Toc11353199"/>
-      <w:bookmarkStart w:id="62" w:name="_Toc216856841"/>
+      <w:bookmarkStart w:id="62" w:name="_Toc227579909"/>
       <w:bookmarkEnd w:id="54"/>
       <w:r>
         <w:t xml:space="preserve">Upgrade the existing </w:t>
@@ -3695,23 +3643,7 @@
       </w:pPr>
       <w:r>
         <w:lastRenderedPageBreak/>
-        <w:t xml:space="preserve">composer update </w:t>
-      </w:r>
-      <w:proofErr w:type="spellStart"/>
-      <w:r>
-        <w:t>svea</w:t>
-      </w:r>
-      <w:proofErr w:type="spellEnd"/>
-      <w:r>
-        <w:t>-payments-</w:t>
-      </w:r>
-      <w:proofErr w:type="spellStart"/>
-      <w:r>
-        <w:t>finland</w:t>
-      </w:r>
-      <w:proofErr w:type="spellEnd"/>
-      <w:r>
-        <w:t>/magento2-svea-payments</w:t>
+        <w:t>composer update svea-payments-finland/magento2-svea-payments</w:t>
       </w:r>
     </w:p>
     <w:p>
@@ -3731,51 +3663,22 @@
       <w:pPr>
         <w:pStyle w:val="Codeblock"/>
       </w:pPr>
-      <w:proofErr w:type="spellStart"/>
-      <w:r>
-        <w:t>php</w:t>
-      </w:r>
-      <w:proofErr w:type="spellEnd"/>
-      <w:r>
-        <w:t xml:space="preserve"> bin/</w:t>
-      </w:r>
-      <w:proofErr w:type="spellStart"/>
-      <w:r>
-        <w:t>magento</w:t>
-      </w:r>
-      <w:proofErr w:type="spellEnd"/>
-      <w:r>
-        <w:t xml:space="preserve"> </w:t>
-      </w:r>
-      <w:proofErr w:type="spellStart"/>
+      <w:r>
+        <w:t xml:space="preserve">php bin/magento </w:t>
+      </w:r>
       <w:proofErr w:type="gramStart"/>
       <w:r>
         <w:t>setup:upgrade</w:t>
       </w:r>
-      <w:proofErr w:type="spellEnd"/>
       <w:proofErr w:type="gramEnd"/>
     </w:p>
     <w:p>
       <w:pPr>
         <w:pStyle w:val="Codeblock"/>
       </w:pPr>
-      <w:proofErr w:type="spellStart"/>
-      <w:r>
-        <w:t>php</w:t>
-      </w:r>
-      <w:proofErr w:type="spellEnd"/>
-      <w:r>
-        <w:t xml:space="preserve"> bin/</w:t>
-      </w:r>
-      <w:proofErr w:type="spellStart"/>
-      <w:r>
-        <w:t>magento</w:t>
-      </w:r>
-      <w:proofErr w:type="spellEnd"/>
-      <w:r>
-        <w:t xml:space="preserve"> </w:t>
-      </w:r>
-      <w:proofErr w:type="spellStart"/>
+      <w:r>
+        <w:t xml:space="preserve">php bin/magento </w:t>
+      </w:r>
       <w:proofErr w:type="gramStart"/>
       <w:r>
         <w:t>setup:di</w:t>
@@ -3784,75 +3687,41 @@
       <w:r>
         <w:t>:compile</w:t>
       </w:r>
-      <w:proofErr w:type="spellEnd"/>
     </w:p>
     <w:p>
       <w:pPr>
         <w:pStyle w:val="Codeblock"/>
       </w:pPr>
-      <w:proofErr w:type="spellStart"/>
-      <w:r>
-        <w:t>php</w:t>
-      </w:r>
-      <w:proofErr w:type="spellEnd"/>
-      <w:r>
-        <w:t xml:space="preserve"> bin/</w:t>
-      </w:r>
-      <w:proofErr w:type="spellStart"/>
-      <w:r>
-        <w:t>magento</w:t>
-      </w:r>
-      <w:proofErr w:type="spellEnd"/>
-      <w:r>
-        <w:t xml:space="preserve"> </w:t>
-      </w:r>
-      <w:proofErr w:type="spellStart"/>
+      <w:r>
+        <w:t xml:space="preserve">php bin/magento </w:t>
+      </w:r>
       <w:proofErr w:type="gramStart"/>
       <w:r>
         <w:t>setup:static</w:t>
       </w:r>
       <w:proofErr w:type="gramEnd"/>
       <w:r>
-        <w:t>-content:deploy</w:t>
-      </w:r>
-      <w:proofErr w:type="spellEnd"/>
-      <w:r>
-        <w:t xml:space="preserve"> -f -j 3</w:t>
+        <w:t>-content:deploy -f -j 3</w:t>
       </w:r>
     </w:p>
     <w:p>
       <w:pPr>
         <w:pStyle w:val="Codeblock"/>
       </w:pPr>
-      <w:proofErr w:type="spellStart"/>
-      <w:r>
-        <w:t>php</w:t>
-      </w:r>
-      <w:proofErr w:type="spellEnd"/>
-      <w:r>
-        <w:t xml:space="preserve"> bin/</w:t>
-      </w:r>
-      <w:proofErr w:type="spellStart"/>
-      <w:r>
-        <w:t>magento</w:t>
-      </w:r>
-      <w:proofErr w:type="spellEnd"/>
-      <w:r>
-        <w:t xml:space="preserve"> </w:t>
-      </w:r>
-      <w:proofErr w:type="spellStart"/>
+      <w:r>
+        <w:t xml:space="preserve">php bin/magento </w:t>
+      </w:r>
       <w:proofErr w:type="gramStart"/>
       <w:r>
         <w:t>cache:flush</w:t>
       </w:r>
-      <w:proofErr w:type="spellEnd"/>
       <w:proofErr w:type="gramEnd"/>
     </w:p>
     <w:p>
       <w:pPr>
         <w:pStyle w:val="Heading2"/>
       </w:pPr>
-      <w:bookmarkStart w:id="63" w:name="_Toc216856842"/>
+      <w:bookmarkStart w:id="63" w:name="_Toc227579910"/>
       <w:r>
         <w:t>Remove the payment module</w:t>
       </w:r>
@@ -3871,23 +3740,7 @@
         <w:pStyle w:val="Codeblock"/>
       </w:pPr>
       <w:r>
-        <w:t xml:space="preserve">composer remove </w:t>
-      </w:r>
-      <w:proofErr w:type="spellStart"/>
-      <w:r>
-        <w:t>svea</w:t>
-      </w:r>
-      <w:proofErr w:type="spellEnd"/>
-      <w:r>
-        <w:t>-payments-</w:t>
-      </w:r>
-      <w:proofErr w:type="spellStart"/>
-      <w:r>
-        <w:t>finland</w:t>
-      </w:r>
-      <w:proofErr w:type="spellEnd"/>
-      <w:r>
-        <w:t>/magento2-svea-payments</w:t>
+        <w:t>composer remove svea-payments-finland/magento2-svea-payments</w:t>
       </w:r>
     </w:p>
     <w:p>
@@ -3915,7 +3768,7 @@
       </w:pPr>
       <w:bookmarkStart w:id="64" w:name="_Migrate_from_previous"/>
       <w:bookmarkStart w:id="65" w:name="_Migrating_from_previous"/>
-      <w:bookmarkStart w:id="66" w:name="_Toc216856843"/>
+      <w:bookmarkStart w:id="66" w:name="_Toc227579911"/>
       <w:bookmarkEnd w:id="64"/>
       <w:bookmarkEnd w:id="65"/>
       <w:r>
@@ -4054,93 +3907,17 @@
       <w:pPr>
         <w:pStyle w:val="Codeblock"/>
       </w:pPr>
-      <w:proofErr w:type="spellStart"/>
-      <w:r>
-        <w:t>php</w:t>
-      </w:r>
-      <w:proofErr w:type="spellEnd"/>
-      <w:r>
-        <w:t xml:space="preserve"> bin/</w:t>
-      </w:r>
-      <w:proofErr w:type="spellStart"/>
-      <w:r>
-        <w:t>magento</w:t>
-      </w:r>
-      <w:proofErr w:type="spellEnd"/>
-      <w:r>
-        <w:t xml:space="preserve"> </w:t>
-      </w:r>
-      <w:proofErr w:type="spellStart"/>
+      <w:r>
+        <w:t xml:space="preserve">php bin/magento </w:t>
+      </w:r>
       <w:proofErr w:type="gramStart"/>
       <w:r>
         <w:t>module:disable</w:t>
       </w:r>
-      <w:proofErr w:type="spellEnd"/>
       <w:proofErr w:type="gramEnd"/>
       <w:r>
-        <w:t xml:space="preserve"> </w:t>
-      </w:r>
-      <w:proofErr w:type="spellStart"/>
-      <w:r>
-        <w:t>Svea_Maksuturva</w:t>
-      </w:r>
-      <w:proofErr w:type="spellEnd"/>
-      <w:r>
-        <w:t xml:space="preserve"> </w:t>
-      </w:r>
-      <w:proofErr w:type="spellStart"/>
-      <w:r>
-        <w:t>Svea_MaksuturvaBase</w:t>
-      </w:r>
-      <w:proofErr w:type="spellEnd"/>
-      <w:r>
-        <w:t xml:space="preserve"> </w:t>
-      </w:r>
-      <w:proofErr w:type="spellStart"/>
-      <w:r>
-        <w:t>Svea_MaksuturvaCard</w:t>
-      </w:r>
-      <w:proofErr w:type="spellEnd"/>
-      <w:r>
-        <w:t xml:space="preserve"> </w:t>
-      </w:r>
-      <w:proofErr w:type="spellStart"/>
-      <w:r>
-        <w:t>Svea_MaksuturvaCollated</w:t>
-      </w:r>
-      <w:proofErr w:type="spellEnd"/>
-      <w:r>
-        <w:t xml:space="preserve"> </w:t>
-      </w:r>
-      <w:proofErr w:type="spellStart"/>
-      <w:r>
-        <w:t>Svea_MaksuturvaGeneric</w:t>
-      </w:r>
-      <w:proofErr w:type="spellEnd"/>
-      <w:r>
-        <w:t xml:space="preserve"> </w:t>
-      </w:r>
-      <w:proofErr w:type="spellStart"/>
-      <w:r>
-        <w:t>Svea_MaksuturvaInvoice</w:t>
-      </w:r>
-      <w:proofErr w:type="spellEnd"/>
-      <w:r>
-        <w:t xml:space="preserve"> </w:t>
-      </w:r>
-      <w:proofErr w:type="spellStart"/>
-      <w:r>
-        <w:t>Svea_MaksuturvaPartPayment</w:t>
-      </w:r>
-      <w:proofErr w:type="spellEnd"/>
-      <w:r>
-        <w:t xml:space="preserve"> </w:t>
-      </w:r>
-      <w:proofErr w:type="spellStart"/>
-      <w:r>
-        <w:t>Svea_OrderComment</w:t>
-      </w:r>
-      <w:proofErr w:type="spellEnd"/>
+        <w:t xml:space="preserve"> Svea_Maksuturva Svea_MaksuturvaBase Svea_MaksuturvaCard Svea_MaksuturvaCollated Svea_MaksuturvaGeneric Svea_MaksuturvaInvoice Svea_MaksuturvaPartPayment Svea_OrderComment</w:t>
+      </w:r>
     </w:p>
     <w:p>
       <w:pPr>
@@ -4181,23 +3958,9 @@
       <w:pPr>
         <w:pStyle w:val="Codeblock"/>
       </w:pPr>
-      <w:proofErr w:type="spellStart"/>
-      <w:r>
-        <w:t>php</w:t>
-      </w:r>
-      <w:proofErr w:type="spellEnd"/>
-      <w:r>
-        <w:t xml:space="preserve"> bin/</w:t>
-      </w:r>
-      <w:proofErr w:type="spellStart"/>
-      <w:r>
-        <w:t>magento</w:t>
-      </w:r>
-      <w:proofErr w:type="spellEnd"/>
-      <w:r>
-        <w:t xml:space="preserve"> </w:t>
-      </w:r>
-      <w:proofErr w:type="spellStart"/>
+      <w:r>
+        <w:t xml:space="preserve">php bin/magento </w:t>
+      </w:r>
       <w:proofErr w:type="gramStart"/>
       <w:r>
         <w:t>svea:migrate</w:t>
@@ -4206,7 +3969,6 @@
       <w:r>
         <w:t>:config</w:t>
       </w:r>
-      <w:proofErr w:type="spellEnd"/>
     </w:p>
     <w:p>
       <w:pPr>
@@ -4270,14 +4032,12 @@
       <w:r>
         <w:t xml:space="preserve">Optional but recommended: migrate old orders to new module format. Orders placed with previous </w:t>
       </w:r>
-      <w:proofErr w:type="spellStart"/>
       <w:r>
         <w:rPr>
           <w:rStyle w:val="CodeblockChar"/>
         </w:rPr>
         <w:t>Svea_Maksuturva</w:t>
       </w:r>
-      <w:proofErr w:type="spellEnd"/>
       <w:r>
         <w:t xml:space="preserve"> payment methods can be migrated via Command Line Interface (CLI). </w:t>
       </w:r>
@@ -4289,14 +4049,12 @@
       <w:r>
         <w:t xml:space="preserve">Without migration, you cannot refund or make status queries for orders created with </w:t>
       </w:r>
-      <w:proofErr w:type="spellStart"/>
       <w:r>
         <w:rPr>
           <w:rStyle w:val="CodeblockChar"/>
         </w:rPr>
         <w:t>Svea_Maksuturva</w:t>
       </w:r>
-      <w:proofErr w:type="spellEnd"/>
       <w:r>
         <w:t xml:space="preserve"> payment methods.</w:t>
       </w:r>
@@ -4305,34 +4063,16 @@
       <w:pPr>
         <w:pStyle w:val="Codeblock"/>
       </w:pPr>
-      <w:proofErr w:type="spellStart"/>
-      <w:r>
-        <w:t>php</w:t>
-      </w:r>
-      <w:proofErr w:type="spellEnd"/>
-      <w:r>
-        <w:t xml:space="preserve"> bin/</w:t>
-      </w:r>
-      <w:proofErr w:type="spellStart"/>
-      <w:r>
-        <w:t>magento</w:t>
-      </w:r>
-      <w:proofErr w:type="spellEnd"/>
-      <w:r>
-        <w:t xml:space="preserve"> </w:t>
-      </w:r>
-      <w:proofErr w:type="spellStart"/>
+      <w:r>
+        <w:t xml:space="preserve">php bin/magento </w:t>
+      </w:r>
       <w:proofErr w:type="gramStart"/>
       <w:r>
         <w:t>svea:migrate</w:t>
       </w:r>
       <w:proofErr w:type="gramEnd"/>
       <w:r>
-        <w:t>:sales</w:t>
-      </w:r>
-      <w:proofErr w:type="spellEnd"/>
-      <w:r>
-        <w:t xml:space="preserve"> --date </w:t>
+        <w:t xml:space="preserve">:sales --date </w:t>
       </w:r>
       <w:r>
         <w:rPr>
@@ -4422,17 +4162,9 @@
       <w:pPr>
         <w:pStyle w:val="Heading2"/>
       </w:pPr>
-      <w:bookmarkStart w:id="67" w:name="_Toc216856844"/>
-      <w:r>
-        <w:t xml:space="preserve">Possible conflicts with </w:t>
-      </w:r>
-      <w:proofErr w:type="spellStart"/>
-      <w:r>
-        <w:t>Svea_Maksuturva</w:t>
-      </w:r>
-      <w:proofErr w:type="spellEnd"/>
-      <w:r>
-        <w:t xml:space="preserve"> module</w:t>
+      <w:bookmarkStart w:id="67" w:name="_Toc227579912"/>
+      <w:r>
+        <w:t>Possible conflicts with Svea_Maksuturva module</w:t>
       </w:r>
       <w:bookmarkEnd w:id="67"/>
     </w:p>
@@ -4443,46 +4175,21 @@
       <w:r>
         <w:t xml:space="preserve">If you have enabled </w:t>
       </w:r>
-      <w:proofErr w:type="spellStart"/>
       <w:r>
         <w:rPr>
           <w:rStyle w:val="CodeblockChar"/>
         </w:rPr>
         <w:t>Svea_Maksuturva</w:t>
       </w:r>
-      <w:proofErr w:type="spellEnd"/>
       <w:r>
         <w:t xml:space="preserve"> module, the </w:t>
       </w:r>
-      <w:proofErr w:type="spellStart"/>
       <w:r>
         <w:rPr>
           <w:rStyle w:val="CodeblockChar"/>
         </w:rPr>
-        <w:t>php</w:t>
-      </w:r>
-      <w:proofErr w:type="spellEnd"/>
-      <w:r>
-        <w:rPr>
-          <w:rStyle w:val="CodeblockChar"/>
-        </w:rPr>
-        <w:t xml:space="preserve"> bin/</w:t>
-      </w:r>
-      <w:proofErr w:type="spellStart"/>
-      <w:r>
-        <w:rPr>
-          <w:rStyle w:val="CodeblockChar"/>
-        </w:rPr>
-        <w:t>magento</w:t>
-      </w:r>
-      <w:proofErr w:type="spellEnd"/>
-      <w:r>
-        <w:rPr>
-          <w:rStyle w:val="CodeblockChar"/>
-        </w:rPr>
-        <w:t xml:space="preserve"> </w:t>
-      </w:r>
-      <w:proofErr w:type="spellStart"/>
+        <w:t xml:space="preserve">php bin/magento </w:t>
+      </w:r>
       <w:proofErr w:type="gramStart"/>
       <w:r>
         <w:rPr>
@@ -4490,19 +4197,16 @@
         </w:rPr>
         <w:t>setup:upgrade</w:t>
       </w:r>
-      <w:proofErr w:type="spellEnd"/>
       <w:proofErr w:type="gramEnd"/>
       <w:r>
         <w:t xml:space="preserve"> step of installation will inform you if you need to disable </w:t>
       </w:r>
-      <w:proofErr w:type="spellStart"/>
       <w:r>
         <w:rPr>
           <w:rStyle w:val="CodeblockChar"/>
         </w:rPr>
         <w:t>Svea_Maksuturva</w:t>
       </w:r>
-      <w:proofErr w:type="spellEnd"/>
       <w:r>
         <w:t xml:space="preserve"> module.</w:t>
       </w:r>
@@ -4514,35 +4218,12 @@
       <w:r>
         <w:t xml:space="preserve">After that you need to repeat the </w:t>
       </w:r>
-      <w:proofErr w:type="spellStart"/>
       <w:r>
         <w:rPr>
           <w:rStyle w:val="CodeblockChar"/>
         </w:rPr>
-        <w:t>php</w:t>
-      </w:r>
-      <w:proofErr w:type="spellEnd"/>
-      <w:r>
-        <w:rPr>
-          <w:rStyle w:val="CodeblockChar"/>
-        </w:rPr>
-        <w:t xml:space="preserve"> bin/</w:t>
-      </w:r>
-      <w:proofErr w:type="spellStart"/>
-      <w:r>
-        <w:rPr>
-          <w:rStyle w:val="CodeblockChar"/>
-        </w:rPr>
-        <w:t>magento</w:t>
-      </w:r>
-      <w:proofErr w:type="spellEnd"/>
-      <w:r>
-        <w:rPr>
-          <w:rStyle w:val="CodeblockChar"/>
-        </w:rPr>
-        <w:t xml:space="preserve"> </w:t>
-      </w:r>
-      <w:proofErr w:type="spellStart"/>
+        <w:t xml:space="preserve">php bin/magento </w:t>
+      </w:r>
       <w:proofErr w:type="gramStart"/>
       <w:r>
         <w:rPr>
@@ -4550,7 +4231,6 @@
         </w:rPr>
         <w:t>setup:upgrade</w:t>
       </w:r>
-      <w:proofErr w:type="spellEnd"/>
       <w:proofErr w:type="gramEnd"/>
       <w:r>
         <w:t xml:space="preserve"> step to continue with the installation process.</w:t>
@@ -4563,26 +4243,18 @@
           <w:rFonts w:eastAsia="Arial Unicode MS" w:cs="Arial"/>
         </w:rPr>
       </w:pPr>
-      <w:bookmarkStart w:id="68" w:name="_Toc216856845"/>
+      <w:bookmarkStart w:id="68" w:name="_Toc227579913"/>
       <w:r>
         <w:rPr>
           <w:rFonts w:eastAsia="Arial Unicode MS" w:cs="Arial"/>
         </w:rPr>
         <w:t xml:space="preserve">Compatibility with </w:t>
       </w:r>
-      <w:proofErr w:type="spellStart"/>
       <w:r>
         <w:rPr>
           <w:rFonts w:eastAsia="Arial Unicode MS" w:cs="Arial"/>
         </w:rPr>
-        <w:t>Hyvä</w:t>
-      </w:r>
-      <w:proofErr w:type="spellEnd"/>
-      <w:r>
-        <w:rPr>
-          <w:rFonts w:eastAsia="Arial Unicode MS" w:cs="Arial"/>
-        </w:rPr>
-        <w:t xml:space="preserve"> Theme</w:t>
+        <w:t>Hyvä Theme</w:t>
       </w:r>
       <w:bookmarkEnd w:id="68"/>
     </w:p>
@@ -4607,23 +4279,7 @@
         <w:pStyle w:val="Textbody"/>
       </w:pPr>
       <w:r>
-        <w:t xml:space="preserve">If you intend to use Svea Payments module with </w:t>
-      </w:r>
-      <w:proofErr w:type="spellStart"/>
-      <w:r>
-        <w:t>Hyvä</w:t>
-      </w:r>
-      <w:proofErr w:type="spellEnd"/>
-      <w:r>
-        <w:t xml:space="preserve"> Theme you need to also install the Compatibility module we provide via </w:t>
-      </w:r>
-      <w:proofErr w:type="spellStart"/>
-      <w:r>
-        <w:t>Hyvä</w:t>
-      </w:r>
-      <w:proofErr w:type="spellEnd"/>
-      <w:r>
-        <w:t xml:space="preserve"> Theme repository.</w:t>
+        <w:t>If you intend to use Svea Payments module with Hyvä Theme you need to also install the Compatibility module we provide via Hyvä Theme repository.</w:t>
       </w:r>
       <w:r>
         <w:t xml:space="preserve"> </w:t>
@@ -4648,21 +4304,7 @@
         <w:rPr>
           <w:rFonts w:ascii="Courier New" w:hAnsi="Courier New" w:cs="Courier New"/>
         </w:rPr>
-        <w:t xml:space="preserve"> require </w:t>
-      </w:r>
-      <w:proofErr w:type="spellStart"/>
-      <w:r>
-        <w:rPr>
-          <w:rFonts w:ascii="Courier New" w:hAnsi="Courier New" w:cs="Courier New"/>
-        </w:rPr>
-        <w:t>hyva</w:t>
-      </w:r>
-      <w:proofErr w:type="spellEnd"/>
-      <w:r>
-        <w:rPr>
-          <w:rFonts w:ascii="Courier New" w:hAnsi="Courier New" w:cs="Courier New"/>
-        </w:rPr>
-        <w:t>-themes/magento2-hyva-checkout-svea-payment</w:t>
+        <w:t xml:space="preserve"> require hyva-themes/magento2-hyva-checkout-svea-payment</w:t>
       </w:r>
     </w:p>
     <w:p>
@@ -4699,7 +4341,7 @@
       <w:bookmarkStart w:id="74" w:name="_Toc10743692"/>
       <w:bookmarkStart w:id="75" w:name="_Toc10741272"/>
       <w:bookmarkStart w:id="76" w:name="_Toc10646646"/>
-      <w:bookmarkStart w:id="77" w:name="_Toc216856846"/>
+      <w:bookmarkStart w:id="77" w:name="_Toc227579914"/>
       <w:bookmarkEnd w:id="69"/>
       <w:r>
         <w:lastRenderedPageBreak/>
@@ -4800,7 +4442,7 @@
       <w:pPr>
         <w:pStyle w:val="Heading2"/>
       </w:pPr>
-      <w:bookmarkStart w:id="78" w:name="_Toc216856847"/>
+      <w:bookmarkStart w:id="78" w:name="_Toc227579915"/>
       <w:r>
         <w:t>Preferred Magento settings</w:t>
       </w:r>
@@ -4966,7 +4608,7 @@
         <w:pStyle w:val="Heading2"/>
       </w:pPr>
       <w:bookmarkStart w:id="80" w:name="_Payment_methods_page"/>
-      <w:bookmarkStart w:id="81" w:name="_Toc216856848"/>
+      <w:bookmarkStart w:id="81" w:name="_Toc227579916"/>
       <w:bookmarkEnd w:id="80"/>
       <w:r>
         <w:t>Payment methods page</w:t>
@@ -5066,7 +4708,22 @@
         </w:numPr>
       </w:pPr>
       <w:r>
-        <w:t>Collated Payment Methods - This option groups Svea payment methods together, and you can customize various settings. This is the recommended option.</w:t>
+        <w:t xml:space="preserve">Pay Now / Pay Later Split Payment Methods – This option groups Svea payment methods into 4 subgroups = Pay </w:t>
+      </w:r>
+      <w:proofErr w:type="gramStart"/>
+      <w:r>
+        <w:t>With</w:t>
+      </w:r>
+      <w:proofErr w:type="gramEnd"/>
+      <w:r>
+        <w:t xml:space="preserve"> Online Banking, Pay With Mobile Payment, Pay With Card, Pay Later. You can configure various settings, like which payment methods to show in each </w:t>
+      </w:r>
+      <w:r>
+        <w:lastRenderedPageBreak/>
+        <w:t xml:space="preserve">subgroup. </w:t>
+      </w:r>
+      <w:r>
+        <w:t>This is the recommended option.</w:t>
       </w:r>
     </w:p>
     <w:p>
@@ -5078,7 +4735,7 @@
         </w:numPr>
       </w:pPr>
       <w:r>
-        <w:t>Separate Payment Methods - This option activates individual Svea payment methods.</w:t>
+        <w:t>Collated Payment Methods - This option groups Svea payment methods together, and you can customize various settings.</w:t>
       </w:r>
     </w:p>
     <w:p>
@@ -5090,19 +4747,228 @@
         </w:numPr>
       </w:pPr>
       <w:r>
+        <w:t>Separate Payment Methods - This option activates individual Svea payment methods.</w:t>
+      </w:r>
+    </w:p>
+    <w:p>
+      <w:pPr>
+        <w:pStyle w:val="Textbody"/>
+        <w:numPr>
+          <w:ilvl w:val="0"/>
+          <w:numId w:val="2"/>
+        </w:numPr>
+      </w:pPr>
+      <w:r>
+        <w:t>Redirect to the Svea Selection Page - With this option, the payment method redirects to the Svea website for the final payment method selection.</w:t>
+      </w:r>
+    </w:p>
+    <w:p>
+      <w:pPr>
+        <w:pStyle w:val="Heading3"/>
+      </w:pPr>
+      <w:bookmarkStart w:id="82" w:name="_Toc227579917"/>
+      <w:r>
+        <w:t>Pay Now / Pay Later Split Payment Methods</w:t>
+      </w:r>
+      <w:bookmarkEnd w:id="82"/>
+    </w:p>
+    <w:p>
+      <w:pPr>
+        <w:pStyle w:val="Textbody"/>
+      </w:pPr>
+      <w:r>
+        <w:t>Ensure that the Enabled option is set to Yes in the Common section. This section contains the main title that appears on the checkout page for payment options in Magento.</w:t>
+      </w:r>
+    </w:p>
+    <w:p>
+      <w:pPr>
+        <w:pStyle w:val="Textbody"/>
+      </w:pPr>
+      <w:r>
+        <w:drawing>
+          <wp:inline distT="0" distB="0" distL="0" distR="0" wp14:anchorId="12AE919B" wp14:editId="061B92DC">
+            <wp:extent cx="5353797" cy="3829584"/>
+            <wp:effectExtent l="0" t="0" r="0" b="0"/>
+            <wp:docPr id="1977114394" name="Picture 1" descr="A screenshot of a computer screen&#10;&#10;AI-generated content may be incorrect."/>
+            <wp:cNvGraphicFramePr>
+              <a:graphicFrameLocks xmlns:a="http://schemas.openxmlformats.org/drawingml/2006/main" noChangeAspect="1"/>
+            </wp:cNvGraphicFramePr>
+            <a:graphic xmlns:a="http://schemas.openxmlformats.org/drawingml/2006/main">
+              <a:graphicData uri="http://schemas.openxmlformats.org/drawingml/2006/picture">
+                <pic:pic xmlns:pic="http://schemas.openxmlformats.org/drawingml/2006/picture">
+                  <pic:nvPicPr>
+                    <pic:cNvPr id="1977114394" name="Picture 1" descr="A screenshot of a computer screen&#10;&#10;AI-generated content may be incorrect."/>
+                    <pic:cNvPicPr/>
+                  </pic:nvPicPr>
+                  <pic:blipFill>
+                    <a:blip r:embed="rId17"/>
+                    <a:stretch>
+                      <a:fillRect/>
+                    </a:stretch>
+                  </pic:blipFill>
+                  <pic:spPr>
+                    <a:xfrm>
+                      <a:off x="0" y="0"/>
+                      <a:ext cx="5353797" cy="3829584"/>
+                    </a:xfrm>
+                    <a:prstGeom prst="rect">
+                      <a:avLst/>
+                    </a:prstGeom>
+                  </pic:spPr>
+                </pic:pic>
+              </a:graphicData>
+            </a:graphic>
+          </wp:inline>
+        </w:drawing>
+      </w:r>
+    </w:p>
+    <w:p>
+      <w:pPr>
+        <w:pStyle w:val="Textbody"/>
+      </w:pPr>
+      <w:r>
+        <w:t xml:space="preserve">Under the Common section, there are </w:t>
+      </w:r>
+      <w:r>
+        <w:t xml:space="preserve">four </w:t>
+      </w:r>
+      <w:r>
+        <w:t xml:space="preserve">subgroups of Payment methods that come with default titles. These subgroups </w:t>
+      </w:r>
+      <w:r>
+        <w:t xml:space="preserve">are divided by payment type and </w:t>
+      </w:r>
+      <w:r>
+        <w:t xml:space="preserve">offer various payment methods that sellers can choose from. You are free to customize the title of each subgroup and select the payment methods that you want to make </w:t>
+      </w:r>
+      <w:proofErr w:type="gramStart"/>
+      <w:r>
+        <w:t>available</w:t>
+      </w:r>
+      <w:r>
+        <w:t xml:space="preserve">  for</w:t>
+      </w:r>
+      <w:proofErr w:type="gramEnd"/>
+      <w:r>
+        <w:t xml:space="preserve"> each subgroup</w:t>
+      </w:r>
+      <w:r>
+        <w:t>.</w:t>
+      </w:r>
+    </w:p>
+    <w:p>
+      <w:pPr>
+        <w:pStyle w:val="Textbody"/>
+      </w:pPr>
+      <w:r>
+        <w:t xml:space="preserve">If you wish, you can also set a default </w:t>
+      </w:r>
+      <w:proofErr w:type="gramStart"/>
+      <w:r>
+        <w:t>invoicing</w:t>
+      </w:r>
+      <w:proofErr w:type="gramEnd"/>
+      <w:r>
+        <w:t xml:space="preserve"> fee for all payment methods. Alternatively, you can set the fee individually for each payment method by adding the details in the table view provided. The </w:t>
+      </w:r>
+      <w:proofErr w:type="gramStart"/>
+      <w:r>
+        <w:t>invoicing</w:t>
+      </w:r>
+      <w:proofErr w:type="gramEnd"/>
+      <w:r>
+        <w:t xml:space="preserve"> fee will be added to the payment amount.</w:t>
+      </w:r>
+    </w:p>
+    <w:p>
+      <w:pPr>
+        <w:pStyle w:val="Textbody"/>
+      </w:pPr>
+      <w:r>
+        <w:t>Remember to click Save Config after configuration changes and flush Magento cache.</w:t>
+      </w:r>
+    </w:p>
+    <w:p>
+      <w:pPr>
+        <w:pStyle w:val="Textbody"/>
+      </w:pPr>
+      <w:r>
+        <w:t xml:space="preserve">Example of </w:t>
+      </w:r>
+      <w:r>
+        <w:t>Pay Now / Pay Later Split</w:t>
+      </w:r>
+      <w:r>
+        <w:t xml:space="preserve"> payment methods on Checkout page</w:t>
+      </w:r>
+      <w:r>
+        <w:t>:</w:t>
+      </w:r>
+    </w:p>
+    <w:p>
+      <w:pPr>
+        <w:pStyle w:val="Textbody"/>
+      </w:pPr>
+      <w:r>
         <w:lastRenderedPageBreak/>
-        <w:t>Redirect to the Svea Selection Page - With this option, the payment method redirects to the Svea website for the final payment method selection.</w:t>
+        <w:drawing>
+          <wp:inline distT="0" distB="0" distL="0" distR="0" wp14:anchorId="28B12F5B" wp14:editId="3291E40F">
+            <wp:extent cx="5572903" cy="6592220"/>
+            <wp:effectExtent l="0" t="0" r="8890" b="0"/>
+            <wp:docPr id="1105269053" name="Picture 1" descr="A screenshot of a phone&#10;&#10;AI-generated content may be incorrect."/>
+            <wp:cNvGraphicFramePr>
+              <a:graphicFrameLocks xmlns:a="http://schemas.openxmlformats.org/drawingml/2006/main" noChangeAspect="1"/>
+            </wp:cNvGraphicFramePr>
+            <a:graphic xmlns:a="http://schemas.openxmlformats.org/drawingml/2006/main">
+              <a:graphicData uri="http://schemas.openxmlformats.org/drawingml/2006/picture">
+                <pic:pic xmlns:pic="http://schemas.openxmlformats.org/drawingml/2006/picture">
+                  <pic:nvPicPr>
+                    <pic:cNvPr id="1105269053" name="Picture 1" descr="A screenshot of a phone&#10;&#10;AI-generated content may be incorrect."/>
+                    <pic:cNvPicPr/>
+                  </pic:nvPicPr>
+                  <pic:blipFill>
+                    <a:blip r:embed="rId18"/>
+                    <a:stretch>
+                      <a:fillRect/>
+                    </a:stretch>
+                  </pic:blipFill>
+                  <pic:spPr>
+                    <a:xfrm>
+                      <a:off x="0" y="0"/>
+                      <a:ext cx="5572903" cy="6592220"/>
+                    </a:xfrm>
+                    <a:prstGeom prst="rect">
+                      <a:avLst/>
+                    </a:prstGeom>
+                  </pic:spPr>
+                </pic:pic>
+              </a:graphicData>
+            </a:graphic>
+          </wp:inline>
+        </w:drawing>
       </w:r>
     </w:p>
     <w:p>
       <w:pPr>
         <w:pStyle w:val="Heading3"/>
       </w:pPr>
-      <w:bookmarkStart w:id="82" w:name="_Toc216856849"/>
-      <w:r>
-        <w:t>Collated payment methods</w:t>
-      </w:r>
-      <w:bookmarkEnd w:id="82"/>
+      <w:bookmarkStart w:id="83" w:name="_Toc227579918"/>
+      <w:r>
+        <w:t xml:space="preserve">Collated </w:t>
+      </w:r>
+      <w:r>
+        <w:t>P</w:t>
+      </w:r>
+      <w:r>
+        <w:t xml:space="preserve">ayment </w:t>
+      </w:r>
+      <w:r>
+        <w:t>M</w:t>
+      </w:r>
+      <w:r>
+        <w:t>ethods</w:t>
+      </w:r>
+      <w:bookmarkEnd w:id="83"/>
     </w:p>
     <w:p>
       <w:pPr>
@@ -5120,6 +4986,7 @@
         <w:rPr>
           <w:noProof/>
         </w:rPr>
+        <w:lastRenderedPageBreak/>
         <w:drawing>
           <wp:inline distT="0" distB="0" distL="0" distR="0" wp14:anchorId="4CFA95C4" wp14:editId="44504D61">
             <wp:extent cx="6188710" cy="2326640"/>
@@ -5138,7 +5005,7 @@
                     </pic:cNvPicPr>
                   </pic:nvPicPr>
                   <pic:blipFill>
-                    <a:blip r:embed="rId17"/>
+                    <a:blip r:embed="rId19"/>
                     <a:stretch>
                       <a:fillRect/>
                     </a:stretch>
@@ -5190,6 +5057,9 @@
       </w:pPr>
       <w:r>
         <w:t>Example of collated payment methods on Checkout page</w:t>
+      </w:r>
+      <w:r>
+        <w:t>:</w:t>
       </w:r>
       <w:r>
         <w:br/>
@@ -5216,7 +5086,7 @@
                     </pic:cNvPicPr>
                   </pic:nvPicPr>
                   <pic:blipFill>
-                    <a:blip r:embed="rId18"/>
+                    <a:blip r:embed="rId20"/>
                     <a:stretch>
                       <a:fillRect/>
                     </a:stretch>
@@ -5242,11 +5112,11 @@
       <w:pPr>
         <w:pStyle w:val="Heading3"/>
       </w:pPr>
-      <w:bookmarkStart w:id="83" w:name="_Toc216856850"/>
+      <w:bookmarkStart w:id="84" w:name="_Toc227579919"/>
       <w:r>
         <w:t>Separate payment methods</w:t>
       </w:r>
-      <w:bookmarkEnd w:id="83"/>
+      <w:bookmarkEnd w:id="84"/>
     </w:p>
     <w:p>
       <w:pPr>
@@ -5261,11 +5131,7 @@
         <w:pStyle w:val="Textbody"/>
       </w:pPr>
       <w:r>
-        <w:t xml:space="preserve">Enable the selected payment method groups and add payment methods under each group or use the default system setting. You can change the header of the payment method group and select the </w:t>
-      </w:r>
-      <w:r>
-        <w:lastRenderedPageBreak/>
-        <w:t>order of the payment method groups to be shown at the checkout.</w:t>
+        <w:t>Enable the selected payment method groups and add payment methods under each group or use the default system setting. You can change the header of the payment method group and select the order of the payment method groups to be shown at the checkout.</w:t>
       </w:r>
     </w:p>
     <w:p>
@@ -5284,6 +5150,7 @@
         <w:rPr>
           <w:noProof/>
         </w:rPr>
+        <w:lastRenderedPageBreak/>
         <w:drawing>
           <wp:inline distT="0" distB="0" distL="0" distR="0" wp14:anchorId="7FC7A38B" wp14:editId="28DA1152">
             <wp:extent cx="6188710" cy="2190750"/>
@@ -5302,7 +5169,7 @@
                     </pic:cNvPicPr>
                   </pic:nvPicPr>
                   <pic:blipFill>
-                    <a:blip r:embed="rId19"/>
+                    <a:blip r:embed="rId21"/>
                     <a:stretch>
                       <a:fillRect/>
                     </a:stretch>
@@ -5328,11 +5195,11 @@
       <w:pPr>
         <w:pStyle w:val="Heading3"/>
       </w:pPr>
-      <w:bookmarkStart w:id="84" w:name="_Toc216856851"/>
+      <w:bookmarkStart w:id="85" w:name="_Toc227579920"/>
       <w:r>
         <w:t>Redirect to Svea’s Payment Method Selection Page</w:t>
       </w:r>
-      <w:bookmarkEnd w:id="84"/>
+      <w:bookmarkEnd w:id="85"/>
     </w:p>
     <w:p>
       <w:pPr>
@@ -5368,7 +5235,7 @@
                     </pic:cNvPicPr>
                   </pic:nvPicPr>
                   <pic:blipFill>
-                    <a:blip r:embed="rId20"/>
+                    <a:blip r:embed="rId22"/>
                     <a:stretch>
                       <a:fillRect/>
                     </a:stretch>
@@ -5433,7 +5300,7 @@
                     </pic:cNvPicPr>
                   </pic:nvPicPr>
                   <pic:blipFill>
-                    <a:blip r:embed="rId21"/>
+                    <a:blip r:embed="rId23"/>
                     <a:stretch>
                       <a:fillRect/>
                     </a:stretch>
@@ -5464,11 +5331,11 @@
       <w:pPr>
         <w:pStyle w:val="Heading2"/>
       </w:pPr>
-      <w:bookmarkStart w:id="85" w:name="_Toc216856852"/>
+      <w:bookmarkStart w:id="86" w:name="_Toc227579921"/>
       <w:r>
         <w:t>Svea Payments Configuration</w:t>
       </w:r>
-      <w:bookmarkEnd w:id="85"/>
+      <w:bookmarkEnd w:id="86"/>
     </w:p>
     <w:p>
       <w:pPr>
@@ -5515,7 +5382,7 @@
                     </pic:cNvPicPr>
                   </pic:nvPicPr>
                   <pic:blipFill>
-                    <a:blip r:embed="rId22"/>
+                    <a:blip r:embed="rId24"/>
                     <a:stretch>
                       <a:fillRect/>
                     </a:stretch>
@@ -5619,7 +5486,7 @@
             <w:r>
               <w:t xml:space="preserve">You get your production credentials by contacting Svea sales or for testing environment, see </w:t>
             </w:r>
-            <w:hyperlink r:id="rId23">
+            <w:hyperlink r:id="rId25">
               <w:r>
                 <w:rPr>
                   <w:rStyle w:val="Hyperlink"/>
@@ -6188,7 +6055,6 @@
               <w:pStyle w:val="Textbody"/>
             </w:pPr>
             <w:r>
-              <w:lastRenderedPageBreak/>
               <w:t>Enable refunds after settlement</w:t>
             </w:r>
           </w:p>
@@ -6252,11 +6118,11 @@
       <w:pPr>
         <w:pStyle w:val="Heading2"/>
       </w:pPr>
-      <w:bookmarkStart w:id="86" w:name="_Toc216856853"/>
+      <w:bookmarkStart w:id="87" w:name="_Toc227579922"/>
       <w:r>
         <w:t>Svea Part Payment Calculator</w:t>
       </w:r>
-      <w:bookmarkEnd w:id="86"/>
+      <w:bookmarkEnd w:id="87"/>
     </w:p>
     <w:p>
       <w:pPr>
@@ -6319,7 +6185,7 @@
                     </pic:cNvPicPr>
                   </pic:nvPicPr>
                   <pic:blipFill>
-                    <a:blip r:embed="rId24"/>
+                    <a:blip r:embed="rId26"/>
                     <a:stretch>
                       <a:fillRect/>
                     </a:stretch>
@@ -6451,7 +6317,7 @@
                     </pic:cNvPicPr>
                   </pic:nvPicPr>
                   <pic:blipFill>
-                    <a:blip r:embed="rId25"/>
+                    <a:blip r:embed="rId27"/>
                     <a:stretch>
                       <a:fillRect/>
                     </a:stretch>
@@ -6502,7 +6368,7 @@
                     </pic:cNvPicPr>
                   </pic:nvPicPr>
                   <pic:blipFill>
-                    <a:blip r:embed="rId26"/>
+                    <a:blip r:embed="rId28"/>
                     <a:stretch>
                       <a:fillRect/>
                     </a:stretch>
@@ -6536,29 +6402,41 @@
       <w:pPr>
         <w:pStyle w:val="Heading2"/>
       </w:pPr>
-      <w:bookmarkStart w:id="87" w:name="_Toc216856854"/>
+      <w:bookmarkStart w:id="88" w:name="_Toc227579923"/>
       <w:r>
         <w:lastRenderedPageBreak/>
         <w:t>Additional features</w:t>
       </w:r>
-      <w:bookmarkEnd w:id="87"/>
+      <w:bookmarkEnd w:id="88"/>
     </w:p>
     <w:p>
       <w:pPr>
         <w:pStyle w:val="Heading3"/>
       </w:pPr>
-      <w:bookmarkStart w:id="88" w:name="_Toc216856855"/>
+      <w:bookmarkStart w:id="89" w:name="_Toc227579924"/>
       <w:r>
         <w:t>Payment Fees</w:t>
       </w:r>
-      <w:bookmarkEnd w:id="88"/>
-    </w:p>
-    <w:p>
-      <w:pPr>
-        <w:pStyle w:val="Textbody"/>
-      </w:pPr>
-      <w:r>
-        <w:t>The payment module has support for defining invoicing fees for each sub method under each payment method, including Collated payment method. For example, with "</w:t>
+      <w:bookmarkEnd w:id="89"/>
+    </w:p>
+    <w:p>
+      <w:pPr>
+        <w:pStyle w:val="Textbody"/>
+      </w:pPr>
+      <w:r>
+        <w:t xml:space="preserve">The payment module has support for defining invoicing fees for each sub method under each payment method, including </w:t>
+      </w:r>
+      <w:r>
+        <w:t xml:space="preserve">Pay Now / Pay Later Split &amp; </w:t>
+      </w:r>
+      <w:r>
+        <w:t>Collated payment method</w:t>
+      </w:r>
+      <w:r>
+        <w:t>s</w:t>
+      </w:r>
+      <w:r>
+        <w:t>. For example, with "</w:t>
       </w:r>
       <w:proofErr w:type="gramStart"/>
       <w:r>
@@ -6566,15 +6444,7 @@
       </w:r>
       <w:proofErr w:type="gramEnd"/>
       <w:r>
-        <w:t>01=</w:t>
-      </w:r>
-      <w:proofErr w:type="gramStart"/>
-      <w:r>
-        <w:t>5;FI</w:t>
-      </w:r>
-      <w:proofErr w:type="gramEnd"/>
-      <w:r>
-        <w:t>06=7.5" the fee in quote gets resolved based on the selected method in the following way:</w:t>
+        <w:t>01=5;FI06=7.5" the fee in quote gets resolved based on the selected method in the following way:</w:t>
       </w:r>
     </w:p>
     <w:p>
@@ -6605,11 +6475,11 @@
       <w:pPr>
         <w:pStyle w:val="Heading3"/>
       </w:pPr>
-      <w:bookmarkStart w:id="89" w:name="_Toc216856856"/>
+      <w:bookmarkStart w:id="90" w:name="_Toc227579925"/>
       <w:r>
         <w:t>Delayed capture</w:t>
       </w:r>
-      <w:bookmarkEnd w:id="89"/>
+      <w:bookmarkEnd w:id="90"/>
     </w:p>
     <w:p>
       <w:pPr>
@@ -6639,11 +6509,11 @@
       <w:pPr>
         <w:pStyle w:val="Heading3"/>
       </w:pPr>
-      <w:bookmarkStart w:id="90" w:name="_Toc216856857"/>
+      <w:bookmarkStart w:id="91" w:name="_Toc227579926"/>
       <w:r>
         <w:t>Automatic status query</w:t>
       </w:r>
-      <w:bookmarkEnd w:id="90"/>
+      <w:bookmarkEnd w:id="91"/>
     </w:p>
     <w:p>
       <w:pPr>
@@ -6700,12 +6570,12 @@
         <w:pStyle w:val="Heading1"/>
         <w:spacing w:before="0"/>
       </w:pPr>
-      <w:bookmarkStart w:id="91" w:name="_Toc216856858"/>
+      <w:bookmarkStart w:id="92" w:name="_Toc227579927"/>
       <w:r>
         <w:lastRenderedPageBreak/>
         <w:t>Order administration</w:t>
       </w:r>
-      <w:bookmarkEnd w:id="91"/>
+      <w:bookmarkEnd w:id="92"/>
     </w:p>
     <w:p>
       <w:pPr>
@@ -6749,7 +6619,7 @@
                     </pic:cNvPicPr>
                   </pic:nvPicPr>
                   <pic:blipFill>
-                    <a:blip r:embed="rId27"/>
+                    <a:blip r:embed="rId29"/>
                     <a:stretch>
                       <a:fillRect/>
                     </a:stretch>
@@ -6803,7 +6673,7 @@
                     </pic:cNvPicPr>
                   </pic:nvPicPr>
                   <pic:blipFill>
-                    <a:blip r:embed="rId28"/>
+                    <a:blip r:embed="rId30"/>
                     <a:stretch>
                       <a:fillRect/>
                     </a:stretch>
@@ -6850,12 +6720,12 @@
         <w:pStyle w:val="Heading2"/>
         <w:spacing w:before="0"/>
       </w:pPr>
-      <w:bookmarkStart w:id="92" w:name="_Toc216856859"/>
+      <w:bookmarkStart w:id="93" w:name="_Toc227579928"/>
       <w:r>
         <w:lastRenderedPageBreak/>
         <w:t>Refunding order</w:t>
       </w:r>
-      <w:bookmarkEnd w:id="92"/>
+      <w:bookmarkEnd w:id="93"/>
     </w:p>
     <w:p>
       <w:pPr>
@@ -6891,7 +6761,7 @@
                     </pic:cNvPicPr>
                   </pic:nvPicPr>
                   <pic:blipFill>
-                    <a:blip r:embed="rId29"/>
+                    <a:blip r:embed="rId31"/>
                     <a:stretch>
                       <a:fillRect/>
                     </a:stretch>
@@ -6946,7 +6816,7 @@
                     </pic:cNvPicPr>
                   </pic:nvPicPr>
                   <pic:blipFill>
-                    <a:blip r:embed="rId30"/>
+                    <a:blip r:embed="rId32"/>
                     <a:stretch>
                       <a:fillRect/>
                     </a:stretch>
@@ -7050,7 +6920,7 @@
                     </pic:cNvPicPr>
                   </pic:nvPicPr>
                   <pic:blipFill>
-                    <a:blip r:embed="rId31"/>
+                    <a:blip r:embed="rId33"/>
                     <a:stretch>
                       <a:fillRect/>
                     </a:stretch>
@@ -7091,11 +6961,11 @@
       <w:pPr>
         <w:pStyle w:val="Heading1"/>
       </w:pPr>
-      <w:bookmarkStart w:id="93" w:name="_Toc216856860"/>
+      <w:bookmarkStart w:id="94" w:name="_Toc227579929"/>
       <w:r>
         <w:t>Logging</w:t>
       </w:r>
-      <w:bookmarkEnd w:id="93"/>
+      <w:bookmarkEnd w:id="94"/>
     </w:p>
     <w:p>
       <w:pPr>
@@ -7145,11 +7015,11 @@
       <w:pPr>
         <w:pStyle w:val="Heading1"/>
       </w:pPr>
-      <w:bookmarkStart w:id="94" w:name="_Toc216856861"/>
+      <w:bookmarkStart w:id="95" w:name="_Toc227579930"/>
       <w:r>
         <w:t>Resolving issues and support</w:t>
       </w:r>
-      <w:bookmarkEnd w:id="94"/>
+      <w:bookmarkEnd w:id="95"/>
     </w:p>
     <w:p>
       <w:pPr>
@@ -7178,7 +7048,7 @@
       <w:r>
         <w:t xml:space="preserve">For General support, please contact </w:t>
       </w:r>
-      <w:hyperlink r:id="rId32">
+      <w:hyperlink r:id="rId34">
         <w:r>
           <w:rPr>
             <w:rStyle w:val="Hyperlink"/>
@@ -7201,7 +7071,7 @@
       <w:r>
         <w:t xml:space="preserve">For Technical support, please contact </w:t>
       </w:r>
-      <w:hyperlink r:id="rId33">
+      <w:hyperlink r:id="rId35">
         <w:r>
           <w:rPr>
             <w:rStyle w:val="Hyperlink"/>
@@ -7222,11 +7092,11 @@
       <w:pPr>
         <w:pStyle w:val="Heading2"/>
       </w:pPr>
-      <w:bookmarkStart w:id="95" w:name="_Toc216856862"/>
+      <w:bookmarkStart w:id="96" w:name="_Toc227579931"/>
       <w:r>
         <w:t>Common problems and solutions</w:t>
       </w:r>
-      <w:bookmarkEnd w:id="95"/>
+      <w:bookmarkEnd w:id="96"/>
     </w:p>
     <w:p>
       <w:pPr>
@@ -7237,15 +7107,7 @@
         </w:numPr>
       </w:pPr>
       <w:r>
-        <w:t xml:space="preserve">If you get `No payment methods available` on payment page, you might check the </w:t>
-      </w:r>
-      <w:proofErr w:type="spellStart"/>
-      <w:r>
-        <w:t>sellerid</w:t>
-      </w:r>
-      <w:proofErr w:type="spellEnd"/>
-      <w:r>
-        <w:t>, secret key and endpoint once more.</w:t>
+        <w:t>If you get `No payment methods available` on payment page, you might check the sellerid, secret key and endpoint once more.</w:t>
       </w:r>
     </w:p>
     <w:p>
@@ -7259,10 +7121,10 @@
       </w:pPr>
     </w:p>
     <w:sectPr>
-      <w:headerReference w:type="default" r:id="rId34"/>
-      <w:footerReference w:type="default" r:id="rId35"/>
-      <w:headerReference w:type="first" r:id="rId36"/>
-      <w:footerReference w:type="first" r:id="rId37"/>
+      <w:headerReference w:type="default" r:id="rId36"/>
+      <w:footerReference w:type="default" r:id="rId37"/>
+      <w:headerReference w:type="first" r:id="rId38"/>
+      <w:footerReference w:type="first" r:id="rId39"/>
       <w:pgSz w:w="11906" w:h="16838"/>
       <w:pgMar w:top="1440" w:right="1080" w:bottom="1440" w:left="1080" w:header="900" w:footer="125" w:gutter="0"/>
       <w:cols w:space="720"/>
@@ -7417,7 +7279,6 @@
               <w:b/>
               <w:sz w:val="14"/>
               <w:szCs w:val="14"/>
-              <w:lang w:val="fi-FI"/>
             </w:rPr>
           </w:pPr>
           <w:r>
@@ -7426,7 +7287,6 @@
               <w:b/>
               <w:sz w:val="14"/>
               <w:szCs w:val="14"/>
-              <w:lang w:val="fi-FI"/>
             </w:rPr>
             <w:t>Svea Payments Oy</w:t>
           </w:r>
@@ -7439,7 +7299,6 @@
               <w:rFonts w:ascii="Arial" w:hAnsi="Arial" w:cs="Arial"/>
               <w:sz w:val="12"/>
               <w:szCs w:val="12"/>
-              <w:lang w:val="fi-FI"/>
             </w:rPr>
           </w:pPr>
           <w:r>
@@ -7447,7 +7306,6 @@
               <w:rFonts w:ascii="Arial" w:hAnsi="Arial" w:cs="Arial"/>
               <w:sz w:val="12"/>
               <w:szCs w:val="12"/>
-              <w:lang w:val="fi-FI"/>
             </w:rPr>
             <w:t xml:space="preserve">Y-tunnus: </w:t>
           </w:r>
@@ -7457,7 +7315,6 @@
               <w:color w:val="000000"/>
               <w:sz w:val="12"/>
               <w:szCs w:val="12"/>
-              <w:lang w:val="fi-FI"/>
             </w:rPr>
             <w:t>2121703-0</w:t>
           </w:r>
@@ -7737,7 +7594,6 @@
               <w:b/>
               <w:sz w:val="14"/>
               <w:szCs w:val="14"/>
-              <w:lang w:val="fi-FI"/>
             </w:rPr>
           </w:pPr>
           <w:r>
@@ -7746,7 +7602,6 @@
               <w:b/>
               <w:sz w:val="14"/>
               <w:szCs w:val="14"/>
-              <w:lang w:val="fi-FI"/>
             </w:rPr>
             <w:t>Svea Payments Oy</w:t>
           </w:r>
@@ -7759,7 +7614,6 @@
               <w:rFonts w:ascii="Arial" w:hAnsi="Arial" w:cs="Arial"/>
               <w:sz w:val="12"/>
               <w:szCs w:val="12"/>
-              <w:lang w:val="fi-FI"/>
             </w:rPr>
           </w:pPr>
           <w:r>
@@ -7767,7 +7621,6 @@
               <w:rFonts w:ascii="Arial" w:hAnsi="Arial" w:cs="Arial"/>
               <w:sz w:val="12"/>
               <w:szCs w:val="12"/>
-              <w:lang w:val="fi-FI"/>
             </w:rPr>
             <w:t xml:space="preserve">Y-tunnus: </w:t>
           </w:r>
@@ -7777,7 +7630,6 @@
               <w:color w:val="000000"/>
               <w:sz w:val="12"/>
               <w:szCs w:val="12"/>
-              <w:lang w:val="fi-FI"/>
             </w:rPr>
             <w:t>2121703-0</w:t>
           </w:r>
@@ -8047,7 +7899,15 @@
         <w:sz w:val="20"/>
         <w:szCs w:val="20"/>
       </w:rPr>
-      <w:t>28</w:t>
+      <w:t>2</w:t>
+    </w:r>
+    <w:r>
+      <w:rPr>
+        <w:rFonts w:ascii="Arial" w:hAnsi="Arial" w:cs="Arial"/>
+        <w:sz w:val="20"/>
+        <w:szCs w:val="20"/>
+      </w:rPr>
+      <w:t>0</w:t>
     </w:r>
     <w:r>
       <w:rPr>
@@ -8063,7 +7923,7 @@
         <w:sz w:val="20"/>
         <w:szCs w:val="20"/>
       </w:rPr>
-      <w:t>8</w:t>
+      <w:t>4</w:t>
     </w:r>
     <w:r>
       <w:rPr>
@@ -8071,7 +7931,15 @@
         <w:sz w:val="20"/>
         <w:szCs w:val="20"/>
       </w:rPr>
-      <w:t>.2025</w:t>
+      <w:t>.202</w:t>
+    </w:r>
+    <w:r>
+      <w:rPr>
+        <w:rFonts w:ascii="Arial" w:hAnsi="Arial" w:cs="Arial"/>
+        <w:sz w:val="20"/>
+        <w:szCs w:val="20"/>
+      </w:rPr>
+      <w:t>6</w:t>
     </w:r>
   </w:p>
 </w:hdr>

</xml_diff>